<commit_message>
feat(skills): calibracion de skills de ciencias naturales y coherencia curricular con sincronizacion de paquetes 7B
</commit_message>
<xml_diff>
--- a/LECCIONES/110-7/Ciencias_Naturales/OA01/Plan_Maestro_7Básico_110-7-CIE-OA01_6Lecciones.docx
+++ b/LECCIONES/110-7/Ciencias_Naturales/OA01/Plan_Maestro_7Básico_110-7-CIE-OA01_6Lecciones.docx
@@ -106,7 +106,7 @@
         <w:t xml:space="preserve">Texto Escolar Oficial (MINEDUC): </w:t>
       </w:r>
       <w:r>
-        <w:t xml:space="preserve">Ciencias Naturales 7° Básico (Texto del Estudiante MINEDUC) | Unidad 1: "Sexualidad y autocuidado" | Lección 1: "Dimensiones biológicas, afectivas y sociales" (Páginas 6 a 23)</w:t>
+        <w:t xml:space="preserve">Material Oficial MINEDUC 7° Básico (Ciencias Naturales)</w:t>
       </w:r>
     </w:p>
     <w:p>
@@ -667,7 +667,7 @@
         <w:t xml:space="preserve">Objetivo para el Adulto / Mentor: </w:t>
       </w:r>
       <w:r>
-        <w:t xml:space="preserve">Guiar al estudiante a comprender que la sexualidad humana es una vivencia integral que comprende cuatro dimensiones inseparables: biológica, afectiva, social y ética (Texto del Estudiante Ciencias Naturales 7° Básico MINEDUC, Unidad 1, Lección 1, pág. 16), superando la visión reducida a lo estrictamente reproductivo.</w:t>
+        <w:t xml:space="preserve">Guiar al estudiante a comprender que la sexualidad humana es una vivencia integral organizada didácticamente en cuatro dimensiones fundamentales: biológica, afectiva, social y ética, articulando los aspectos curriculares del Texto Escolar Ciencias Naturales 7° Básico MINEDUC (Edición SM, Unidad 1, Lección 1, págs. 16 a 29) con valores de respeto mutuo y responsabilidad personal, superando la visión reducida a lo reproductivo.</w:t>
       </w:r>
     </w:p>
     <w:p>
@@ -3020,7 +3020,7 @@
                 <w:sz w:val="18"/>
                 <w:szCs w:val="18"/>
               </w:rPr>
-              <w:t xml:space="preserve">Explicar las 4 dimensiones de la sexualidad humana</w:t>
+              <w:t xml:space="preserve">Comprender la sexualidad como dimensión integral</w:t>
             </w:r>
           </w:p>
         </w:tc>
@@ -3245,7 +3245,7 @@
                 <w:sz w:val="17"/>
                 <w:szCs w:val="17"/>
               </w:rPr>
-              <w:t xml:space="preserve">Diagrama fisiológico: Glándula hipófisis -&gt; Hormonas gonadales -&gt; Caracteres secundarios</w:t>
+              <w:t xml:space="preserve">Diagrama endocrino: Hipotálamo (GnRH) -&gt; Hipófisis anterior (LH y FSH) -&gt; Gónadas (hormonas sexuales) -&gt; Cambios puberales</w:t>
             </w:r>
           </w:p>
         </w:tc>
@@ -3266,7 +3266,7 @@
                 <w:sz w:val="18"/>
                 <w:szCs w:val="18"/>
               </w:rPr>
-              <w:t xml:space="preserve">En la pubertad, el sistema endocrino libera señales químicas que inician el estirón puberal, el desarrollo reproductivo y cambios visibles corporales.</w:t>
+              <w:t xml:space="preserve">La pubertad inicia cuando el hipotálamo (GnRH) estimula a la hipófisis anterior para secretar LH y FSH, las cuales activan a las gónadas a producir hormonas sexuales que inducen los cambios puberales.</w:t>
             </w:r>
           </w:p>
         </w:tc>
@@ -4070,7 +4070,7 @@
                 <w:sz w:val="18"/>
                 <w:szCs w:val="18"/>
               </w:rPr>
-              <w:t xml:space="preserve">Biológica + Afectiva + Social + Ética = Salud Integral</w:t>
+              <w:t xml:space="preserve">Cuatro dimensiones unidas en salud integral</w:t>
             </w:r>
           </w:p>
         </w:tc>
@@ -4581,7 +4581,7 @@
         <w:t xml:space="preserve">Opciones: </w:t>
       </w:r>
       <w:r>
-        <w:t xml:space="preserve">Es una dimensión integral presente a lo largo de toda la vida que une lo biológico, afectivo, social y ético. | Se reduce exclusivamente a la reproducción biológica y a los órganos del cuerpo humano. | Es un tema que únicamente involucra a los adultos y no tiene relación con las emociones ni los valores.</w:t>
+        <w:t xml:space="preserve">Es una dimensión integral presente a lo largo de toda la vida que une lo biológico, afectivo, social y ético. | Se reduce exclusivamente a la reproducción biológica y a los órganos del cuerpo humano. | Es un tema que únicamente involucra a los adultos sin relación con las emociones. | Es un fenómeno que solo aparece en la vejez y depende del clima ambiental.</w:t>
       </w:r>
     </w:p>
     <w:p>
@@ -4668,7 +4668,7 @@
         <w:t xml:space="preserve">Opciones: </w:t>
       </w:r>
       <w:r>
-        <w:t xml:space="preserve">Biológica | Social | Ética</w:t>
+        <w:t xml:space="preserve">Dimensión Social | Dimensión Biológica | Dimensión Ética | Dimensión Afectiva</w:t>
       </w:r>
     </w:p>
     <w:p>
@@ -4684,7 +4684,7 @@
         <w:t xml:space="preserve">• Respuesta correcta: </w:t>
       </w:r>
       <w:r>
-        <w:t xml:space="preserve">Biológica</w:t>
+        <w:t xml:space="preserve">Dimensión Biológica</w:t>
       </w:r>
     </w:p>
     <w:p>
@@ -4755,7 +4755,7 @@
         <w:t xml:space="preserve">Opciones: </w:t>
       </w:r>
       <w:r>
-        <w:t xml:space="preserve">Ética y moral | Exclusivamente biológica | Únicamente climática</w:t>
+        <w:t xml:space="preserve">Dimensión ética y moral | Exclusivamente biológica | Únicamente climática | Dimensión química y mineral</w:t>
       </w:r>
     </w:p>
     <w:p>
@@ -4771,7 +4771,7 @@
         <w:t xml:space="preserve">• Respuesta correcta: </w:t>
       </w:r>
       <w:r>
-        <w:t xml:space="preserve">Ética y moral</w:t>
+        <w:t xml:space="preserve">Dimensión ética y moral</w:t>
       </w:r>
     </w:p>
     <w:p>
@@ -4862,7 +4862,7 @@
 </w:t>
       </w:r>
       <w:r>
-        <w:t xml:space="preserve">Opciones: Las dimensiones afectiva (cariño) y social (amistades). | Únicamente la dimensión biológica anatómica. | Correcta: Las dimensiones afectiva (cariño) y social (amistades).
+        <w:t xml:space="preserve">Opciones: Las dimensiones afectiva (cariño) y social (amistades). | Únicamente la dimensión biológica anatómica. | Solamente la dimensión climática y meteorológica. | Ninguna dimensión humana reconocible. | Correcta: Las dimensiones afectiva (cariño) y social (amistades).
 </w:t>
       </w:r>
       <w:r>
@@ -4925,545 +4925,6 @@
       </w:r>
       <w:r>
         <w:t xml:space="preserve">¡Felicitaciones! Has completado con éxito la primera clase sobre las 4 dimensiones de la sexualidad humana.</w:t>
-      </w:r>
-    </w:p>
-    <w:p>
-      <w:pPr>
-        <w:pStyle w:val="Heading1"/>
-        <w:pageBreakBefore/>
-        <w:spacing w:after="150" w:before="400"/>
-      </w:pPr>
-      <w:r>
-        <w:t xml:space="preserve">SECCIÓN 2: CUADERNILLO DE TRABAJO DEL ESTUDIANTE</w:t>
-      </w:r>
-    </w:p>
-    <w:p>
-      <w:pPr>
-        <w:spacing w:after="150"/>
-      </w:pPr>
-      <w:r>
-        <w:rPr>
-          <w:b/>
-          <w:bCs/>
-          <w:color w:val="0F766E"/>
-          <w:sz w:val="18"/>
-          <w:szCs w:val="18"/>
-        </w:rPr>
-        <w:t xml:space="preserve">STUDIOSIMPLE · ECOSISTEMA EDUCATIVO HOMESCHOOLING</w:t>
-      </w:r>
-    </w:p>
-    <w:tbl>
-      <w:tblPr>
-        <w:tblW w:type="pct" w:w="100%"/>
-        <w:tblBorders>
-          <w:top w:val="single" w:color="auto" w:sz="4"/>
-          <w:left w:val="single" w:color="auto" w:sz="4"/>
-          <w:bottom w:val="single" w:color="auto" w:sz="4"/>
-          <w:right w:val="single" w:color="auto" w:sz="4"/>
-          <w:insideH w:val="single" w:color="auto" w:sz="4"/>
-          <w:insideV w:val="single" w:color="auto" w:sz="4"/>
-        </w:tblBorders>
-      </w:tblPr>
-      <w:tblGrid>
-        <w:gridCol w:w="100"/>
-        <w:gridCol w:w="100"/>
-      </w:tblGrid>
-      <w:tr>
-        <w:tc>
-          <w:tcPr>
-            <w:tcW w:type="pct" w:w="60%"/>
-            <w:shd w:fill="F8FAFC" w:val="clear"/>
-          </w:tcPr>
-          <w:p>
-            <w:pPr>
-              <w:spacing w:after="80" w:before="80"/>
-            </w:pPr>
-            <w:r>
-              <w:rPr>
-                <w:b/>
-                <w:bCs/>
-                <w:sz w:val="18"/>
-                <w:szCs w:val="18"/>
-              </w:rPr>
-              <w:t xml:space="preserve">Nombre del Estudiante: </w:t>
-            </w:r>
-            <w:r>
-              <w:rPr>
-                <w:sz w:val="18"/>
-                <w:szCs w:val="18"/>
-              </w:rPr>
-              <w:t xml:space="preserve">________________________________________</w:t>
-            </w:r>
-          </w:p>
-        </w:tc>
-        <w:tc>
-          <w:tcPr>
-            <w:tcW w:type="pct" w:w="40%"/>
-            <w:shd w:fill="F8FAFC" w:val="clear"/>
-          </w:tcPr>
-          <w:p>
-            <w:pPr>
-              <w:spacing w:after="80" w:before="80"/>
-            </w:pPr>
-            <w:r>
-              <w:rPr>
-                <w:b/>
-                <w:bCs/>
-                <w:sz w:val="18"/>
-                <w:szCs w:val="18"/>
-              </w:rPr>
-              <w:t xml:space="preserve">Fecha: </w:t>
-            </w:r>
-            <w:r>
-              <w:rPr>
-                <w:sz w:val="18"/>
-                <w:szCs w:val="18"/>
-              </w:rPr>
-              <w:t xml:space="preserve">____ / ____ / ________</w:t>
-            </w:r>
-          </w:p>
-        </w:tc>
-      </w:tr>
-      <w:tr>
-        <w:tc>
-          <w:tcPr>
-            <w:tcW w:type="pct" w:w="60%"/>
-            <w:shd w:fill="FFFFFF" w:val="clear"/>
-          </w:tcPr>
-          <w:p>
-            <w:pPr>
-              <w:spacing w:after="80" w:before="80"/>
-            </w:pPr>
-            <w:r>
-              <w:rPr>
-                <w:b/>
-                <w:bCs/>
-                <w:color w:val="334155"/>
-                <w:sz w:val="18"/>
-                <w:szCs w:val="18"/>
-              </w:rPr>
-              <w:t xml:space="preserve">Curso: 7° Básico  |  Asignatura: Ciencias Naturales</w:t>
-            </w:r>
-          </w:p>
-        </w:tc>
-        <w:tc>
-          <w:tcPr>
-            <w:tcW w:type="pct" w:w="40%"/>
-            <w:shd w:fill="FFFFFF" w:val="clear"/>
-          </w:tcPr>
-          <w:p>
-            <w:pPr>
-              <w:spacing w:after="80" w:before="80"/>
-            </w:pPr>
-            <w:r>
-              <w:rPr>
-                <w:b/>
-                <w:bCs/>
-                <w:color w:val="0F766E"/>
-                <w:sz w:val="18"/>
-                <w:szCs w:val="18"/>
-              </w:rPr>
-              <w:t xml:space="preserve">Clase 1: Las 4 Dimensiones de la Sexualidad Humana</w:t>
-            </w:r>
-          </w:p>
-        </w:tc>
-      </w:tr>
-    </w:tbl>
-    <w:p>
-      <w:pPr>
-        <w:spacing w:after="120" w:before="200"/>
-      </w:pPr>
-      <w:r>
-        <w:rPr>
-          <w:b/>
-          <w:bCs/>
-          <w:color w:val="1E293B"/>
-        </w:rPr>
-        <w:t xml:space="preserve">Meta de Aprendizaje de Hoy: </w:t>
-      </w:r>
-      <w:r>
-        <w:rPr>
-          <w:i/>
-          <w:iCs/>
-        </w:rPr>
-        <w:t xml:space="preserve">Comprender que la sexualidad humana abarca mucho más que la reproducción: integra nuestro cuerpo, nuestros sentimientos, nuestras relaciones con amigos y familia, y nuestros valores.</w:t>
-      </w:r>
-    </w:p>
-    <w:p>
-      <w:pPr>
-        <w:pStyle w:val="Heading2"/>
-        <w:spacing w:after="80" w:before="200"/>
-      </w:pPr>
-      <w:r>
-        <w:t xml:space="preserve">1. Desafío de Exploración Inicial (Situación Detonante)</w:t>
-      </w:r>
-    </w:p>
-    <w:p>
-      <w:pPr>
-        <w:spacing w:after="100"/>
-      </w:pPr>
-      <w:r>
-        <w:t xml:space="preserve">Hoy en Ciencias Naturales investigamos la sexualidad humana como una dimensión integral de la persona. En pantalla puedes ver el modelo de 4 dimensiones. Observa la primera dimensión destacada: la Dimensión Biológica. ¿Qué cambios físicos concretos ocurren en el cuerpo humano durante la pubertad?</w:t>
-      </w:r>
-    </w:p>
-    <w:p>
-      <w:pPr>
-        <w:spacing w:after="60"/>
-      </w:pPr>
-      <w:r>
-        <w:rPr>
-          <w:b/>
-          <w:bCs/>
-          <w:color w:val="64748B"/>
-          <w:sz w:val="18"/>
-          <w:szCs w:val="18"/>
-        </w:rPr>
-        <w:t xml:space="preserve">Registra tu respuesta o deducción inicial en las siguientes líneas:</w:t>
-      </w:r>
-    </w:p>
-    <w:p>
-      <w:pPr>
-        <w:spacing w:after="60"/>
-      </w:pPr>
-      <w:r>
-        <w:t xml:space="preserve">_____________________________________________________________________________________
-_____________________________________________________________________________________
-_____________________________________________________________________________________</w:t>
-      </w:r>
-    </w:p>
-    <w:p>
-      <w:pPr>
-        <w:pStyle w:val="Heading2"/>
-        <w:spacing w:after="80" w:before="200"/>
-      </w:pPr>
-      <w:r>
-        <w:t xml:space="preserve">2. Organizador Gráfico de Aprendizaje</w:t>
-      </w:r>
-    </w:p>
-    <w:p>
-      <w:pPr>
-        <w:spacing w:after="80"/>
-      </w:pPr>
-      <w:r>
-        <w:rPr>
-          <w:i/>
-          <w:iCs/>
-        </w:rPr>
-        <w:t xml:space="preserve">Completa el organizador conceptual con las ideas clave y evidencias analizadas en la clase:</w:t>
-      </w:r>
-    </w:p>
-    <w:p>
-      <w:pPr>
-        <w:spacing w:after="150"/>
-      </w:pPr>
-      <w:r>
-        <w:rPr>
-          <w:i/>
-          <w:iCs/>
-          <w:color w:val="94A3B8"/>
-        </w:rPr>
-        <w:t xml:space="preserve">Espacio para anotaciones o diagrama del estudiante:
-</w:t>
-      </w:r>
-    </w:p>
-    <w:p>
-      <w:pPr>
-        <w:pStyle w:val="Heading2"/>
-        <w:spacing w:after="100" w:before="200"/>
-      </w:pPr>
-      <w:r>
-        <w:t xml:space="preserve">3. Desafíos de Práctica en Cuaderno (Resolución Aplicada)</w:t>
-      </w:r>
-    </w:p>
-    <w:p>
-      <w:pPr>
-        <w:spacing w:after="40" w:before="100"/>
-      </w:pPr>
-      <w:r>
-        <w:rPr>
-          <w:b/>
-          <w:bCs/>
-          <w:color w:val="0F766E"/>
-        </w:rPr>
-        <w:t xml:space="preserve">Ejercicio 1 [Caso 1: Cuidado de la higiene y descanso]: </w:t>
-      </w:r>
-      <w:r>
-        <w:t xml:space="preserve">El hábito de bañarse diariamente, usar ropa limpia y dormir ocho horas para cuidar el cuerpo durante el crecimiento, ¿a qué dimensión corresponde?</w:t>
-      </w:r>
-    </w:p>
-    <w:p>
-      <w:pPr>
-        <w:spacing w:after="120"/>
-      </w:pPr>
-      <w:r>
-        <w:t xml:space="preserve">Desarrollo y respuesta:
-_____________________________________________________________________________________
-_____________________________________________________________________________________</w:t>
-      </w:r>
-    </w:p>
-    <w:p>
-      <w:pPr>
-        <w:spacing w:after="40" w:before="100"/>
-      </w:pPr>
-      <w:r>
-        <w:rPr>
-          <w:b/>
-          <w:bCs/>
-          <w:color w:val="0F766E"/>
-        </w:rPr>
-        <w:t xml:space="preserve">Ejercicio 2 [Caso 2: Expresión de afecto en la familia]: </w:t>
-      </w:r>
-      <w:r>
-        <w:t xml:space="preserve">Conversar con honestidad con los padres sobre los temores o dudas que surgen en la adolescencia, ¿qué dimensiones involucra?</w:t>
-      </w:r>
-    </w:p>
-    <w:p>
-      <w:pPr>
-        <w:spacing w:after="120"/>
-      </w:pPr>
-      <w:r>
-        <w:t xml:space="preserve">Desarrollo y respuesta:
-_____________________________________________________________________________________
-_____________________________________________________________________________________</w:t>
-      </w:r>
-    </w:p>
-    <w:p>
-      <w:pPr>
-        <w:spacing w:after="40" w:before="100"/>
-      </w:pPr>
-      <w:r>
-        <w:rPr>
-          <w:b/>
-          <w:bCs/>
-          <w:color w:val="0F766E"/>
-        </w:rPr>
-        <w:t xml:space="preserve">Ejercicio 3 [Caso 3: Trabajo en el Cuaderno de Ciencias]: </w:t>
-      </w:r>
-      <w:r>
-        <w:t xml:space="preserve">Abre tu cuaderno de Ciencias Naturales. Dibuja un cuadro con cuatro columnas tituladas: Biológica, Afectiva, Social y Ética. Anota en la columna "Ética" una acción que demuestre respeto hacia tus compañeros.</w:t>
-      </w:r>
-    </w:p>
-    <w:p>
-      <w:pPr>
-        <w:spacing w:after="120"/>
-      </w:pPr>
-      <w:r>
-        <w:t xml:space="preserve">Desarrollo y respuesta:
-_____________________________________________________________________________________
-_____________________________________________________________________________________</w:t>
-      </w:r>
-    </w:p>
-    <w:p>
-      <w:pPr>
-        <w:pStyle w:val="Heading2"/>
-        <w:spacing w:after="100" w:before="200"/>
-      </w:pPr>
-      <w:r>
-        <w:t xml:space="preserve">4. Miniquiz de Autocomprobación (Marca la alternativa correcta)</w:t>
-      </w:r>
-    </w:p>
-    <w:p>
-      <w:pPr>
-        <w:spacing w:after="40" w:before="80"/>
-      </w:pPr>
-      <w:r>
-        <w:rPr>
-          <w:b/>
-          <w:bCs/>
-        </w:rPr>
-        <w:t xml:space="preserve">Pregunta 1: </w:t>
-      </w:r>
-      <w:r>
-        <w:t xml:space="preserve">¿Cuál de las siguientes afirmaciones define correctamente la sexualidad humana según la ciencia?</w:t>
-      </w:r>
-    </w:p>
-    <w:p>
-      <w:pPr>
-        <w:spacing w:after="30"/>
-      </w:pPr>
-      <w:r>
-        <w:rPr>
-          <w:sz w:val="19"/>
-          <w:szCs w:val="19"/>
-        </w:rPr>
-        <w:t xml:space="preserve">   [   ]  A)  Es una dimensión integral presente a lo largo de toda la vida que une lo biológico, afectivo, social y ético.</w:t>
-      </w:r>
-    </w:p>
-    <w:p>
-      <w:pPr>
-        <w:spacing w:after="30"/>
-      </w:pPr>
-      <w:r>
-        <w:rPr>
-          <w:sz w:val="19"/>
-          <w:szCs w:val="19"/>
-        </w:rPr>
-        <w:t xml:space="preserve">   [   ]  B)  Se reduce exclusivamente a la reproducción biológica y a los órganos del cuerpo humano.</w:t>
-      </w:r>
-    </w:p>
-    <w:p>
-      <w:pPr>
-        <w:spacing w:after="30"/>
-      </w:pPr>
-      <w:r>
-        <w:rPr>
-          <w:sz w:val="19"/>
-          <w:szCs w:val="19"/>
-        </w:rPr>
-        <w:t xml:space="preserve">   [   ]  C)  Es un tema que únicamente involucra a los adultos y no tiene relación con las emociones ni los valores.</w:t>
-      </w:r>
-    </w:p>
-    <w:p>
-      <w:pPr>
-        <w:spacing w:after="80"/>
-      </w:pPr>
-    </w:p>
-    <w:p>
-      <w:pPr>
-        <w:spacing w:after="40" w:before="80"/>
-      </w:pPr>
-      <w:r>
-        <w:rPr>
-          <w:b/>
-          <w:bCs/>
-        </w:rPr>
-        <w:t xml:space="preserve">Pregunta 2: </w:t>
-      </w:r>
-      <w:r>
-        <w:t xml:space="preserve">El cambio en el tono de la voz y el crecimiento acelerado de estatura durante la pubertad corresponden a la dimensión:</w:t>
-      </w:r>
-    </w:p>
-    <w:p>
-      <w:pPr>
-        <w:spacing w:after="30"/>
-      </w:pPr>
-      <w:r>
-        <w:rPr>
-          <w:sz w:val="19"/>
-          <w:szCs w:val="19"/>
-        </w:rPr>
-        <w:t xml:space="preserve">   [   ]  A)  Biológica</w:t>
-      </w:r>
-    </w:p>
-    <w:p>
-      <w:pPr>
-        <w:spacing w:after="30"/>
-      </w:pPr>
-      <w:r>
-        <w:rPr>
-          <w:sz w:val="19"/>
-          <w:szCs w:val="19"/>
-        </w:rPr>
-        <w:t xml:space="preserve">   [   ]  B)  Social</w:t>
-      </w:r>
-    </w:p>
-    <w:p>
-      <w:pPr>
-        <w:spacing w:after="30"/>
-      </w:pPr>
-      <w:r>
-        <w:rPr>
-          <w:sz w:val="19"/>
-          <w:szCs w:val="19"/>
-        </w:rPr>
-        <w:t xml:space="preserve">   [   ]  C)  Ética</w:t>
-      </w:r>
-    </w:p>
-    <w:p>
-      <w:pPr>
-        <w:spacing w:after="80"/>
-      </w:pPr>
-    </w:p>
-    <w:p>
-      <w:pPr>
-        <w:spacing w:after="40" w:before="80"/>
-      </w:pPr>
-      <w:r>
-        <w:rPr>
-          <w:b/>
-          <w:bCs/>
-        </w:rPr>
-        <w:t xml:space="preserve">Pregunta 3: </w:t>
-      </w:r>
-      <w:r>
-        <w:t xml:space="preserve">Aprender a decir "no" con seguridad y respetar los límites y decisiones de los demás corresponde a la dimensión:</w:t>
-      </w:r>
-    </w:p>
-    <w:p>
-      <w:pPr>
-        <w:spacing w:after="30"/>
-      </w:pPr>
-      <w:r>
-        <w:rPr>
-          <w:sz w:val="19"/>
-          <w:szCs w:val="19"/>
-        </w:rPr>
-        <w:t xml:space="preserve">   [   ]  A)  Ética y moral</w:t>
-      </w:r>
-    </w:p>
-    <w:p>
-      <w:pPr>
-        <w:spacing w:after="30"/>
-      </w:pPr>
-      <w:r>
-        <w:rPr>
-          <w:sz w:val="19"/>
-          <w:szCs w:val="19"/>
-        </w:rPr>
-        <w:t xml:space="preserve">   [   ]  B)  Exclusivamente biológica</w:t>
-      </w:r>
-    </w:p>
-    <w:p>
-      <w:pPr>
-        <w:spacing w:after="30"/>
-      </w:pPr>
-      <w:r>
-        <w:rPr>
-          <w:sz w:val="19"/>
-          <w:szCs w:val="19"/>
-        </w:rPr>
-        <w:t xml:space="preserve">   [   ]  C)  Únicamente climática</w:t>
-      </w:r>
-    </w:p>
-    <w:p>
-      <w:pPr>
-        <w:spacing w:after="80"/>
-      </w:pPr>
-    </w:p>
-    <w:p>
-      <w:pPr>
-        <w:pStyle w:val="Heading2"/>
-        <w:spacing w:after="80" w:before="200"/>
-      </w:pPr>
-      <w:r>
-        <w:t xml:space="preserve">5. Autoevaluación y Reflexión</w:t>
-      </w:r>
-    </w:p>
-    <w:p>
-      <w:pPr>
-        <w:spacing w:after="60"/>
-      </w:pPr>
-      <w:r>
-        <w:rPr>
-          <w:b/>
-          <w:bCs/>
-        </w:rPr>
-        <w:t xml:space="preserve">¿Cómo sentí mi aprendizaje en esta lección?
-</w:t>
-      </w:r>
-      <w:r>
-        <w:t xml:space="preserve">[   ] Comprendí muy bien y puedo explicarlo.
-[   ] Entendí la mayor parte pero requiero algo de práctica.
-[   ] Necesito revisar la explicación con mi mentor.</w:t>
-      </w:r>
-    </w:p>
-    <w:p>
-      <w:pPr>
-        <w:spacing w:after="150"/>
-      </w:pPr>
-      <w:r>
-        <w:t xml:space="preserve">Lo que más me llamó la atención hoy fue: _____________________________________________________
-_____________________________________________________________________________________</w:t>
       </w:r>
     </w:p>
     <w:p>
@@ -6467,7 +5928,7 @@
                 <w:sz w:val="17"/>
                 <w:szCs w:val="17"/>
               </w:rPr>
-              <w:t xml:space="preserve">Esquema endocrino: Hipófisis -&gt; Señales químicas LH y FSH -&gt; Gónadas</w:t>
+              <w:t xml:space="preserve">Esquema endocrino: Hipotálamo (GnRH) -&gt; Hipófisis anterior (LH y FSH) -&gt; Gónadas (hormonas sexuales) -&gt; Cambios puberales</w:t>
             </w:r>
           </w:p>
         </w:tc>
@@ -6488,7 +5949,7 @@
                 <w:sz w:val="18"/>
                 <w:szCs w:val="18"/>
               </w:rPr>
-              <w:t xml:space="preserve">En la base del cerebro, la hipófisis emite hormonas que despiertan a los ovarios y testículos para comenzar la maduración.</w:t>
+              <w:t xml:space="preserve">En el encéfalo, el hipotálamo libera GnRH estimulando a la hipófisis anterior para secretar LH y FSH, las cuales activan a las gónadas a producir hormonas sexuales.</w:t>
             </w:r>
           </w:p>
         </w:tc>
@@ -7145,7 +6606,7 @@
                 <w:sz w:val="17"/>
                 <w:szCs w:val="17"/>
               </w:rPr>
-              <w:t xml:space="preserve">Modern anime style 16:9 widescreen illustration. Two 13-year-old student explorers, a girl with braided hair and a boy in a teal jacket, interacting with healthy teenage friends of different heights and physical builds, observing diverse growth rhythms between 10 and 16 years, with generous negative space for text overlays. No text drawn by AI.</w:t>
+              <w:t xml:space="preserve">Modern anime style 16:9 widescreen illustration. Two 13-year-old student explorers, a girl with braided hair and a boy in a teal jacket, interacting with healthy teenage friends of different heights and physical builds, observing diverse developmental and growth rhythms, with generous negative space for text overlays. No text drawn by AI.</w:t>
             </w:r>
           </w:p>
           <w:p>
@@ -7167,7 +6628,7 @@
                 <w:sz w:val="17"/>
                 <w:szCs w:val="17"/>
               </w:rPr>
-              <w:t xml:space="preserve">Rango cronológico: Variabilidad natural de inicio entre los 10 y 16 años</w:t>
+              <w:t xml:space="preserve">Consenso médico: Inicio habitual entre 8-13 años (niñas) y 9-14 años (niños) según Tanner / MedlinePlus</w:t>
             </w:r>
           </w:p>
         </w:tc>
@@ -7188,7 +6649,7 @@
                 <w:sz w:val="18"/>
                 <w:szCs w:val="18"/>
               </w:rPr>
-              <w:t xml:space="preserve">No todos los cuerpos crecen al mismo tiempo. La pubertad inicia normalmente entre los 10 y 16 años según ritmos genéticos.</w:t>
+              <w:t xml:space="preserve">No todos los cuerpos crecen al mismo tiempo. La pubertad inicia habitualmente entre los 8 y 13 años en niñas y entre los 9 y 14 años en niños según consensos médicos (Tanner / MedlinePlus), mientras que el estirón de estatura ocurre como un hito posterior.</w:t>
             </w:r>
           </w:p>
         </w:tc>
@@ -7888,7 +7349,7 @@
                 <w:sz w:val="18"/>
                 <w:szCs w:val="18"/>
               </w:rPr>
-              <w:t xml:space="preserve">Diferenciar caracteres sexuales primarios de secundarios en la pubertad</w:t>
+              <w:t xml:space="preserve">Diferenciar caracteres sexuales primarios de secundarios</w:t>
             </w:r>
           </w:p>
         </w:tc>
@@ -8063,7 +7524,7 @@
                 <w:sz w:val="18"/>
                 <w:szCs w:val="18"/>
               </w:rPr>
-              <w:t xml:space="preserve">Liberación de gonadotropinas, estrógenos y testosterona</w:t>
+              <w:t xml:space="preserve">Señales de LH, FSH y hormonas sexuales</w:t>
             </w:r>
           </w:p>
         </w:tc>
@@ -8091,7 +7552,7 @@
                 <w:sz w:val="17"/>
                 <w:szCs w:val="17"/>
               </w:rPr>
-              <w:t xml:space="preserve">Modern anime style 16:9 widescreen illustration. Two 13-year-old student explorers, a girl with braided hair and a boy in a teal jacket, analyzing the endocrine feedback loop showing the pituitary gland, gonadotropins, and gonadal hormones, with generous negative space for text overlays. No text drawn by AI.</w:t>
+              <w:t xml:space="preserve">Modern anime style 16:9 widescreen illustration. Two 13-year-old student explorers, a girl with braided hair and a boy in a teal jacket, in a modern science laboratory observing blank modular comparison panels representing the endocrine pathway with hypothalamus, pituitary and gonads, with generous negative space for text overlays. No text drawn by AI.</w:t>
             </w:r>
           </w:p>
           <w:p>
@@ -8113,7 +7574,7 @@
                 <w:sz w:val="17"/>
                 <w:szCs w:val="17"/>
               </w:rPr>
-              <w:t xml:space="preserve">Diagrama fisiológico: Hipófisis -&gt; LH/FSH -&gt; Ovarios (Estrógenos) / Testículos (Testosterona)</w:t>
+              <w:t xml:space="preserve">Diagrama fisiológico: Hipotálamo (GnRH) -&gt; Hipófisis anterior (LH y FSH) -&gt; Gónadas (hormonas sexuales) -&gt; Cambios puberales</w:t>
             </w:r>
           </w:p>
         </w:tc>
@@ -8134,7 +7595,7 @@
                 <w:sz w:val="18"/>
                 <w:szCs w:val="18"/>
               </w:rPr>
-              <w:t xml:space="preserve">La pubertad inicia cuando la hipófisis secreta hormonas gonadales. Estas estimulan la producción de estrógenos en mujeres y testosterona en varones, desencadenando cambios físicos.</w:t>
+              <w:t xml:space="preserve">La pubertad inicia cuando el hipotálamo (GnRH) estimula a la hipófisis anterior para liberar LH y FSH; estas viajan por la sangre y activan a las gónadas a producir hormonas sexuales como estrógenos y testosterona que inducen los cambios puberales.</w:t>
             </w:r>
           </w:p>
         </w:tc>
@@ -8238,7 +7699,7 @@
                 <w:sz w:val="18"/>
                 <w:szCs w:val="18"/>
               </w:rPr>
-              <w:t xml:space="preserve">Anatomía presente desde el nacimiento</w:t>
+              <w:t xml:space="preserve">Estructuras anatómicas presentes desde el nacimiento</w:t>
             </w:r>
           </w:p>
         </w:tc>
@@ -8266,7 +7727,7 @@
                 <w:sz w:val="17"/>
                 <w:szCs w:val="17"/>
               </w:rPr>
-              <w:t xml:space="preserve">Modern anime style 16:9 widescreen illustration. Two 13-year-old student explorers, a girl with braided hair and a boy in a teal jacket, examining a developmental timeline of secondary sexual characteristics in males and females with clean medical aesthetics, with generous negative space for text overlays. No text drawn by AI.</w:t>
+              <w:t xml:space="preserve">Modern anime style 16:9 widescreen illustration. Two 13-year-old student explorers, a girl with braided hair and a boy in a teal jacket, studying a respectful anatomical diagram of primary reproductive organs present from birth, with generous negative space for text overlays. No text drawn by AI.</w:t>
             </w:r>
           </w:p>
           <w:p>
@@ -8288,7 +7749,7 @@
                 <w:sz w:val="17"/>
                 <w:szCs w:val="17"/>
               </w:rPr>
-              <w:t xml:space="preserve">Capa anatómica: Ovarios, útero, trompas, testículos, conductos y pene presentes desde el parto</w:t>
+              <w:t xml:space="preserve">Capa anatómica: Órganos reproductores congénitos presentes desde la gestación y el nacimiento</w:t>
             </w:r>
           </w:p>
         </w:tc>
@@ -8309,7 +7770,7 @@
                 <w:sz w:val="18"/>
                 <w:szCs w:val="18"/>
               </w:rPr>
-              <w:t xml:space="preserve">Los caracteres primarios son congénitos y anatómicos. Los secundarios son adquiridos durante la pubertad por estímulo hormonal, preparando al organismo para la madurez reproductiva.</w:t>
+              <w:t xml:space="preserve">Los caracteres primarios son los órganos reproductores congénitos presentes desde el nacimiento; se formaron durante la gestación y existen antes de las señales hormonales de la pubertad.</w:t>
             </w:r>
           </w:p>
         </w:tc>
@@ -8484,7 +7945,7 @@
                 <w:sz w:val="18"/>
                 <w:szCs w:val="18"/>
               </w:rPr>
-              <w:t xml:space="preserve">La pubertad inicia entre los 8 y 13 años en niñas y entre los 9 y 14 en niños, mientras que el estirón puberal ocurre entre los 10 y 14 en niñas y 12 a 16 en niños, según los estadios de Tanner (1962) y MINEDUC.</w:t>
+              <w:t xml:space="preserve">Los caracteres secundarios surgen en la pubertad por estímulo de las hormonas sexuales: provocan el estirón de estatura, cambio de voz, desarrollo mamario y aparición de vello.</w:t>
             </w:r>
           </w:p>
         </w:tc>
@@ -9449,7 +8910,7 @@
         <w:t xml:space="preserve">Opciones: </w:t>
       </w:r>
       <w:r>
-        <w:t xml:space="preserve">La glándula hipófisis (ubicada en la base del cerebro) | El páncreas (encargado de la digestión) | Las glándulas sudoríparas de la piel</w:t>
+        <w:t xml:space="preserve">La glándula hipófisis (ubicada en la base del cerebro) | El páncreas (encargado de la digestión) | Las glándulas sudoríparas de la piel | El apéndice cecal del sistema digestivo</w:t>
       </w:r>
     </w:p>
     <w:p>
@@ -9536,7 +8997,7 @@
         <w:t xml:space="preserve">Opciones: </w:t>
       </w:r>
       <w:r>
-        <w:t xml:space="preserve">El aumento acelerado de estatura (estirón puberal) | La presencia de los ovarios desde el nacimiento | La formación del corazón en la etapa embrionaria</w:t>
+        <w:t xml:space="preserve">La presencia de ovarios o testículos desde el nacimiento | El aumento acelerado de estatura (estirón puberal) | La formación del corazón en la etapa embrionaria | La presencia de los pulmones al nacer</w:t>
       </w:r>
     </w:p>
     <w:p>
@@ -9623,7 +9084,7 @@
         <w:t xml:space="preserve">Opciones: </w:t>
       </w:r>
       <w:r>
-        <w:t xml:space="preserve">Cada cuerpo posee un ritmo biológico individual normal influenciado por factores genéticos y de salud | Significa obligatoriamente que uno de ellos tiene una deficiencia biológica permanente | Todos los seres humanos deben comenzar la pubertad exactamente el mismo día</w:t>
+        <w:t xml:space="preserve">Significa obligatoriamente que uno de ellos tiene una deficiencia permanente | Todos los seres humanos deben comenzar la pubertad el mismo día | Cada cuerpo posee un ritmo biológico individual normal influenciado por factores genéticos y de salud | Demuestra que la pubertad no depende de señales hormonales</w:t>
       </w:r>
     </w:p>
     <w:p>
@@ -9675,7 +9136,7 @@
           <w:i/>
           <w:iCs/>
         </w:rPr>
-        <w:t xml:space="preserve">Existe una amplia variabilidad biológica natural: la pubertad suele iniciarse entre los 10 y 16 años sin que ello represente una anomalía.</w:t>
+        <w:t xml:space="preserve">Existe una amplia variabilidad biológica natural: el inicio de la pubertad suele ocurrir entre los 8 y 13 años en niñas y entre los 9 y 14 años en niños (Tanner / MedlinePlus), mientras que el estirón de estatura ocurre como un hito posterior entre los 10 y 16 años según factores genéticos y nutricionales, sin constituir una anomalía.</w:t>
       </w:r>
     </w:p>
     <w:p>
@@ -9730,7 +9191,7 @@
 </w:t>
       </w:r>
       <w:r>
-        <w:t xml:space="preserve">Opciones: Los órganos reproductores anatómicos presentes al nacer | El ensanchamiento de hombros durante la pubertad | Correcta: Los órganos reproductores anatómicos presentes al nacer
+        <w:t xml:space="preserve">Opciones: El cambio en el tono de la voz en la adolescencia | El ensanchamiento de hombros durante la pubertad | Los órganos reproductores anatómicos presentes al nacer | La aparición de vello corporal durante el estirón | Correcta: Los órganos reproductores anatómicos presentes al nacer
 </w:t>
       </w:r>
       <w:r>
@@ -9793,545 +9254,6 @@
       </w:r>
       <w:r>
         <w:t xml:space="preserve">¡Felicitaciones! Has completado con éxito la lección sobre transformaciones físicas y emocionales de la pubertad.</w:t>
-      </w:r>
-    </w:p>
-    <w:p>
-      <w:pPr>
-        <w:pStyle w:val="Heading1"/>
-        <w:pageBreakBefore/>
-        <w:spacing w:after="150" w:before="400"/>
-      </w:pPr>
-      <w:r>
-        <w:t xml:space="preserve">SECCIÓN 2: CUADERNILLO DE TRABAJO DEL ESTUDIANTE</w:t>
-      </w:r>
-    </w:p>
-    <w:p>
-      <w:pPr>
-        <w:spacing w:after="150"/>
-      </w:pPr>
-      <w:r>
-        <w:rPr>
-          <w:b/>
-          <w:bCs/>
-          <w:color w:val="0F766E"/>
-          <w:sz w:val="18"/>
-          <w:szCs w:val="18"/>
-        </w:rPr>
-        <w:t xml:space="preserve">STUDIOSIMPLE · ECOSISTEMA EDUCATIVO HOMESCHOOLING</w:t>
-      </w:r>
-    </w:p>
-    <w:tbl>
-      <w:tblPr>
-        <w:tblW w:type="pct" w:w="100%"/>
-        <w:tblBorders>
-          <w:top w:val="single" w:color="auto" w:sz="4"/>
-          <w:left w:val="single" w:color="auto" w:sz="4"/>
-          <w:bottom w:val="single" w:color="auto" w:sz="4"/>
-          <w:right w:val="single" w:color="auto" w:sz="4"/>
-          <w:insideH w:val="single" w:color="auto" w:sz="4"/>
-          <w:insideV w:val="single" w:color="auto" w:sz="4"/>
-        </w:tblBorders>
-      </w:tblPr>
-      <w:tblGrid>
-        <w:gridCol w:w="100"/>
-        <w:gridCol w:w="100"/>
-      </w:tblGrid>
-      <w:tr>
-        <w:tc>
-          <w:tcPr>
-            <w:tcW w:type="pct" w:w="60%"/>
-            <w:shd w:fill="F8FAFC" w:val="clear"/>
-          </w:tcPr>
-          <w:p>
-            <w:pPr>
-              <w:spacing w:after="80" w:before="80"/>
-            </w:pPr>
-            <w:r>
-              <w:rPr>
-                <w:b/>
-                <w:bCs/>
-                <w:sz w:val="18"/>
-                <w:szCs w:val="18"/>
-              </w:rPr>
-              <w:t xml:space="preserve">Nombre del Estudiante: </w:t>
-            </w:r>
-            <w:r>
-              <w:rPr>
-                <w:sz w:val="18"/>
-                <w:szCs w:val="18"/>
-              </w:rPr>
-              <w:t xml:space="preserve">________________________________________</w:t>
-            </w:r>
-          </w:p>
-        </w:tc>
-        <w:tc>
-          <w:tcPr>
-            <w:tcW w:type="pct" w:w="40%"/>
-            <w:shd w:fill="F8FAFC" w:val="clear"/>
-          </w:tcPr>
-          <w:p>
-            <w:pPr>
-              <w:spacing w:after="80" w:before="80"/>
-            </w:pPr>
-            <w:r>
-              <w:rPr>
-                <w:b/>
-                <w:bCs/>
-                <w:sz w:val="18"/>
-                <w:szCs w:val="18"/>
-              </w:rPr>
-              <w:t xml:space="preserve">Fecha: </w:t>
-            </w:r>
-            <w:r>
-              <w:rPr>
-                <w:sz w:val="18"/>
-                <w:szCs w:val="18"/>
-              </w:rPr>
-              <w:t xml:space="preserve">____ / ____ / ________</w:t>
-            </w:r>
-          </w:p>
-        </w:tc>
-      </w:tr>
-      <w:tr>
-        <w:tc>
-          <w:tcPr>
-            <w:tcW w:type="pct" w:w="60%"/>
-            <w:shd w:fill="FFFFFF" w:val="clear"/>
-          </w:tcPr>
-          <w:p>
-            <w:pPr>
-              <w:spacing w:after="80" w:before="80"/>
-            </w:pPr>
-            <w:r>
-              <w:rPr>
-                <w:b/>
-                <w:bCs/>
-                <w:color w:val="334155"/>
-                <w:sz w:val="18"/>
-                <w:szCs w:val="18"/>
-              </w:rPr>
-              <w:t xml:space="preserve">Curso: 7° Básico  |  Asignatura: Ciencias Naturales</w:t>
-            </w:r>
-          </w:p>
-        </w:tc>
-        <w:tc>
-          <w:tcPr>
-            <w:tcW w:type="pct" w:w="40%"/>
-            <w:shd w:fill="FFFFFF" w:val="clear"/>
-          </w:tcPr>
-          <w:p>
-            <w:pPr>
-              <w:spacing w:after="80" w:before="80"/>
-            </w:pPr>
-            <w:r>
-              <w:rPr>
-                <w:b/>
-                <w:bCs/>
-                <w:color w:val="0F766E"/>
-                <w:sz w:val="18"/>
-                <w:szCs w:val="18"/>
-              </w:rPr>
-              <w:t xml:space="preserve">Clase 2: Transformaciones Físicas y Emocionales en la Pubertad</w:t>
-            </w:r>
-          </w:p>
-        </w:tc>
-      </w:tr>
-    </w:tbl>
-    <w:p>
-      <w:pPr>
-        <w:spacing w:after="120" w:before="200"/>
-      </w:pPr>
-      <w:r>
-        <w:rPr>
-          <w:b/>
-          <w:bCs/>
-          <w:color w:val="1E293B"/>
-        </w:rPr>
-        <w:t xml:space="preserve">Meta de Aprendizaje de Hoy: </w:t>
-      </w:r>
-      <w:r>
-        <w:rPr>
-          <w:i/>
-          <w:iCs/>
-        </w:rPr>
-        <w:t xml:space="preserve">Comprender la diferencia biológica entre caracteres sexuales primarios y secundarios, y reconocer cómo las hormonas influyen tanto en el crecimiento corporal como en el mundo emocional de la adolescencia.</w:t>
-      </w:r>
-    </w:p>
-    <w:p>
-      <w:pPr>
-        <w:pStyle w:val="Heading2"/>
-        <w:spacing w:after="80" w:before="200"/>
-      </w:pPr>
-      <w:r>
-        <w:t xml:space="preserve">1. Desafío de Exploración Inicial (Situación Detonante)</w:t>
-      </w:r>
-    </w:p>
-    <w:p>
-      <w:pPr>
-        <w:spacing w:after="100"/>
-      </w:pPr>
-      <w:r>
-        <w:t xml:space="preserve">Durante la pubertad, los adolescentes experimentan cambios corporales notorios: aumentan de estatura, cambia el tono de su voz y aparece vello corporal, mientras sus órganos reproductores maduran. ¿Qué sistema del cuerpo humano produce las sustancias químicas (hormonas) encargadas de coordinar y activar estos cambios?</w:t>
-      </w:r>
-    </w:p>
-    <w:p>
-      <w:pPr>
-        <w:spacing w:after="60"/>
-      </w:pPr>
-      <w:r>
-        <w:rPr>
-          <w:b/>
-          <w:bCs/>
-          <w:color w:val="64748B"/>
-          <w:sz w:val="18"/>
-          <w:szCs w:val="18"/>
-        </w:rPr>
-        <w:t xml:space="preserve">Registra tu respuesta o deducción inicial en las siguientes líneas:</w:t>
-      </w:r>
-    </w:p>
-    <w:p>
-      <w:pPr>
-        <w:spacing w:after="60"/>
-      </w:pPr>
-      <w:r>
-        <w:t xml:space="preserve">_____________________________________________________________________________________
-_____________________________________________________________________________________
-_____________________________________________________________________________________</w:t>
-      </w:r>
-    </w:p>
-    <w:p>
-      <w:pPr>
-        <w:pStyle w:val="Heading2"/>
-        <w:spacing w:after="80" w:before="200"/>
-      </w:pPr>
-      <w:r>
-        <w:t xml:space="preserve">2. Organizador Gráfico de Aprendizaje</w:t>
-      </w:r>
-    </w:p>
-    <w:p>
-      <w:pPr>
-        <w:spacing w:after="80"/>
-      </w:pPr>
-      <w:r>
-        <w:rPr>
-          <w:i/>
-          <w:iCs/>
-        </w:rPr>
-        <w:t xml:space="preserve">Completa el organizador conceptual con las ideas clave y evidencias analizadas en la clase:</w:t>
-      </w:r>
-    </w:p>
-    <w:p>
-      <w:pPr>
-        <w:spacing w:after="150"/>
-      </w:pPr>
-      <w:r>
-        <w:rPr>
-          <w:i/>
-          <w:iCs/>
-          <w:color w:val="94A3B8"/>
-        </w:rPr>
-        <w:t xml:space="preserve">Espacio para anotaciones o diagrama del estudiante:
-</w:t>
-      </w:r>
-    </w:p>
-    <w:p>
-      <w:pPr>
-        <w:pStyle w:val="Heading2"/>
-        <w:spacing w:after="100" w:before="200"/>
-      </w:pPr>
-      <w:r>
-        <w:t xml:space="preserve">3. Desafíos de Práctica en Cuaderno (Resolución Aplicada)</w:t>
-      </w:r>
-    </w:p>
-    <w:p>
-      <w:pPr>
-        <w:spacing w:after="40" w:before="100"/>
-      </w:pPr>
-      <w:r>
-        <w:rPr>
-          <w:b/>
-          <w:bCs/>
-          <w:color w:val="0F766E"/>
-        </w:rPr>
-        <w:t xml:space="preserve">Ejercicio 1 [Caso 1: Clasificación de caracteres físicos]: </w:t>
-      </w:r>
-      <w:r>
-        <w:t xml:space="preserve">Identifica si el cambio en el tono de la voz y el aumento acelerado de estatura corresponden a caracteres sexuales primarios o secundarios, y justifica tu respuesta con un criterio biológico.</w:t>
-      </w:r>
-    </w:p>
-    <w:p>
-      <w:pPr>
-        <w:spacing w:after="120"/>
-      </w:pPr>
-      <w:r>
-        <w:t xml:space="preserve">Desarrollo y respuesta:
-_____________________________________________________________________________________
-_____________________________________________________________________________________</w:t>
-      </w:r>
-    </w:p>
-    <w:p>
-      <w:pPr>
-        <w:spacing w:after="40" w:before="100"/>
-      </w:pPr>
-      <w:r>
-        <w:rPr>
-          <w:b/>
-          <w:bCs/>
-          <w:color w:val="0F766E"/>
-        </w:rPr>
-        <w:t xml:space="preserve">Ejercicio 2 [Caso 2: Cambios emocionales y autonomía]: </w:t>
-      </w:r>
-      <w:r>
-        <w:t xml:space="preserve">Un estudiante de 13 años siente que a veces prefiere estar a solas reflexionando y otras veces necesita el apoyo de sus padres. ¿Es esta conducta un cambio emocional normal de la pubertad? Justifica.</w:t>
-      </w:r>
-    </w:p>
-    <w:p>
-      <w:pPr>
-        <w:spacing w:after="120"/>
-      </w:pPr>
-      <w:r>
-        <w:t xml:space="preserve">Desarrollo y respuesta:
-_____________________________________________________________________________________
-_____________________________________________________________________________________</w:t>
-      </w:r>
-    </w:p>
-    <w:p>
-      <w:pPr>
-        <w:spacing w:after="40" w:before="100"/>
-      </w:pPr>
-      <w:r>
-        <w:rPr>
-          <w:b/>
-          <w:bCs/>
-          <w:color w:val="0F766E"/>
-        </w:rPr>
-        <w:t xml:space="preserve">Ejercicio 3 [Caso 3: Trabajo en el Cuaderno de Ciencias]: </w:t>
-      </w:r>
-      <w:r>
-        <w:t xml:space="preserve">Abre tu cuaderno de Ciencias Naturales. Traza dos columnas tituladas: 'Caracteres Sexuales Primarios' y 'Caracteres Sexuales Secundarios'. Anota dos ejemplos en cada columna e indica la hormona principal que activa los secundarios.</w:t>
-      </w:r>
-    </w:p>
-    <w:p>
-      <w:pPr>
-        <w:spacing w:after="120"/>
-      </w:pPr>
-      <w:r>
-        <w:t xml:space="preserve">Desarrollo y respuesta:
-_____________________________________________________________________________________
-_____________________________________________________________________________________</w:t>
-      </w:r>
-    </w:p>
-    <w:p>
-      <w:pPr>
-        <w:pStyle w:val="Heading2"/>
-        <w:spacing w:after="100" w:before="200"/>
-      </w:pPr>
-      <w:r>
-        <w:t xml:space="preserve">4. Miniquiz de Autocomprobación (Marca la alternativa correcta)</w:t>
-      </w:r>
-    </w:p>
-    <w:p>
-      <w:pPr>
-        <w:spacing w:after="40" w:before="80"/>
-      </w:pPr>
-      <w:r>
-        <w:rPr>
-          <w:b/>
-          <w:bCs/>
-        </w:rPr>
-        <w:t xml:space="preserve">Pregunta 1: </w:t>
-      </w:r>
-      <w:r>
-        <w:t xml:space="preserve">¿Cuál es la glándula endocrina que produce las hormonas encargadas de activar a las gónadas al inicio de la pubertad?</w:t>
-      </w:r>
-    </w:p>
-    <w:p>
-      <w:pPr>
-        <w:spacing w:after="30"/>
-      </w:pPr>
-      <w:r>
-        <w:rPr>
-          <w:sz w:val="19"/>
-          <w:szCs w:val="19"/>
-        </w:rPr>
-        <w:t xml:space="preserve">   [   ]  A)  La glándula hipófisis (ubicada en la base del cerebro)</w:t>
-      </w:r>
-    </w:p>
-    <w:p>
-      <w:pPr>
-        <w:spacing w:after="30"/>
-      </w:pPr>
-      <w:r>
-        <w:rPr>
-          <w:sz w:val="19"/>
-          <w:szCs w:val="19"/>
-        </w:rPr>
-        <w:t xml:space="preserve">   [   ]  B)  El páncreas (encargado de la digestión)</w:t>
-      </w:r>
-    </w:p>
-    <w:p>
-      <w:pPr>
-        <w:spacing w:after="30"/>
-      </w:pPr>
-      <w:r>
-        <w:rPr>
-          <w:sz w:val="19"/>
-          <w:szCs w:val="19"/>
-        </w:rPr>
-        <w:t xml:space="preserve">   [   ]  C)  Las glándulas sudoríparas de la piel</w:t>
-      </w:r>
-    </w:p>
-    <w:p>
-      <w:pPr>
-        <w:spacing w:after="80"/>
-      </w:pPr>
-    </w:p>
-    <w:p>
-      <w:pPr>
-        <w:spacing w:after="40" w:before="80"/>
-      </w:pPr>
-      <w:r>
-        <w:rPr>
-          <w:b/>
-          <w:bCs/>
-        </w:rPr>
-        <w:t xml:space="preserve">Pregunta 2: </w:t>
-      </w:r>
-      <w:r>
-        <w:t xml:space="preserve">¿Cuál de los siguientes rasgos corresponde a un carácter sexual secundario en los seres humanos?</w:t>
-      </w:r>
-    </w:p>
-    <w:p>
-      <w:pPr>
-        <w:spacing w:after="30"/>
-      </w:pPr>
-      <w:r>
-        <w:rPr>
-          <w:sz w:val="19"/>
-          <w:szCs w:val="19"/>
-        </w:rPr>
-        <w:t xml:space="preserve">   [   ]  A)  El aumento acelerado de estatura (estirón puberal)</w:t>
-      </w:r>
-    </w:p>
-    <w:p>
-      <w:pPr>
-        <w:spacing w:after="30"/>
-      </w:pPr>
-      <w:r>
-        <w:rPr>
-          <w:sz w:val="19"/>
-          <w:szCs w:val="19"/>
-        </w:rPr>
-        <w:t xml:space="preserve">   [   ]  B)  La presencia de los ovarios desde el nacimiento</w:t>
-      </w:r>
-    </w:p>
-    <w:p>
-      <w:pPr>
-        <w:spacing w:after="30"/>
-      </w:pPr>
-      <w:r>
-        <w:rPr>
-          <w:sz w:val="19"/>
-          <w:szCs w:val="19"/>
-        </w:rPr>
-        <w:t xml:space="preserve">   [   ]  C)  La formación del corazón en la etapa embrionaria</w:t>
-      </w:r>
-    </w:p>
-    <w:p>
-      <w:pPr>
-        <w:spacing w:after="80"/>
-      </w:pPr>
-    </w:p>
-    <w:p>
-      <w:pPr>
-        <w:spacing w:after="40" w:before="80"/>
-      </w:pPr>
-      <w:r>
-        <w:rPr>
-          <w:b/>
-          <w:bCs/>
-        </w:rPr>
-        <w:t xml:space="preserve">Pregunta 3: </w:t>
-      </w:r>
-      <w:r>
-        <w:t xml:space="preserve">Si dos adolescentes de la misma edad inician su pubertad en años distintos, ¿qué principio científico explica esta situación?</w:t>
-      </w:r>
-    </w:p>
-    <w:p>
-      <w:pPr>
-        <w:spacing w:after="30"/>
-      </w:pPr>
-      <w:r>
-        <w:rPr>
-          <w:sz w:val="19"/>
-          <w:szCs w:val="19"/>
-        </w:rPr>
-        <w:t xml:space="preserve">   [   ]  A)  Cada cuerpo posee un ritmo biológico individual normal influenciado por factores genéticos y de salud</w:t>
-      </w:r>
-    </w:p>
-    <w:p>
-      <w:pPr>
-        <w:spacing w:after="30"/>
-      </w:pPr>
-      <w:r>
-        <w:rPr>
-          <w:sz w:val="19"/>
-          <w:szCs w:val="19"/>
-        </w:rPr>
-        <w:t xml:space="preserve">   [   ]  B)  Significa obligatoriamente que uno de ellos tiene una deficiencia biológica permanente</w:t>
-      </w:r>
-    </w:p>
-    <w:p>
-      <w:pPr>
-        <w:spacing w:after="30"/>
-      </w:pPr>
-      <w:r>
-        <w:rPr>
-          <w:sz w:val="19"/>
-          <w:szCs w:val="19"/>
-        </w:rPr>
-        <w:t xml:space="preserve">   [   ]  C)  Todos los seres humanos deben comenzar la pubertad exactamente el mismo día</w:t>
-      </w:r>
-    </w:p>
-    <w:p>
-      <w:pPr>
-        <w:spacing w:after="80"/>
-      </w:pPr>
-    </w:p>
-    <w:p>
-      <w:pPr>
-        <w:pStyle w:val="Heading2"/>
-        <w:spacing w:after="80" w:before="200"/>
-      </w:pPr>
-      <w:r>
-        <w:t xml:space="preserve">5. Autoevaluación y Reflexión</w:t>
-      </w:r>
-    </w:p>
-    <w:p>
-      <w:pPr>
-        <w:spacing w:after="60"/>
-      </w:pPr>
-      <w:r>
-        <w:rPr>
-          <w:b/>
-          <w:bCs/>
-        </w:rPr>
-        <w:t xml:space="preserve">¿Cómo sentí mi aprendizaje en esta lección?
-</w:t>
-      </w:r>
-      <w:r>
-        <w:t xml:space="preserve">[   ] Comprendí muy bien y puedo explicarlo.
-[   ] Entendí la mayor parte pero requiero algo de práctica.
-[   ] Necesito revisar la explicación con mi mentor.</w:t>
-      </w:r>
-    </w:p>
-    <w:p>
-      <w:pPr>
-        <w:spacing w:after="150"/>
-      </w:pPr>
-      <w:r>
-        <w:t xml:space="preserve">Lo que más me llamó la atención hoy fue: _____________________________________________________
-_____________________________________________________________________________________</w:t>
       </w:r>
     </w:p>
     <w:p>
@@ -11838,7 +10760,7 @@
                 <w:sz w:val="17"/>
                 <w:szCs w:val="17"/>
               </w:rPr>
-              <w:t xml:space="preserve">Modern anime style 16:9 widescreen illustration. Two 13-year-old student explorers, a girl with braided hair and a boy in a teal jacket, reflecting on reciprocal support and sharing notes during study time in a soft morning atmosphere, with generous negative space for text overlays. No text drawn by AI.</w:t>
+              <w:t xml:space="preserve">Modern anime style 16:9 widescreen illustration. Two 13-year-old student explorers, a girl with braided hair and a boy in a teal jacket, responsibly reviewing privacy settings on digital tablets with a protective digital shield icon, respecting personal boundaries and digital privacy, with generous negative space for text overlays. No text drawn by AI.</w:t>
             </w:r>
           </w:p>
           <w:p>
@@ -11881,7 +10803,7 @@
                 <w:sz w:val="18"/>
                 <w:szCs w:val="18"/>
               </w:rPr>
-              <w:t xml:space="preserve">La reciprocidad exige equilibrio: dar y recibir afecto en igualdad de condiciones, cuidando que nadie imponga su voluntad sobre los demás.</w:t>
+              <w:t xml:space="preserve">Cuidar la intimidad digital significa respetar las fotos, mensajes y contraseñas de los demás, recordando que la privacidad personal es un derecho innegociable en redes sociales.</w:t>
             </w:r>
           </w:p>
         </w:tc>
@@ -12756,7 +11678,7 @@
                 <w:sz w:val="18"/>
                 <w:szCs w:val="18"/>
               </w:rPr>
-              <w:t xml:space="preserve">Explicar el rol de la reciprocidad, la empatía y la intimidad en los vínculos afectivos</w:t>
+              <w:t xml:space="preserve">Comprender empatía, reciprocidad e intimidad en vínculos</w:t>
             </w:r>
           </w:p>
         </w:tc>
@@ -14317,7 +13239,7 @@
         <w:t xml:space="preserve">Opciones: </w:t>
       </w:r>
       <w:r>
-        <w:t xml:space="preserve">Escuchar con atención los sentimientos del otro e intentar comprender su perspectiva sin burlarse ni juzgar | Interrumpir constantemente al amigo para demostrar que uno tiene más experiencia | Obligar al compañero a cambiar de opinión para que piense igual que el resto</w:t>
+        <w:t xml:space="preserve">Escuchar con atención los sentimientos del otro e intentar comprender su perspectiva sin burlarse ni juzgar | Interrumpir constantemente al amigo para demostrar superioridad | Obligar al compañero a cambiar de opinión para que piense igual | Ignorar lo que la otra persona expresa y retirarse con enojo</w:t>
       </w:r>
     </w:p>
     <w:p>
@@ -14404,7 +13326,7 @@
         <w:t xml:space="preserve">Opciones: </w:t>
       </w:r>
       <w:r>
-        <w:t xml:space="preserve">Los pensamientos, emociones, vivencias personales y la privacidad del propio cuerpo frente a intromisiones no deseadas | Únicamente los bienes materiales que una persona compra en el supermercado | La obligación de publicar toda la vida personal en redes sociales públicas</w:t>
+        <w:t xml:space="preserve">Únicamente los bienes materiales que una persona compra en tiendas | La obligación de publicar toda la vida en redes sociales | Los pensamientos, emociones, vivencias personales y la privacidad del propio cuerpo frente a intromisiones no deseadas | El deber de someterse a las opiniones del grupo de pares</w:t>
       </w:r>
     </w:p>
     <w:p>
@@ -14491,7 +13413,7 @@
         <w:t xml:space="preserve">Opciones: </w:t>
       </w:r>
       <w:r>
-        <w:t xml:space="preserve">Se dialoga de manera asertiva, buscando acuerdos donde ambas personas sean valoradas | Una de las partes impone su voluntad gritando o amenazando con terminar la amistad | Se ignora el problema fingiendo que no existe hasta que explote en conflicto</w:t>
+        <w:t xml:space="preserve">Una de las partes impone su voluntad gritando o amenazando | Se dialoga de manera asertiva, buscando acuerdos donde ambas personas sean valoradas | Se corta el diálogo indefinidamente sin buscar solución | Se presiona a la otra persona hasta que ceda por cansancio</w:t>
       </w:r>
     </w:p>
     <w:p>
@@ -14598,7 +13520,7 @@
 </w:t>
       </w:r>
       <w:r>
-        <w:t xml:space="preserve">Opciones: No divulgar sus secretos personales ni compartir sus fotografías sin su consentimiento | Publicar sus anécdotas privadas en internet para que otros las comenten | Correcta: No divulgar sus secretos personales ni compartir sus fotografías sin su consentimiento
+        <w:t xml:space="preserve">Opciones: No divulgar sus secretos personales ni compartir sus fotografías sin su consentimiento | Publicar sus anécdotas privadas en internet para llamar la atención | Compartir sus contraseñas con otros compañeros de curso | Grabar conversaciones privadas y difundirlas en grupos | Correcta: No divulgar sus secretos personales ni compartir sus fotografías sin su consentimiento
 </w:t>
       </w:r>
       <w:r>
@@ -14661,545 +13583,6 @@
       </w:r>
       <w:r>
         <w:t xml:space="preserve">¡Felicitaciones! Has completado con éxito la lección sobre vínculos afectivos, respeto mutuo e intimidad.</w:t>
-      </w:r>
-    </w:p>
-    <w:p>
-      <w:pPr>
-        <w:pStyle w:val="Heading1"/>
-        <w:pageBreakBefore/>
-        <w:spacing w:after="150" w:before="400"/>
-      </w:pPr>
-      <w:r>
-        <w:t xml:space="preserve">SECCIÓN 2: CUADERNILLO DE TRABAJO DEL ESTUDIANTE</w:t>
-      </w:r>
-    </w:p>
-    <w:p>
-      <w:pPr>
-        <w:spacing w:after="150"/>
-      </w:pPr>
-      <w:r>
-        <w:rPr>
-          <w:b/>
-          <w:bCs/>
-          <w:color w:val="0F766E"/>
-          <w:sz w:val="18"/>
-          <w:szCs w:val="18"/>
-        </w:rPr>
-        <w:t xml:space="preserve">STUDIOSIMPLE · ECOSISTEMA EDUCATIVO HOMESCHOOLING</w:t>
-      </w:r>
-    </w:p>
-    <w:tbl>
-      <w:tblPr>
-        <w:tblW w:type="pct" w:w="100%"/>
-        <w:tblBorders>
-          <w:top w:val="single" w:color="auto" w:sz="4"/>
-          <w:left w:val="single" w:color="auto" w:sz="4"/>
-          <w:bottom w:val="single" w:color="auto" w:sz="4"/>
-          <w:right w:val="single" w:color="auto" w:sz="4"/>
-          <w:insideH w:val="single" w:color="auto" w:sz="4"/>
-          <w:insideV w:val="single" w:color="auto" w:sz="4"/>
-        </w:tblBorders>
-      </w:tblPr>
-      <w:tblGrid>
-        <w:gridCol w:w="100"/>
-        <w:gridCol w:w="100"/>
-      </w:tblGrid>
-      <w:tr>
-        <w:tc>
-          <w:tcPr>
-            <w:tcW w:type="pct" w:w="60%"/>
-            <w:shd w:fill="F8FAFC" w:val="clear"/>
-          </w:tcPr>
-          <w:p>
-            <w:pPr>
-              <w:spacing w:after="80" w:before="80"/>
-            </w:pPr>
-            <w:r>
-              <w:rPr>
-                <w:b/>
-                <w:bCs/>
-                <w:sz w:val="18"/>
-                <w:szCs w:val="18"/>
-              </w:rPr>
-              <w:t xml:space="preserve">Nombre del Estudiante: </w:t>
-            </w:r>
-            <w:r>
-              <w:rPr>
-                <w:sz w:val="18"/>
-                <w:szCs w:val="18"/>
-              </w:rPr>
-              <w:t xml:space="preserve">________________________________________</w:t>
-            </w:r>
-          </w:p>
-        </w:tc>
-        <w:tc>
-          <w:tcPr>
-            <w:tcW w:type="pct" w:w="40%"/>
-            <w:shd w:fill="F8FAFC" w:val="clear"/>
-          </w:tcPr>
-          <w:p>
-            <w:pPr>
-              <w:spacing w:after="80" w:before="80"/>
-            </w:pPr>
-            <w:r>
-              <w:rPr>
-                <w:b/>
-                <w:bCs/>
-                <w:sz w:val="18"/>
-                <w:szCs w:val="18"/>
-              </w:rPr>
-              <w:t xml:space="preserve">Fecha: </w:t>
-            </w:r>
-            <w:r>
-              <w:rPr>
-                <w:sz w:val="18"/>
-                <w:szCs w:val="18"/>
-              </w:rPr>
-              <w:t xml:space="preserve">____ / ____ / ________</w:t>
-            </w:r>
-          </w:p>
-        </w:tc>
-      </w:tr>
-      <w:tr>
-        <w:tc>
-          <w:tcPr>
-            <w:tcW w:type="pct" w:w="60%"/>
-            <w:shd w:fill="FFFFFF" w:val="clear"/>
-          </w:tcPr>
-          <w:p>
-            <w:pPr>
-              <w:spacing w:after="80" w:before="80"/>
-            </w:pPr>
-            <w:r>
-              <w:rPr>
-                <w:b/>
-                <w:bCs/>
-                <w:color w:val="334155"/>
-                <w:sz w:val="18"/>
-                <w:szCs w:val="18"/>
-              </w:rPr>
-              <w:t xml:space="preserve">Curso: 7° Básico  |  Asignatura: Ciencias Naturales</w:t>
-            </w:r>
-          </w:p>
-        </w:tc>
-        <w:tc>
-          <w:tcPr>
-            <w:tcW w:type="pct" w:w="40%"/>
-            <w:shd w:fill="FFFFFF" w:val="clear"/>
-          </w:tcPr>
-          <w:p>
-            <w:pPr>
-              <w:spacing w:after="80" w:before="80"/>
-            </w:pPr>
-            <w:r>
-              <w:rPr>
-                <w:b/>
-                <w:bCs/>
-                <w:color w:val="0F766E"/>
-                <w:sz w:val="18"/>
-                <w:szCs w:val="18"/>
-              </w:rPr>
-              <w:t xml:space="preserve">Clase 3: Vínculos Afectivos, Respeto Mutuo e Intimidad</w:t>
-            </w:r>
-          </w:p>
-        </w:tc>
-      </w:tr>
-    </w:tbl>
-    <w:p>
-      <w:pPr>
-        <w:spacing w:after="120" w:before="200"/>
-      </w:pPr>
-      <w:r>
-        <w:rPr>
-          <w:b/>
-          <w:bCs/>
-          <w:color w:val="1E293B"/>
-        </w:rPr>
-        <w:t xml:space="preserve">Meta de Aprendizaje de Hoy: </w:t>
-      </w:r>
-      <w:r>
-        <w:rPr>
-          <w:i/>
-          <w:iCs/>
-        </w:rPr>
-        <w:t xml:space="preserve">Comprender cómo la dimensión afectiva orienta nuestras relaciones con amigos y familiares, valorando la empatía, el respeto a los límites del prójimo y la protección de la intimidad personal.</w:t>
-      </w:r>
-    </w:p>
-    <w:p>
-      <w:pPr>
-        <w:pStyle w:val="Heading2"/>
-        <w:spacing w:after="80" w:before="200"/>
-      </w:pPr>
-      <w:r>
-        <w:t xml:space="preserve">1. Desafío de Exploración Inicial (Situación Detonante)</w:t>
-      </w:r>
-    </w:p>
-    <w:p>
-      <w:pPr>
-        <w:spacing w:after="100"/>
-      </w:pPr>
-      <w:r>
-        <w:t xml:space="preserve">Dos compañeros de curso tienen opiniones distintas sobre cómo organizar una actividad escolar. Uno de ellos propone escuchar las ideas de ambos, dialogar con calma y buscar un acuerdo justo sin imponer su voluntad sobre el otro. ¿Qué actitud afectiva y ética se manifiesta en esta forma de resolver las diferencias?</w:t>
-      </w:r>
-    </w:p>
-    <w:p>
-      <w:pPr>
-        <w:spacing w:after="60"/>
-      </w:pPr>
-      <w:r>
-        <w:rPr>
-          <w:b/>
-          <w:bCs/>
-          <w:color w:val="64748B"/>
-          <w:sz w:val="18"/>
-          <w:szCs w:val="18"/>
-        </w:rPr>
-        <w:t xml:space="preserve">Registra tu respuesta o deducción inicial en las siguientes líneas:</w:t>
-      </w:r>
-    </w:p>
-    <w:p>
-      <w:pPr>
-        <w:spacing w:after="60"/>
-      </w:pPr>
-      <w:r>
-        <w:t xml:space="preserve">_____________________________________________________________________________________
-_____________________________________________________________________________________
-_____________________________________________________________________________________</w:t>
-      </w:r>
-    </w:p>
-    <w:p>
-      <w:pPr>
-        <w:pStyle w:val="Heading2"/>
-        <w:spacing w:after="80" w:before="200"/>
-      </w:pPr>
-      <w:r>
-        <w:t xml:space="preserve">2. Organizador Gráfico de Aprendizaje</w:t>
-      </w:r>
-    </w:p>
-    <w:p>
-      <w:pPr>
-        <w:spacing w:after="80"/>
-      </w:pPr>
-      <w:r>
-        <w:rPr>
-          <w:i/>
-          <w:iCs/>
-        </w:rPr>
-        <w:t xml:space="preserve">Completa el organizador conceptual con las ideas clave y evidencias analizadas en la clase:</w:t>
-      </w:r>
-    </w:p>
-    <w:p>
-      <w:pPr>
-        <w:spacing w:after="150"/>
-      </w:pPr>
-      <w:r>
-        <w:rPr>
-          <w:i/>
-          <w:iCs/>
-          <w:color w:val="94A3B8"/>
-        </w:rPr>
-        <w:t xml:space="preserve">Espacio para anotaciones o diagrama del estudiante:
-</w:t>
-      </w:r>
-    </w:p>
-    <w:p>
-      <w:pPr>
-        <w:pStyle w:val="Heading2"/>
-        <w:spacing w:after="100" w:before="200"/>
-      </w:pPr>
-      <w:r>
-        <w:t xml:space="preserve">3. Desafíos de Práctica en Cuaderno (Resolución Aplicada)</w:t>
-      </w:r>
-    </w:p>
-    <w:p>
-      <w:pPr>
-        <w:spacing w:after="40" w:before="100"/>
-      </w:pPr>
-      <w:r>
-        <w:rPr>
-          <w:b/>
-          <w:bCs/>
-          <w:color w:val="0F766E"/>
-        </w:rPr>
-        <w:t xml:space="preserve">Ejercicio 1 [Caso 1: Resolución dialogada de diferencias]: </w:t>
-      </w:r>
-      <w:r>
-        <w:t xml:space="preserve">Dos amigos debaten sobre cómo resolver una diferencia de opinión sobre un proyecto escolar sin presiones, aplicando diálogo sincero y respeto mutuo. ¿Qué principio afectivo y ético se aplica en su conducta?</w:t>
-      </w:r>
-    </w:p>
-    <w:p>
-      <w:pPr>
-        <w:spacing w:after="120"/>
-      </w:pPr>
-      <w:r>
-        <w:t xml:space="preserve">Desarrollo y respuesta:
-_____________________________________________________________________________________
-_____________________________________________________________________________________</w:t>
-      </w:r>
-    </w:p>
-    <w:p>
-      <w:pPr>
-        <w:spacing w:after="40" w:before="100"/>
-      </w:pPr>
-      <w:r>
-        <w:rPr>
-          <w:b/>
-          <w:bCs/>
-          <w:color w:val="0F766E"/>
-        </w:rPr>
-        <w:t xml:space="preserve">Ejercicio 2 [Caso 2: Cuidado de la intimidad en redes sociales]: </w:t>
-      </w:r>
-      <w:r>
-        <w:t xml:space="preserve">Un grupo de chat propone compartir capturas de pantalla de una conversación privada de una compañera para reírse de sus gustos. Una estudiante dice que eso no es correcto y se niega a participar. ¿Qué derecho y valor ético defiende?</w:t>
-      </w:r>
-    </w:p>
-    <w:p>
-      <w:pPr>
-        <w:spacing w:after="120"/>
-      </w:pPr>
-      <w:r>
-        <w:t xml:space="preserve">Desarrollo y respuesta:
-_____________________________________________________________________________________
-_____________________________________________________________________________________</w:t>
-      </w:r>
-    </w:p>
-    <w:p>
-      <w:pPr>
-        <w:spacing w:after="40" w:before="100"/>
-      </w:pPr>
-      <w:r>
-        <w:rPr>
-          <w:b/>
-          <w:bCs/>
-          <w:color w:val="0F766E"/>
-        </w:rPr>
-        <w:t xml:space="preserve">Ejercicio 3 [Caso 3: Trabajo en el Cuaderno de Ciencias]: </w:t>
-      </w:r>
-      <w:r>
-        <w:t xml:space="preserve">Abre tu cuaderno de Ciencias Naturales. Dibuja un triángulo con tres vértices titulados: 'Empatía', 'Reciprocidad' y 'Respeto a la Intimidad'. En el centro, escribe un compromiso personal de cómo aplicarás estos tres valores en tu familia o amistades.</w:t>
-      </w:r>
-    </w:p>
-    <w:p>
-      <w:pPr>
-        <w:spacing w:after="120"/>
-      </w:pPr>
-      <w:r>
-        <w:t xml:space="preserve">Desarrollo y respuesta:
-_____________________________________________________________________________________
-_____________________________________________________________________________________</w:t>
-      </w:r>
-    </w:p>
-    <w:p>
-      <w:pPr>
-        <w:pStyle w:val="Heading2"/>
-        <w:spacing w:after="100" w:before="200"/>
-      </w:pPr>
-      <w:r>
-        <w:t xml:space="preserve">4. Miniquiz de Autocomprobación (Marca la alternativa correcta)</w:t>
-      </w:r>
-    </w:p>
-    <w:p>
-      <w:pPr>
-        <w:spacing w:after="40" w:before="80"/>
-      </w:pPr>
-      <w:r>
-        <w:rPr>
-          <w:b/>
-          <w:bCs/>
-        </w:rPr>
-        <w:t xml:space="preserve">Pregunta 1: </w:t>
-      </w:r>
-      <w:r>
-        <w:t xml:space="preserve">¿Cuál de las siguientes acciones demuestra una verdadera comunicación empática en una relación de amistad?</w:t>
-      </w:r>
-    </w:p>
-    <w:p>
-      <w:pPr>
-        <w:spacing w:after="30"/>
-      </w:pPr>
-      <w:r>
-        <w:rPr>
-          <w:sz w:val="19"/>
-          <w:szCs w:val="19"/>
-        </w:rPr>
-        <w:t xml:space="preserve">   [   ]  A)  Escuchar con atención los sentimientos del otro e intentar comprender su perspectiva sin burlarse ni juzgar</w:t>
-      </w:r>
-    </w:p>
-    <w:p>
-      <w:pPr>
-        <w:spacing w:after="30"/>
-      </w:pPr>
-      <w:r>
-        <w:rPr>
-          <w:sz w:val="19"/>
-          <w:szCs w:val="19"/>
-        </w:rPr>
-        <w:t xml:space="preserve">   [   ]  B)  Interrumpir constantemente al amigo para demostrar que uno tiene más experiencia</w:t>
-      </w:r>
-    </w:p>
-    <w:p>
-      <w:pPr>
-        <w:spacing w:after="30"/>
-      </w:pPr>
-      <w:r>
-        <w:rPr>
-          <w:sz w:val="19"/>
-          <w:szCs w:val="19"/>
-        </w:rPr>
-        <w:t xml:space="preserve">   [   ]  C)  Obligar al compañero a cambiar de opinión para que piense igual que el resto</w:t>
-      </w:r>
-    </w:p>
-    <w:p>
-      <w:pPr>
-        <w:spacing w:after="80"/>
-      </w:pPr>
-    </w:p>
-    <w:p>
-      <w:pPr>
-        <w:spacing w:after="40" w:before="80"/>
-      </w:pPr>
-      <w:r>
-        <w:rPr>
-          <w:b/>
-          <w:bCs/>
-        </w:rPr>
-        <w:t xml:space="preserve">Pregunta 2: </w:t>
-      </w:r>
-      <w:r>
-        <w:t xml:space="preserve">La intimidad personal es un derecho fundamental que protege:</w:t>
-      </w:r>
-    </w:p>
-    <w:p>
-      <w:pPr>
-        <w:spacing w:after="30"/>
-      </w:pPr>
-      <w:r>
-        <w:rPr>
-          <w:sz w:val="19"/>
-          <w:szCs w:val="19"/>
-        </w:rPr>
-        <w:t xml:space="preserve">   [   ]  A)  Los pensamientos, emociones, vivencias personales y la privacidad del propio cuerpo frente a intromisiones no deseadas</w:t>
-      </w:r>
-    </w:p>
-    <w:p>
-      <w:pPr>
-        <w:spacing w:after="30"/>
-      </w:pPr>
-      <w:r>
-        <w:rPr>
-          <w:sz w:val="19"/>
-          <w:szCs w:val="19"/>
-        </w:rPr>
-        <w:t xml:space="preserve">   [   ]  B)  Únicamente los bienes materiales que una persona compra en el supermercado</w:t>
-      </w:r>
-    </w:p>
-    <w:p>
-      <w:pPr>
-        <w:spacing w:after="30"/>
-      </w:pPr>
-      <w:r>
-        <w:rPr>
-          <w:sz w:val="19"/>
-          <w:szCs w:val="19"/>
-        </w:rPr>
-        <w:t xml:space="preserve">   [   ]  C)  La obligación de publicar toda la vida personal en redes sociales públicas</w:t>
-      </w:r>
-    </w:p>
-    <w:p>
-      <w:pPr>
-        <w:spacing w:after="80"/>
-      </w:pPr>
-    </w:p>
-    <w:p>
-      <w:pPr>
-        <w:spacing w:after="40" w:before="80"/>
-      </w:pPr>
-      <w:r>
-        <w:rPr>
-          <w:b/>
-          <w:bCs/>
-        </w:rPr>
-        <w:t xml:space="preserve">Pregunta 3: </w:t>
-      </w:r>
-      <w:r>
-        <w:t xml:space="preserve">En una relación afectiva recíproca y respetuosa, ¿qué ocurre cuando surge un desacuerdo?</w:t>
-      </w:r>
-    </w:p>
-    <w:p>
-      <w:pPr>
-        <w:spacing w:after="30"/>
-      </w:pPr>
-      <w:r>
-        <w:rPr>
-          <w:sz w:val="19"/>
-          <w:szCs w:val="19"/>
-        </w:rPr>
-        <w:t xml:space="preserve">   [   ]  A)  Se dialoga de manera asertiva, buscando acuerdos donde ambas personas sean valoradas</w:t>
-      </w:r>
-    </w:p>
-    <w:p>
-      <w:pPr>
-        <w:spacing w:after="30"/>
-      </w:pPr>
-      <w:r>
-        <w:rPr>
-          <w:sz w:val="19"/>
-          <w:szCs w:val="19"/>
-        </w:rPr>
-        <w:t xml:space="preserve">   [   ]  B)  Una de las partes impone su voluntad gritando o amenazando con terminar la amistad</w:t>
-      </w:r>
-    </w:p>
-    <w:p>
-      <w:pPr>
-        <w:spacing w:after="30"/>
-      </w:pPr>
-      <w:r>
-        <w:rPr>
-          <w:sz w:val="19"/>
-          <w:szCs w:val="19"/>
-        </w:rPr>
-        <w:t xml:space="preserve">   [   ]  C)  Se ignora el problema fingiendo que no existe hasta que explote en conflicto</w:t>
-      </w:r>
-    </w:p>
-    <w:p>
-      <w:pPr>
-        <w:spacing w:after="80"/>
-      </w:pPr>
-    </w:p>
-    <w:p>
-      <w:pPr>
-        <w:pStyle w:val="Heading2"/>
-        <w:spacing w:after="80" w:before="200"/>
-      </w:pPr>
-      <w:r>
-        <w:t xml:space="preserve">5. Autoevaluación y Reflexión</w:t>
-      </w:r>
-    </w:p>
-    <w:p>
-      <w:pPr>
-        <w:spacing w:after="60"/>
-      </w:pPr>
-      <w:r>
-        <w:rPr>
-          <w:b/>
-          <w:bCs/>
-        </w:rPr>
-        <w:t xml:space="preserve">¿Cómo sentí mi aprendizaje en esta lección?
-</w:t>
-      </w:r>
-      <w:r>
-        <w:t xml:space="preserve">[   ] Comprendí muy bien y puedo explicarlo.
-[   ] Entendí la mayor parte pero requiero algo de práctica.
-[   ] Necesito revisar la explicación con mi mentor.</w:t>
-      </w:r>
-    </w:p>
-    <w:p>
-      <w:pPr>
-        <w:spacing w:after="150"/>
-      </w:pPr>
-      <w:r>
-        <w:t xml:space="preserve">Lo que más me llamó la atención hoy fue: _____________________________________________________
-_____________________________________________________________________________________</w:t>
       </w:r>
     </w:p>
     <w:p>
@@ -17624,7 +16007,7 @@
                 <w:sz w:val="18"/>
                 <w:szCs w:val="18"/>
               </w:rPr>
-              <w:t xml:space="preserve">Reconocer el consentimiento mutuo, los límites y el autocuidado</w:t>
+              <w:t xml:space="preserve">Reconocer consentimiento mutuo, límites corporales y autocuidado</w:t>
             </w:r>
           </w:p>
         </w:tc>
@@ -18674,7 +17057,7 @@
                 <w:sz w:val="18"/>
                 <w:szCs w:val="18"/>
               </w:rPr>
-              <w:t xml:space="preserve">Mi cuerpo, mis límites | Tu cuerpo, tus límites</w:t>
+              <w:t xml:space="preserve">Límites claros y respeto corporal mutuo</w:t>
             </w:r>
           </w:p>
         </w:tc>
@@ -19185,7 +17568,7 @@
         <w:t xml:space="preserve">Opciones: </w:t>
       </w:r>
       <w:r>
-        <w:t xml:space="preserve">Libre de presiones, informado, específico para la situación y revocable en todo momento | Obligatorio por ley aunque la persona se sienta incómoda | Otorgado una única vez en la vida sin posibilidad de cambiar de opinión</w:t>
+        <w:t xml:space="preserve">Obligatorio por presión del grupo aunque exista incomodidad | Libre de presiones, informado, específico para la situación y revocable en todo momento | Otorgado una única vez en la vida sin posibilidad de cambiar de opinión | Aceptado por temor a perder una amistad o sufrir burlas</w:t>
       </w:r>
     </w:p>
     <w:p>
@@ -19272,7 +17655,7 @@
         <w:t xml:space="preserve">Opciones: </w:t>
       </w:r>
       <w:r>
-        <w:t xml:space="preserve">Expresar con claridad, calma y firmeza las propias decisiones y límites respetando al interlocutor | Imponer la propia voluntad gritando y agrediendo a quien piense distinto | Guardar silencio y aceptar todo lo que los demás exijan para evitar discusiones</w:t>
+        <w:t xml:space="preserve">Expresar con claridad, calma y firmeza las propias decisiones y límites respetando al interlocutor | Imponer la propia voluntad gritando y agrediendo a quien piense distinto | Guardar silencio y aceptar todo lo que los demás exijan para no discutir | Aceptar presiones grupales para evitar el rechazo social</w:t>
       </w:r>
     </w:p>
     <w:p>
@@ -19359,7 +17742,7 @@
         <w:t xml:space="preserve">Opciones: </w:t>
       </w:r>
       <w:r>
-        <w:t xml:space="preserve">Detenerse inmediatamente y respetar su límite sin hacer preguntas ni burlarse | Insistir varias veces más hasta que la persona se acostumbre | Enojarse y decirle que es aburrida frente a todo el grupo</w:t>
+        <w:t xml:space="preserve">Insistir varias veces más hasta que la persona se acostumbre | Enojarse y descalificarla frente a todo el grupo | Detenerse inmediatamente y respetar su límite sin hacer preguntas ni burlarse | Ignorar la petición y continuar argumentando que es solo una broma</w:t>
       </w:r>
     </w:p>
     <w:p>
@@ -19466,7 +17849,7 @@
 </w:t>
       </w:r>
       <w:r>
-        <w:t xml:space="preserve">Opciones: Aceptar su respuesta de inmediato y respetar su decisión sin presionar | Continuar insistiendo hasta que cambie de parecer | Correcta: Aceptar su respuesta de inmediato y respetar su decisión sin presionar
+        <w:t xml:space="preserve">Opciones: Continuar insistiendo hasta que cambie de parecer | Aceptar su respuesta de inmediato y respetar su decisión sin presionar | Burlarse de su decisión con los demás compañeros | Presionarlo mediante amenazas de dejar de ser amigos | Correcta: Aceptar su respuesta de inmediato y respetar su decisión sin presionar
 </w:t>
       </w:r>
       <w:r>
@@ -19538,236 +17921,29 @@
         <w:spacing w:after="150" w:before="400"/>
       </w:pPr>
       <w:r>
-        <w:t xml:space="preserve">SECCIÓN 2: CUADERNILLO DE TRABAJO DEL ESTUDIANTE</w:t>
-      </w:r>
-    </w:p>
-    <w:p>
-      <w:pPr>
-        <w:spacing w:after="150"/>
-      </w:pPr>
-      <w:r>
-        <w:rPr>
-          <w:b/>
-          <w:bCs/>
-          <w:color w:val="0F766E"/>
-          <w:sz w:val="18"/>
-          <w:szCs w:val="18"/>
-        </w:rPr>
-        <w:t xml:space="preserve">STUDIOSIMPLE · ECOSISTEMA EDUCATIVO HOMESCHOOLING</w:t>
-      </w:r>
-    </w:p>
-    <w:tbl>
-      <w:tblPr>
-        <w:tblW w:type="pct" w:w="100%"/>
-        <w:tblBorders>
-          <w:top w:val="single" w:color="auto" w:sz="4"/>
-          <w:left w:val="single" w:color="auto" w:sz="4"/>
-          <w:bottom w:val="single" w:color="auto" w:sz="4"/>
-          <w:right w:val="single" w:color="auto" w:sz="4"/>
-          <w:insideH w:val="single" w:color="auto" w:sz="4"/>
-          <w:insideV w:val="single" w:color="auto" w:sz="4"/>
-        </w:tblBorders>
-      </w:tblPr>
-      <w:tblGrid>
-        <w:gridCol w:w="100"/>
-        <w:gridCol w:w="100"/>
-      </w:tblGrid>
-      <w:tr>
-        <w:tc>
-          <w:tcPr>
-            <w:tcW w:type="pct" w:w="60%"/>
-            <w:shd w:fill="F8FAFC" w:val="clear"/>
-          </w:tcPr>
-          <w:p>
-            <w:pPr>
-              <w:spacing w:after="80" w:before="80"/>
-            </w:pPr>
-            <w:r>
-              <w:rPr>
-                <w:b/>
-                <w:bCs/>
-                <w:sz w:val="18"/>
-                <w:szCs w:val="18"/>
-              </w:rPr>
-              <w:t xml:space="preserve">Nombre del Estudiante: </w:t>
-            </w:r>
-            <w:r>
-              <w:rPr>
-                <w:sz w:val="18"/>
-                <w:szCs w:val="18"/>
-              </w:rPr>
-              <w:t xml:space="preserve">________________________________________</w:t>
-            </w:r>
-          </w:p>
-        </w:tc>
-        <w:tc>
-          <w:tcPr>
-            <w:tcW w:type="pct" w:w="40%"/>
-            <w:shd w:fill="F8FAFC" w:val="clear"/>
-          </w:tcPr>
-          <w:p>
-            <w:pPr>
-              <w:spacing w:after="80" w:before="80"/>
-            </w:pPr>
-            <w:r>
-              <w:rPr>
-                <w:b/>
-                <w:bCs/>
-                <w:sz w:val="18"/>
-                <w:szCs w:val="18"/>
-              </w:rPr>
-              <w:t xml:space="preserve">Fecha: </w:t>
-            </w:r>
-            <w:r>
-              <w:rPr>
-                <w:sz w:val="18"/>
-                <w:szCs w:val="18"/>
-              </w:rPr>
-              <w:t xml:space="preserve">____ / ____ / ________</w:t>
-            </w:r>
-          </w:p>
-        </w:tc>
-      </w:tr>
-      <w:tr>
-        <w:tc>
-          <w:tcPr>
-            <w:tcW w:type="pct" w:w="60%"/>
-            <w:shd w:fill="FFFFFF" w:val="clear"/>
-          </w:tcPr>
-          <w:p>
-            <w:pPr>
-              <w:spacing w:after="80" w:before="80"/>
-            </w:pPr>
-            <w:r>
-              <w:rPr>
-                <w:b/>
-                <w:bCs/>
-                <w:color w:val="334155"/>
-                <w:sz w:val="18"/>
-                <w:szCs w:val="18"/>
-              </w:rPr>
-              <w:t xml:space="preserve">Curso: 7° Básico  |  Asignatura: Ciencias Naturales</w:t>
-            </w:r>
-          </w:p>
-        </w:tc>
-        <w:tc>
-          <w:tcPr>
-            <w:tcW w:type="pct" w:w="40%"/>
-            <w:shd w:fill="FFFFFF" w:val="clear"/>
-          </w:tcPr>
-          <w:p>
-            <w:pPr>
-              <w:spacing w:after="80" w:before="80"/>
-            </w:pPr>
-            <w:r>
-              <w:rPr>
-                <w:b/>
-                <w:bCs/>
-                <w:color w:val="0F766E"/>
-                <w:sz w:val="18"/>
-                <w:szCs w:val="18"/>
-              </w:rPr>
-              <w:t xml:space="preserve">Clase 4: Responsabilidad Individual, Autocuidado y Consentimiento</w:t>
-            </w:r>
-          </w:p>
-        </w:tc>
-      </w:tr>
-    </w:tbl>
-    <w:p>
-      <w:pPr>
-        <w:spacing w:after="120" w:before="200"/>
-      </w:pPr>
-      <w:r>
-        <w:rPr>
-          <w:b/>
-          <w:bCs/>
-          <w:color w:val="1E293B"/>
-        </w:rPr>
-        <w:t xml:space="preserve">Meta de Aprendizaje de Hoy: </w:t>
+        <w:t xml:space="preserve">Clase 5: Mitos, Estereotipos y Convivencia Saludable</w:t>
+      </w:r>
+    </w:p>
+    <w:p>
+      <w:pPr>
+        <w:spacing w:after="200"/>
+      </w:pPr>
+      <w:r>
+        <w:rPr>
+          <w:b/>
+          <w:bCs/>
+        </w:rPr>
+        <w:t xml:space="preserve">Foco didáctico: </w:t>
+      </w:r>
+      <w:r>
+        <w:t xml:space="preserve">Distinguir entre información científica y mitos populares sobre los cambios en la pubertad, comprendiendo que la diversidad de ritmos y la superación de estereotipos son claves para una convivencia armónica.</w:t>
       </w:r>
       <w:r>
         <w:rPr>
           <w:i/>
           <w:iCs/>
         </w:rPr>
-        <w:t xml:space="preserve">Comprender que cada persona es dueña de su propio cuerpo y responsable de sus acciones, reconociendo el consentimiento mutuo y la asertividad como herramientas esenciales de protección y respeto.</w:t>
-      </w:r>
-    </w:p>
-    <w:p>
-      <w:pPr>
-        <w:pStyle w:val="Heading2"/>
-        <w:spacing w:after="80" w:before="200"/>
-      </w:pPr>
-      <w:r>
-        <w:t xml:space="preserve">1. Desafío de Exploración Inicial (Situación Detonante)</w:t>
-      </w:r>
-    </w:p>
-    <w:p>
-      <w:pPr>
-        <w:spacing w:after="100"/>
-      </w:pPr>
-      <w:r>
-        <w:t xml:space="preserve">En un grupo de amigos, varios insisten para que un compañero haga algo peligroso o comparta información privada que lo hace sentir incómodo. El estudiante respira con serenidad y responde con firmeza: 'No, no quiero hacerlo y prefiero que cambiemos de tema'. ¿Qué derecho fundamental y principio de autocuidado está ejerciendo?</w:t>
-      </w:r>
-    </w:p>
-    <w:p>
-      <w:pPr>
-        <w:spacing w:after="60"/>
-      </w:pPr>
-      <w:r>
-        <w:rPr>
-          <w:b/>
-          <w:bCs/>
-          <w:color w:val="64748B"/>
-          <w:sz w:val="18"/>
-          <w:szCs w:val="18"/>
-        </w:rPr>
-        <w:t xml:space="preserve">Registra tu respuesta o deducción inicial en las siguientes líneas:</w:t>
-      </w:r>
-    </w:p>
-    <w:p>
-      <w:pPr>
-        <w:spacing w:after="60"/>
-      </w:pPr>
-      <w:r>
-        <w:t xml:space="preserve">_____________________________________________________________________________________
-_____________________________________________________________________________________
-_____________________________________________________________________________________</w:t>
-      </w:r>
-    </w:p>
-    <w:p>
-      <w:pPr>
-        <w:pStyle w:val="Heading2"/>
-        <w:spacing w:after="80" w:before="200"/>
-      </w:pPr>
-      <w:r>
-        <w:t xml:space="preserve">2. Organizador Gráfico de Aprendizaje</w:t>
-      </w:r>
-    </w:p>
-    <w:p>
-      <w:pPr>
-        <w:spacing w:after="80"/>
-      </w:pPr>
-      <w:r>
-        <w:rPr>
-          <w:i/>
-          <w:iCs/>
-        </w:rPr>
-        <w:t xml:space="preserve">Completa el organizador conceptual con las ideas clave y evidencias analizadas en la clase:</w:t>
-      </w:r>
-    </w:p>
-    <w:p>
-      <w:pPr>
-        <w:spacing w:after="150"/>
-      </w:pPr>
-      <w:r>
-        <w:rPr>
-          <w:i/>
-          <w:iCs/>
-          <w:color w:val="94A3B8"/>
-        </w:rPr>
-        <w:t xml:space="preserve">Espacio para anotaciones o diagrama del estudiante:
-</w:t>
+        <w:t xml:space="preserve"> | Duración: 30 Minutos</w:t>
       </w:r>
     </w:p>
     <w:p>
@@ -19776,12 +17952,27 @@
         <w:spacing w:after="100" w:before="200"/>
       </w:pPr>
       <w:r>
-        <w:t xml:space="preserve">3. Desafíos de Práctica en Cuaderno (Resolución Aplicada)</w:t>
-      </w:r>
-    </w:p>
-    <w:p>
-      <w:pPr>
-        <w:spacing w:after="40" w:before="100"/>
+        <w:t xml:space="preserve">Antes de comenzar (Preparación)</w:t>
+      </w:r>
+    </w:p>
+    <w:p>
+      <w:pPr>
+        <w:spacing w:after="80"/>
+      </w:pPr>
+      <w:r>
+        <w:rPr>
+          <w:b/>
+          <w:bCs/>
+        </w:rPr>
+        <w:t xml:space="preserve">Duración estimada: </w:t>
+      </w:r>
+      <w:r>
+        <w:t xml:space="preserve">30 Minutos</w:t>
+      </w:r>
+    </w:p>
+    <w:p>
+      <w:pPr>
+        <w:spacing w:after="80"/>
       </w:pPr>
       <w:r>
         <w:rPr>
@@ -19789,357 +17980,10 @@
           <w:bCs/>
           <w:color w:val="0F766E"/>
         </w:rPr>
-        <w:t xml:space="preserve">Ejercicio 1 [Caso 1: Negativa asertiva ante presión digital]: </w:t>
-      </w:r>
-      <w:r>
-        <w:t xml:space="preserve">Un grupo de compañeros insiste para que un estudiante comparta una fotografía privada de otra persona o propia. El estudiante se niega con firmeza diciendo que la privacidad debe respetarse. ¿Qué principio de responsabilidad y autocuidado se evidencia?</w:t>
-      </w:r>
-    </w:p>
-    <w:p>
-      <w:pPr>
-        <w:spacing w:after="120"/>
-      </w:pPr>
-      <w:r>
-        <w:t xml:space="preserve">Desarrollo y respuesta:
-_____________________________________________________________________________________
-_____________________________________________________________________________________</w:t>
-      </w:r>
-    </w:p>
-    <w:p>
-      <w:pPr>
-        <w:spacing w:after="40" w:before="100"/>
-      </w:pPr>
-      <w:r>
-        <w:rPr>
-          <w:b/>
-          <w:bCs/>
-          <w:color w:val="0F766E"/>
-        </w:rPr>
-        <w:t xml:space="preserve">Ejercicio 2 [Caso 2: Redes de apoyo ante el acoso]: </w:t>
-      </w:r>
-      <w:r>
-        <w:t xml:space="preserve">Un adolescente nota que una compañera está siendo presionada en los recreos y se siente asustada. ¿Qué acción responsable y solidaria puede realizar para apoyarla?</w:t>
-      </w:r>
-    </w:p>
-    <w:p>
-      <w:pPr>
-        <w:spacing w:after="120"/>
-      </w:pPr>
-      <w:r>
-        <w:t xml:space="preserve">Desarrollo y respuesta:
-_____________________________________________________________________________________
-_____________________________________________________________________________________</w:t>
-      </w:r>
-    </w:p>
-    <w:p>
-      <w:pPr>
-        <w:spacing w:after="40" w:before="100"/>
-      </w:pPr>
-      <w:r>
-        <w:rPr>
-          <w:b/>
-          <w:bCs/>
-          <w:color w:val="0F766E"/>
-        </w:rPr>
-        <w:t xml:space="preserve">Ejercicio 3 [Caso 3: Trabajo en el Cuaderno de Ciencias]: </w:t>
-      </w:r>
-      <w:r>
-        <w:t xml:space="preserve">Abre tu cuaderno de Ciencias Naturales. Escribe el título: 'Mis 3 Reglas de Autocuidado y Consentimiento'. Redacta tres normas personales claras que aplicarás en tu vida diaria para cuidar tu cuerpo, tu privacidad y respetar los límites de los demás.</w:t>
-      </w:r>
-    </w:p>
-    <w:p>
-      <w:pPr>
-        <w:spacing w:after="120"/>
-      </w:pPr>
-      <w:r>
-        <w:t xml:space="preserve">Desarrollo y respuesta:
-_____________________________________________________________________________________
-_____________________________________________________________________________________</w:t>
-      </w:r>
-    </w:p>
-    <w:p>
-      <w:pPr>
-        <w:pStyle w:val="Heading2"/>
-        <w:spacing w:after="100" w:before="200"/>
-      </w:pPr>
-      <w:r>
-        <w:t xml:space="preserve">4. Miniquiz de Autocomprobación (Marca la alternativa correcta)</w:t>
-      </w:r>
-    </w:p>
-    <w:p>
-      <w:pPr>
-        <w:spacing w:after="40" w:before="80"/>
-      </w:pPr>
-      <w:r>
-        <w:rPr>
-          <w:b/>
-          <w:bCs/>
-        </w:rPr>
-        <w:t xml:space="preserve">Pregunta 1: </w:t>
-      </w:r>
-      <w:r>
-        <w:t xml:space="preserve">Para que un consentimiento sea plenamente válido en una relación interpersonal, este debe ser:</w:t>
-      </w:r>
-    </w:p>
-    <w:p>
-      <w:pPr>
-        <w:spacing w:after="30"/>
-      </w:pPr>
-      <w:r>
-        <w:rPr>
-          <w:sz w:val="19"/>
-          <w:szCs w:val="19"/>
-        </w:rPr>
-        <w:t xml:space="preserve">   [   ]  A)  Libre de presiones, informado, específico para la situación y revocable en todo momento</w:t>
-      </w:r>
-    </w:p>
-    <w:p>
-      <w:pPr>
-        <w:spacing w:after="30"/>
-      </w:pPr>
-      <w:r>
-        <w:rPr>
-          <w:sz w:val="19"/>
-          <w:szCs w:val="19"/>
-        </w:rPr>
-        <w:t xml:space="preserve">   [   ]  B)  Obligatorio por ley aunque la persona se sienta incómoda</w:t>
-      </w:r>
-    </w:p>
-    <w:p>
-      <w:pPr>
-        <w:spacing w:after="30"/>
-      </w:pPr>
-      <w:r>
-        <w:rPr>
-          <w:sz w:val="19"/>
-          <w:szCs w:val="19"/>
-        </w:rPr>
-        <w:t xml:space="preserve">   [   ]  C)  Otorgado una única vez en la vida sin posibilidad de cambiar de opinión</w:t>
-      </w:r>
-    </w:p>
-    <w:p>
-      <w:pPr>
-        <w:spacing w:after="80"/>
-      </w:pPr>
-    </w:p>
-    <w:p>
-      <w:pPr>
-        <w:spacing w:after="40" w:before="80"/>
-      </w:pPr>
-      <w:r>
-        <w:rPr>
-          <w:b/>
-          <w:bCs/>
-        </w:rPr>
-        <w:t xml:space="preserve">Pregunta 2: </w:t>
-      </w:r>
-      <w:r>
-        <w:t xml:space="preserve">La comunicación asertiva se define como la habilidad de:</w:t>
-      </w:r>
-    </w:p>
-    <w:p>
-      <w:pPr>
-        <w:spacing w:after="30"/>
-      </w:pPr>
-      <w:r>
-        <w:rPr>
-          <w:sz w:val="19"/>
-          <w:szCs w:val="19"/>
-        </w:rPr>
-        <w:t xml:space="preserve">   [   ]  A)  Expresar con claridad, calma y firmeza las propias decisiones y límites respetando al interlocutor</w:t>
-      </w:r>
-    </w:p>
-    <w:p>
-      <w:pPr>
-        <w:spacing w:after="30"/>
-      </w:pPr>
-      <w:r>
-        <w:rPr>
-          <w:sz w:val="19"/>
-          <w:szCs w:val="19"/>
-        </w:rPr>
-        <w:t xml:space="preserve">   [   ]  B)  Imponer la propia voluntad gritando y agrediendo a quien piense distinto</w:t>
-      </w:r>
-    </w:p>
-    <w:p>
-      <w:pPr>
-        <w:spacing w:after="30"/>
-      </w:pPr>
-      <w:r>
-        <w:rPr>
-          <w:sz w:val="19"/>
-          <w:szCs w:val="19"/>
-        </w:rPr>
-        <w:t xml:space="preserve">   [   ]  C)  Guardar silencio y aceptar todo lo que los demás exijan para evitar discusiones</w:t>
-      </w:r>
-    </w:p>
-    <w:p>
-      <w:pPr>
-        <w:spacing w:after="80"/>
-      </w:pPr>
-    </w:p>
-    <w:p>
-      <w:pPr>
-        <w:spacing w:after="40" w:before="80"/>
-      </w:pPr>
-      <w:r>
-        <w:rPr>
-          <w:b/>
-          <w:bCs/>
-        </w:rPr>
-        <w:t xml:space="preserve">Pregunta 3: </w:t>
-      </w:r>
-      <w:r>
-        <w:t xml:space="preserve">¿Cuál es la conducta adecuada si alguien nos pide que detengamos un juego o contacto físico porque se siente incómodo?</w:t>
-      </w:r>
-    </w:p>
-    <w:p>
-      <w:pPr>
-        <w:spacing w:after="30"/>
-      </w:pPr>
-      <w:r>
-        <w:rPr>
-          <w:sz w:val="19"/>
-          <w:szCs w:val="19"/>
-        </w:rPr>
-        <w:t xml:space="preserve">   [   ]  A)  Detenerse inmediatamente y respetar su límite sin hacer preguntas ni burlarse</w:t>
-      </w:r>
-    </w:p>
-    <w:p>
-      <w:pPr>
-        <w:spacing w:after="30"/>
-      </w:pPr>
-      <w:r>
-        <w:rPr>
-          <w:sz w:val="19"/>
-          <w:szCs w:val="19"/>
-        </w:rPr>
-        <w:t xml:space="preserve">   [   ]  B)  Insistir varias veces más hasta que la persona se acostumbre</w:t>
-      </w:r>
-    </w:p>
-    <w:p>
-      <w:pPr>
-        <w:spacing w:after="30"/>
-      </w:pPr>
-      <w:r>
-        <w:rPr>
-          <w:sz w:val="19"/>
-          <w:szCs w:val="19"/>
-        </w:rPr>
-        <w:t xml:space="preserve">   [   ]  C)  Enojarse y decirle que es aburrida frente a todo el grupo</w:t>
-      </w:r>
-    </w:p>
-    <w:p>
-      <w:pPr>
-        <w:spacing w:after="80"/>
-      </w:pPr>
-    </w:p>
-    <w:p>
-      <w:pPr>
-        <w:pStyle w:val="Heading2"/>
-        <w:spacing w:after="80" w:before="200"/>
-      </w:pPr>
-      <w:r>
-        <w:t xml:space="preserve">5. Autoevaluación y Reflexión</w:t>
-      </w:r>
-    </w:p>
-    <w:p>
-      <w:pPr>
-        <w:spacing w:after="60"/>
-      </w:pPr>
-      <w:r>
-        <w:rPr>
-          <w:b/>
-          <w:bCs/>
-        </w:rPr>
-        <w:t xml:space="preserve">¿Cómo sentí mi aprendizaje en esta lección?
-</w:t>
-      </w:r>
-      <w:r>
-        <w:t xml:space="preserve">[   ] Comprendí muy bien y puedo explicarlo.
-[   ] Entendí la mayor parte pero requiero algo de práctica.
-[   ] Necesito revisar la explicación con mi mentor.</w:t>
-      </w:r>
-    </w:p>
-    <w:p>
-      <w:pPr>
-        <w:spacing w:after="150"/>
-      </w:pPr>
-      <w:r>
-        <w:t xml:space="preserve">Lo que más me llamó la atención hoy fue: _____________________________________________________
-_____________________________________________________________________________________</w:t>
-      </w:r>
-    </w:p>
-    <w:p>
-      <w:pPr>
-        <w:pStyle w:val="Heading1"/>
-        <w:pageBreakBefore/>
-        <w:spacing w:after="150" w:before="400"/>
-      </w:pPr>
-      <w:r>
-        <w:t xml:space="preserve">Clase 5: Mitos, Estereotipos y Convivencia Saludable</w:t>
-      </w:r>
-    </w:p>
-    <w:p>
-      <w:pPr>
-        <w:spacing w:after="200"/>
-      </w:pPr>
-      <w:r>
-        <w:rPr>
-          <w:b/>
-          <w:bCs/>
-        </w:rPr>
-        <w:t xml:space="preserve">Foco didáctico: </w:t>
-      </w:r>
-      <w:r>
-        <w:t xml:space="preserve">Distinguir entre información científica y mitos populares sobre los cambios en la pubertad, comprendiendo que la diversidad de ritmos y la superación de estereotipos son claves para una convivencia armónica.</w:t>
-      </w:r>
-      <w:r>
-        <w:rPr>
-          <w:i/>
-          <w:iCs/>
-        </w:rPr>
-        <w:t xml:space="preserve"> | Duración: 30 Minutos</w:t>
-      </w:r>
-    </w:p>
-    <w:p>
-      <w:pPr>
-        <w:pStyle w:val="Heading2"/>
-        <w:spacing w:after="100" w:before="200"/>
-      </w:pPr>
-      <w:r>
-        <w:t xml:space="preserve">Antes de comenzar (Preparación)</w:t>
-      </w:r>
-    </w:p>
-    <w:p>
-      <w:pPr>
-        <w:spacing w:after="80"/>
-      </w:pPr>
-      <w:r>
-        <w:rPr>
-          <w:b/>
-          <w:bCs/>
-        </w:rPr>
-        <w:t xml:space="preserve">Duración estimada: </w:t>
-      </w:r>
-      <w:r>
-        <w:t xml:space="preserve">30 Minutos</w:t>
-      </w:r>
-    </w:p>
-    <w:p>
-      <w:pPr>
-        <w:spacing w:after="80"/>
-      </w:pPr>
-      <w:r>
-        <w:rPr>
-          <w:b/>
-          <w:bCs/>
-          <w:color w:val="0F766E"/>
-        </w:rPr>
         <w:t xml:space="preserve">Objetivo para el Adulto / Mentor: </w:t>
       </w:r>
       <w:r>
-        <w:t xml:space="preserve">Guiar al estudiante a contrastar mitos y estereotipos sobre la pubertad y la afectividad con la evidencia médica, comprendiendo que el estirón puberal de estatura ocurre normalmente entre los 10 y 16 años según los estadios de maduración de Tanner (1962) y curvas MINEDUC/OMS, y que cada cuerpo sigue su propio ritmo genético sin constituir una anomalía.</w:t>
+        <w:t xml:space="preserve">Guiar al estudiante a contrastar mitos y estereotipos sobre la pubertad y la afectividad con la evidencia médica, comprendiendo que el inicio de la pubertad ocurre entre los 8 y 13 años en niñas y 9 y 14 años en niños (Tanner 1962 / MedlinePlus), mientras que el estirón de estatura es un hito posterior no universal que suele presentarse entre los 10 y 16 años según ritmos genéticos individuales.</w:t>
       </w:r>
     </w:p>
     <w:p>
@@ -21071,7 +18915,7 @@
                 <w:sz w:val="17"/>
                 <w:szCs w:val="17"/>
               </w:rPr>
-              <w:t xml:space="preserve">Campana de distribución: Rango normal de inicio puberal (10 a 14 años) con amplia dispersión saludable</w:t>
+              <w:t xml:space="preserve">Variabilidad del crecimiento: Estirón de estatura con amplia dispersión saludable (Tanner / MedlinePlus)</w:t>
             </w:r>
           </w:p>
         </w:tc>
@@ -21224,7 +19068,7 @@
                 <w:sz w:val="17"/>
                 <w:szCs w:val="17"/>
               </w:rPr>
-              <w:t xml:space="preserve">Modern anime style 16:9 widescreen illustration. Two 13-year-old student explorers, a girl with braided hair and a boy in a teal jacket, examining a bell-curve growth graph demonstrating the natural developmental diversity between ages 10 and 16, with generous negative space for text overlays. No text drawn by AI.</w:t>
+              <w:t xml:space="preserve">Modern anime style 16:9 widescreen illustration. Two 13-year-old student explorers, a girl with braided hair and a boy in a teal jacket, in a modern science classroom observing blank modular panels representing the height growth spurt window (between ages 10 and 16, distinct from earlier pubertal onset), with generous negative space for text overlays. No text drawn by AI.</w:t>
             </w:r>
           </w:p>
           <w:p>
@@ -21267,7 +19111,7 @@
                 <w:sz w:val="18"/>
                 <w:szCs w:val="18"/>
               </w:rPr>
-              <w:t xml:space="preserve">El inicio de la pubertad se extiende normalmente entre los 10 y 16 años. Crecer antes o después no significa tener una enfermedad o deficiencia.</w:t>
+              <w:t xml:space="preserve">El estirón de estatura suele ocurrir como un hito posterior de la pubertad (habitualmente entre los 10 y 16 años según Tanner y MedlinePlus), mientras el inicio puberal ocurre antes (8-13 años en niñas y 9-14 en niños según MedlinePlus). Crecer a ritmos distintos es completamente normal.</w:t>
             </w:r>
           </w:p>
         </w:tc>
@@ -21371,7 +19215,7 @@
                 <w:sz w:val="18"/>
                 <w:szCs w:val="18"/>
               </w:rPr>
-              <w:t xml:space="preserve">La tristeza, el afecto y el valor no tienen género</w:t>
+              <w:t xml:space="preserve">Las emociones y valores no tienen género</w:t>
             </w:r>
           </w:p>
         </w:tc>
@@ -22667,7 +20511,7 @@
                 <w:sz w:val="18"/>
                 <w:szCs w:val="18"/>
               </w:rPr>
-              <w:t xml:space="preserve">Ventana cronológica amplia y saludable</w:t>
+              <w:t xml:space="preserve">Inicio puberal y sus variaciones habituales</w:t>
             </w:r>
           </w:p>
         </w:tc>
@@ -22695,7 +20539,7 @@
                 <w:sz w:val="17"/>
                 <w:szCs w:val="17"/>
               </w:rPr>
-              <w:t xml:space="preserve">Modern anime style 16:9 widescreen illustration. Two 13-year-old student explorers, a girl with braided hair and a boy in a teal jacket, analyzing official growth curves from WHO and MINEDUC on a digital screen showing normal pubertal ranges between 10 and 16 years, with generous negative space for text overlays. No text drawn by AI.</w:t>
+              <w:t xml:space="preserve">Modern anime style 16:9 widescreen illustration. Two 13-year-old student explorers, a girl with braided hair and a boy in a teal jacket, in a modern science laboratory observing blank modular comparison panels on a digital display, with generous negative space for text overlays. No text drawn by AI.</w:t>
             </w:r>
           </w:p>
           <w:p>
@@ -22717,7 +20561,7 @@
                 <w:sz w:val="17"/>
                 <w:szCs w:val="17"/>
               </w:rPr>
-              <w:t xml:space="preserve">Rangos MINEDUC / OMS: Inicio puberal femenino (9-13 años) e inicio puberal masculino (10-14 años)</w:t>
+              <w:t xml:space="preserve">Inicio puberal habitual: 8 a 13 años en niñas y 9 a 14 años en niños (MedlinePlus / OMS)</w:t>
             </w:r>
           </w:p>
         </w:tc>
@@ -22738,7 +20582,7 @@
                 <w:sz w:val="18"/>
                 <w:szCs w:val="18"/>
               </w:rPr>
-              <w:t xml:space="preserve">Las curvas de la OMS y el MINEDUC confirman que la pubertad inicia normalmente entre los 10 y 16 años según factores genéticos y nutricionales.</w:t>
+              <w:t xml:space="preserve">El inicio de la pubertad varía entre personas: suele ocurrir entre los 8 y 13 años en niñas y entre los 9 y 14 en niños según MedlinePlus y la OMS. Este inicio habitual no debe confundirse con el momento del estirón de estatura, que ocurre en etapas posteriores.</w:t>
             </w:r>
           </w:p>
         </w:tc>
@@ -23088,7 +20932,7 @@
                 <w:sz w:val="18"/>
                 <w:szCs w:val="18"/>
               </w:rPr>
-              <w:t xml:space="preserve">Los estereotipos que asignan roles rígidos según el sexo carecen de fundamento científico. La neurociencia confirma que la inteligencia y vocaciones no tienen límites de género.</w:t>
+              <w:t xml:space="preserve">Los estereotipos que asignan roles rígidos carecen de fundamento científico. Los estereotipos sociales no deben limitar los intereses, talentos ni oportunidades de cada estudiante.</w:t>
             </w:r>
           </w:p>
         </w:tc>
@@ -23220,7 +21064,7 @@
                 <w:sz w:val="17"/>
                 <w:szCs w:val="17"/>
               </w:rPr>
-              <w:t xml:space="preserve">Modern anime style 16:9 widescreen illustration. Two 13-year-old student explorers, a girl with braided hair and a boy in a teal jacket, reviewing official pediatric health guides and verified scientific portals on their laptops, calm and reassured, with generous negative space for text overlays. No text drawn by AI.</w:t>
+              <w:t xml:space="preserve">Modern anime style 16:9 widescreen illustration. Two 13-year-old student explorers, a girl with braided hair and a boy in a teal jacket, fostering an inclusive and supportive environment with classmates in a bright classroom, rejecting teasing and body judgment, with generous negative space for text overlays. No text drawn by AI.</w:t>
             </w:r>
           </w:p>
           <w:p>
@@ -23242,7 +21086,7 @@
                 <w:sz w:val="17"/>
                 <w:szCs w:val="17"/>
               </w:rPr>
-              <w:t xml:space="preserve">Mecanismo protector: Validación entre pares + Comunicación asertiva + Intervención temprana docente</w:t>
+              <w:t xml:space="preserve">Mecanismo protector: Validación entre pares + Comunicación asertiva + Cero burlas corporales</w:t>
             </w:r>
           </w:p>
         </w:tc>
@@ -23263,7 +21107,7 @@
                 <w:sz w:val="18"/>
                 <w:szCs w:val="18"/>
               </w:rPr>
-              <w:t xml:space="preserve">La salud puberal requiere hábitos concretos: alimentación balanceada, hidratación, actividad física regular y al menos ocho horas de sueño para la hormona del crecimiento.</w:t>
+              <w:t xml:space="preserve">Las burlas sobre el cuerpo pueden generar inseguridad y aislamiento. Promover un entorno escolar seguro exige empatía, detener los comentarios dañinos y recordar que cada persona vive su desarrollo a su propio ritmo.</w:t>
             </w:r>
           </w:p>
         </w:tc>
@@ -23345,7 +21189,7 @@
                 <w:sz w:val="18"/>
                 <w:szCs w:val="18"/>
               </w:rPr>
-              <w:t xml:space="preserve">Caso Modelado: El mito del estirón simultáneo</w:t>
+              <w:t xml:space="preserve">Caso Modelado: Variabilidad en el crecimiento</w:t>
             </w:r>
           </w:p>
           <w:p>
@@ -23367,7 +21211,7 @@
                 <w:sz w:val="18"/>
                 <w:szCs w:val="18"/>
               </w:rPr>
-              <w:t xml:space="preserve">Descartar anomalías mediante evidencia científica</w:t>
+              <w:t xml:space="preserve">Comprender ritmos diversos sin diagnósticos apresurados</w:t>
             </w:r>
           </w:p>
         </w:tc>
@@ -23417,7 +21261,7 @@
                 <w:sz w:val="17"/>
                 <w:szCs w:val="17"/>
               </w:rPr>
-              <w:t xml:space="preserve">Desglose del caso: Inseguridad por diferencia de estatura a los 13 años -&gt; Contraste con curvas OMS -&gt; Confirmación de desarrollo normal</w:t>
+              <w:t xml:space="preserve">El ritmo de crecimiento es individual; ante dudas o inquietudes, consultar con un adulto de confianza o profesional de salud</w:t>
             </w:r>
           </w:p>
         </w:tc>
@@ -23438,7 +21282,7 @@
                 <w:sz w:val="18"/>
                 <w:szCs w:val="18"/>
               </w:rPr>
-              <w:t xml:space="preserve">Analicemos un caso concreto: un estudiante de 13 años se angustia creyendo erróneamente que tiene una anomalía porque sus compañeros ya crecieron. La evidencia médica demuestra que el estirón puberal responde a relojes genéticos individuales que se manifiestan normalmente entre los 10 y 16 años según los estadios de Tanner (1962) y curvas MINEDUC/OMS.</w:t>
+              <w:t xml:space="preserve">Si un estudiante de 13 años nota que sus compañeros crecen a distinto ritmo, debe recordar que los momentos del estirón varían. Una curva general no diagnostica a una persona; ante cualquier inquietud, lo adecuado es conversarlo con un adulto de confianza o un profesional de salud.</w:t>
             </w:r>
           </w:p>
         </w:tc>
@@ -24038,7 +21882,7 @@
           <w:b/>
           <w:bCs/>
         </w:rPr>
-        <w:t xml:space="preserve">La variabilidad en el inicio de la pubertad (entre los 10 y 16 años) demuestra que:</w:t>
+        <w:t xml:space="preserve">La variabilidad en el inicio habitual de la pubertad (8 a 13 años en niñas y 9 a 14 en niños) demuestra que:</w:t>
       </w:r>
     </w:p>
     <w:p>
@@ -24053,7 +21897,7 @@
         <w:t xml:space="preserve">Opciones: </w:t>
       </w:r>
       <w:r>
-        <w:t xml:space="preserve">Cada organismo tiene un ritmo biológico y genético individual dentro de rangos normales de salud | Quienes comienzan más tarde presentan obligatoriamente una deficiencia nutricional grave | Todos los adolescentes deberían recibir tratamientos hormonales para igualar su estatura</w:t>
+        <w:t xml:space="preserve">Quienes comienzan más tarde presentan obligatoriamente una deficiencia grave | Cada organismo tiene un ritmo biológico y genético individual dentro de rangos normales de salud | Todos los adolescentes deberían recibir tratamientos hormonales para igualar su crecimiento | La estatura final depende exclusivamente de comenzar la pubertad de manera temprana</w:t>
       </w:r>
     </w:p>
     <w:p>
@@ -24105,7 +21949,7 @@
           <w:i/>
           <w:iCs/>
         </w:rPr>
-        <w:t xml:space="preserve">La variabilidad es una característica universal y saludable de la especie humana; los rangos etarios del desarrollo son amplios.</w:t>
+        <w:t xml:space="preserve">La variabilidad cronológica en el inicio puberal es normal y saludable; cada persona tiene su propio ritmo genético.</w:t>
       </w:r>
     </w:p>
     <w:p>
@@ -24125,7 +21969,7 @@
           <w:b/>
           <w:bCs/>
         </w:rPr>
-        <w:t xml:space="preserve">¿Cuál de las siguientes afirmaciones sobre los estereotipos de género es científicamente correcta?</w:t>
+        <w:t xml:space="preserve">¿Cuál de las siguientes afirmaciones sobre los estereotipos sociales de género está respaldada por la ciencia?</w:t>
       </w:r>
     </w:p>
     <w:p>
@@ -24140,7 +21984,7 @@
         <w:t xml:space="preserve">Opciones: </w:t>
       </w:r>
       <w:r>
-        <w:t xml:space="preserve">Son construcciones socioculturales arbitrarias que no corresponden a capacidades biológicas ni intelectuales reales | Son leyes biológicas inmutables determinadas estrictamente por los cromosomas X e Y | Permiten organizar a la sociedad asignando tareas según el potencial cerebral de cada sexo</w:t>
+        <w:t xml:space="preserve">Son leyes biológicas inmutables determinadas estrictamente por los cromosomas | Permiten organizar la sociedad asignando tareas según el potencial cerebral de cada sexo | Los estereotipos sociales no deben limitar los intereses, talentos ni oportunidades de cada estudiante | La neurociencia demuestra que los gustos e intereses están prefijados por el sexo al nacer</w:t>
       </w:r>
     </w:p>
     <w:p>
@@ -24156,7 +22000,7 @@
         <w:t xml:space="preserve">• Respuesta correcta: </w:t>
       </w:r>
       <w:r>
-        <w:t xml:space="preserve">Son construcciones socioculturales arbitrarias que no corresponden a capacidades biológicas ni intelectuales reales</w:t>
+        <w:t xml:space="preserve">Los estereotipos sociales no deben limitar los intereses, talentos ni oportunidades de cada estudiante</w:t>
       </w:r>
     </w:p>
     <w:p>
@@ -24192,7 +22036,7 @@
           <w:i/>
           <w:iCs/>
         </w:rPr>
-        <w:t xml:space="preserve">La neurociencia y la psicología demuestran que las capacidades cognitivas, emocionales y vocacionales son compartidas por igual.</w:t>
+        <w:t xml:space="preserve">Los estereotipos son construcciones culturales arbitrarias; cada estudiante debe desarrollar plenamente sus intereses, talentos y oportunidades.</w:t>
       </w:r>
     </w:p>
     <w:p>
@@ -24227,7 +22071,7 @@
         <w:t xml:space="preserve">Opciones: </w:t>
       </w:r>
       <w:r>
-        <w:t xml:space="preserve">Respetar la apariencia física y los ritmos personales de todos, rechazando apodos y bromas sobre el cuerpo | Reírse de las bromas corporales para demostrar sentido del humor en el grupo | Aconsejar a los compañeros que oculten sus emociones para no mostrar debilidad</w:t>
+        <w:t xml:space="preserve">Reírse de las burlas corporales para demostrar sentido del humor en el grupo | Respetar la apariencia física y los ritmos personales de todos, rechazando apodos y juicios sobre el cuerpo | Aconsejar a los compañeros que oculten sus emociones para no mostrar debilidad | Juzgar a quienes crecen más lento o más rápido que el promedio del curso</w:t>
       </w:r>
     </w:p>
     <w:p>
@@ -24243,7 +22087,7 @@
         <w:t xml:space="preserve">• Respuesta correcta: </w:t>
       </w:r>
       <w:r>
-        <w:t xml:space="preserve">Respetar la apariencia física y los ritmos personales de todos, rechazando apodos y bromas sobre el cuerpo</w:t>
+        <w:t xml:space="preserve">Respetar la apariencia física y los ritmos personales de todos, rechazando apodos y juicios sobre el cuerpo</w:t>
       </w:r>
     </w:p>
     <w:p>
@@ -24334,7 +22178,7 @@
 </w:t>
       </w:r>
       <w:r>
-        <w:t xml:space="preserve">Opciones: No, porque la diversidad de ritmos y tiempos es completamente normal en la pubertad | Sí, porque todos los seres humanos sanos deben crecer exactamente la misma cantidad de centímetros al mes | Correcta: No, porque la diversidad de ritmos y tiempos es completamente normal en la pubertad
+        <w:t xml:space="preserve">Opciones: Sí, porque todos los seres humanos deben crecer exactamente la misma cantidad de centímetros al mes | No, porque la diversidad de ritmos y tiempos es normal; ante dudas se consulta a un profesional de salud | Sí, porque las diferencias de estatura indican una anomalía biológica inmediata | Sí, porque el estirón debe ocurrir exactamente en la misma fecha en todos los adolescentes | Correcta: No, porque la diversidad de ritmos y tiempos es normal; ante dudas se consulta a un profesional de salud
 </w:t>
       </w:r>
       <w:r>
@@ -24406,236 +22250,29 @@
         <w:spacing w:after="150" w:before="400"/>
       </w:pPr>
       <w:r>
-        <w:t xml:space="preserve">SECCIÓN 2: CUADERNILLO DE TRABAJO DEL ESTUDIANTE</w:t>
-      </w:r>
-    </w:p>
-    <w:p>
-      <w:pPr>
-        <w:spacing w:after="150"/>
-      </w:pPr>
-      <w:r>
-        <w:rPr>
-          <w:b/>
-          <w:bCs/>
-          <w:color w:val="0F766E"/>
-          <w:sz w:val="18"/>
-          <w:szCs w:val="18"/>
-        </w:rPr>
-        <w:t xml:space="preserve">STUDIOSIMPLE · ECOSISTEMA EDUCATIVO HOMESCHOOLING</w:t>
-      </w:r>
-    </w:p>
-    <w:tbl>
-      <w:tblPr>
-        <w:tblW w:type="pct" w:w="100%"/>
-        <w:tblBorders>
-          <w:top w:val="single" w:color="auto" w:sz="4"/>
-          <w:left w:val="single" w:color="auto" w:sz="4"/>
-          <w:bottom w:val="single" w:color="auto" w:sz="4"/>
-          <w:right w:val="single" w:color="auto" w:sz="4"/>
-          <w:insideH w:val="single" w:color="auto" w:sz="4"/>
-          <w:insideV w:val="single" w:color="auto" w:sz="4"/>
-        </w:tblBorders>
-      </w:tblPr>
-      <w:tblGrid>
-        <w:gridCol w:w="100"/>
-        <w:gridCol w:w="100"/>
-      </w:tblGrid>
-      <w:tr>
-        <w:tc>
-          <w:tcPr>
-            <w:tcW w:type="pct" w:w="60%"/>
-            <w:shd w:fill="F8FAFC" w:val="clear"/>
-          </w:tcPr>
-          <w:p>
-            <w:pPr>
-              <w:spacing w:after="80" w:before="80"/>
-            </w:pPr>
-            <w:r>
-              <w:rPr>
-                <w:b/>
-                <w:bCs/>
-                <w:sz w:val="18"/>
-                <w:szCs w:val="18"/>
-              </w:rPr>
-              <w:t xml:space="preserve">Nombre del Estudiante: </w:t>
-            </w:r>
-            <w:r>
-              <w:rPr>
-                <w:sz w:val="18"/>
-                <w:szCs w:val="18"/>
-              </w:rPr>
-              <w:t xml:space="preserve">________________________________________</w:t>
-            </w:r>
-          </w:p>
-        </w:tc>
-        <w:tc>
-          <w:tcPr>
-            <w:tcW w:type="pct" w:w="40%"/>
-            <w:shd w:fill="F8FAFC" w:val="clear"/>
-          </w:tcPr>
-          <w:p>
-            <w:pPr>
-              <w:spacing w:after="80" w:before="80"/>
-            </w:pPr>
-            <w:r>
-              <w:rPr>
-                <w:b/>
-                <w:bCs/>
-                <w:sz w:val="18"/>
-                <w:szCs w:val="18"/>
-              </w:rPr>
-              <w:t xml:space="preserve">Fecha: </w:t>
-            </w:r>
-            <w:r>
-              <w:rPr>
-                <w:sz w:val="18"/>
-                <w:szCs w:val="18"/>
-              </w:rPr>
-              <w:t xml:space="preserve">____ / ____ / ________</w:t>
-            </w:r>
-          </w:p>
-        </w:tc>
-      </w:tr>
-      <w:tr>
-        <w:tc>
-          <w:tcPr>
-            <w:tcW w:type="pct" w:w="60%"/>
-            <w:shd w:fill="FFFFFF" w:val="clear"/>
-          </w:tcPr>
-          <w:p>
-            <w:pPr>
-              <w:spacing w:after="80" w:before="80"/>
-            </w:pPr>
-            <w:r>
-              <w:rPr>
-                <w:b/>
-                <w:bCs/>
-                <w:color w:val="334155"/>
-                <w:sz w:val="18"/>
-                <w:szCs w:val="18"/>
-              </w:rPr>
-              <w:t xml:space="preserve">Curso: 7° Básico  |  Asignatura: Ciencias Naturales</w:t>
-            </w:r>
-          </w:p>
-        </w:tc>
-        <w:tc>
-          <w:tcPr>
-            <w:tcW w:type="pct" w:w="40%"/>
-            <w:shd w:fill="FFFFFF" w:val="clear"/>
-          </w:tcPr>
-          <w:p>
-            <w:pPr>
-              <w:spacing w:after="80" w:before="80"/>
-            </w:pPr>
-            <w:r>
-              <w:rPr>
-                <w:b/>
-                <w:bCs/>
-                <w:color w:val="0F766E"/>
-                <w:sz w:val="18"/>
-                <w:szCs w:val="18"/>
-              </w:rPr>
-              <w:t xml:space="preserve">Clase 5: Mitos, Estereotipos y Convivencia Saludable</w:t>
-            </w:r>
-          </w:p>
-        </w:tc>
-      </w:tr>
-    </w:tbl>
-    <w:p>
-      <w:pPr>
-        <w:spacing w:after="120" w:before="200"/>
-      </w:pPr>
-      <w:r>
-        <w:rPr>
-          <w:b/>
-          <w:bCs/>
-          <w:color w:val="1E293B"/>
-        </w:rPr>
-        <w:t xml:space="preserve">Meta de Aprendizaje de Hoy: </w:t>
+        <w:t xml:space="preserve">Clase 6: Síntesis Integral y Evaluación Tipo Examen Libre</w:t>
+      </w:r>
+    </w:p>
+    <w:p>
+      <w:pPr>
+        <w:spacing w:after="200"/>
+      </w:pPr>
+      <w:r>
+        <w:rPr>
+          <w:b/>
+          <w:bCs/>
+        </w:rPr>
+        <w:t xml:space="preserve">Foco didáctico: </w:t>
+      </w:r>
+      <w:r>
+        <w:t xml:space="preserve">Integrar todos los conceptos del OA 1 de Ciencias Naturales y demostrar maestría al resolver reactivos de evaluación formal de cuatro alternativas con estándar MINEDUC.</w:t>
       </w:r>
       <w:r>
         <w:rPr>
           <w:i/>
           <w:iCs/>
         </w:rPr>
-        <w:t xml:space="preserve">Distinguir entre información científica y mitos populares sobre los cambios en la pubertad, comprendiendo que la diversidad de ritmos y la superación de estereotipos son claves para una convivencia armónica.</w:t>
-      </w:r>
-    </w:p>
-    <w:p>
-      <w:pPr>
-        <w:pStyle w:val="Heading2"/>
-        <w:spacing w:after="80" w:before="200"/>
-      </w:pPr>
-      <w:r>
-        <w:t xml:space="preserve">1. Desafío de Exploración Inicial (Situación Detonante)</w:t>
-      </w:r>
-    </w:p>
-    <w:p>
-      <w:pPr>
-        <w:spacing w:after="100"/>
-      </w:pPr>
-      <w:r>
-        <w:t xml:space="preserve">En el patio de un colegio, un estudiante se burla de otro porque todavía no le cambia la voz ni ha pegado el 'estirón', diciéndole que se quedó 'atrasado'. El estudiante afectado se siente triste y avergonzado. Si aplicamos el conocimiento científico sobre la pubertad, ¿por qué esa burla se basa en una creencia completamente falsa e ignorante?</w:t>
-      </w:r>
-    </w:p>
-    <w:p>
-      <w:pPr>
-        <w:spacing w:after="60"/>
-      </w:pPr>
-      <w:r>
-        <w:rPr>
-          <w:b/>
-          <w:bCs/>
-          <w:color w:val="64748B"/>
-          <w:sz w:val="18"/>
-          <w:szCs w:val="18"/>
-        </w:rPr>
-        <w:t xml:space="preserve">Registra tu respuesta o deducción inicial en las siguientes líneas:</w:t>
-      </w:r>
-    </w:p>
-    <w:p>
-      <w:pPr>
-        <w:spacing w:after="60"/>
-      </w:pPr>
-      <w:r>
-        <w:t xml:space="preserve">_____________________________________________________________________________________
-_____________________________________________________________________________________
-_____________________________________________________________________________________</w:t>
-      </w:r>
-    </w:p>
-    <w:p>
-      <w:pPr>
-        <w:pStyle w:val="Heading2"/>
-        <w:spacing w:after="80" w:before="200"/>
-      </w:pPr>
-      <w:r>
-        <w:t xml:space="preserve">2. Organizador Gráfico de Aprendizaje</w:t>
-      </w:r>
-    </w:p>
-    <w:p>
-      <w:pPr>
-        <w:spacing w:after="80"/>
-      </w:pPr>
-      <w:r>
-        <w:rPr>
-          <w:i/>
-          <w:iCs/>
-        </w:rPr>
-        <w:t xml:space="preserve">Completa el organizador conceptual con las ideas clave y evidencias analizadas en la clase:</w:t>
-      </w:r>
-    </w:p>
-    <w:p>
-      <w:pPr>
-        <w:spacing w:after="150"/>
-      </w:pPr>
-      <w:r>
-        <w:rPr>
-          <w:i/>
-          <w:iCs/>
-          <w:color w:val="94A3B8"/>
-        </w:rPr>
-        <w:t xml:space="preserve">Espacio para anotaciones o diagrama del estudiante:
-</w:t>
+        <w:t xml:space="preserve"> | Duración: 30 Minutos</w:t>
       </w:r>
     </w:p>
     <w:p>
@@ -24644,12 +22281,27 @@
         <w:spacing w:after="100" w:before="200"/>
       </w:pPr>
       <w:r>
-        <w:t xml:space="preserve">3. Desafíos de Práctica en Cuaderno (Resolución Aplicada)</w:t>
-      </w:r>
-    </w:p>
-    <w:p>
-      <w:pPr>
-        <w:spacing w:after="40" w:before="100"/>
+        <w:t xml:space="preserve">Antes de comenzar (Preparación)</w:t>
+      </w:r>
+    </w:p>
+    <w:p>
+      <w:pPr>
+        <w:spacing w:after="80"/>
+      </w:pPr>
+      <w:r>
+        <w:rPr>
+          <w:b/>
+          <w:bCs/>
+        </w:rPr>
+        <w:t xml:space="preserve">Duración estimada: </w:t>
+      </w:r>
+      <w:r>
+        <w:t xml:space="preserve">30 Minutos</w:t>
+      </w:r>
+    </w:p>
+    <w:p>
+      <w:pPr>
+        <w:spacing w:after="80"/>
       </w:pPr>
       <w:r>
         <w:rPr>
@@ -24657,25 +22309,15 @@
           <w:bCs/>
           <w:color w:val="0F766E"/>
         </w:rPr>
-        <w:t xml:space="preserve">Ejercicio 1 [Caso 1: El mito del estirón puberal simultáneo]: </w:t>
-      </w:r>
-      <w:r>
-        <w:t xml:space="preserve">Un estudiante de 13 años siente angustia porque varios compañeros ya tuvieron el estirón puberal y él aún no, creyendo erróneamente que tiene un problema de salud o no crecerá. ¿Qué evidencia científica y biológica desmiente este mito y cómo debe explicarse?</w:t>
-      </w:r>
-    </w:p>
-    <w:p>
-      <w:pPr>
-        <w:spacing w:after="120"/>
-      </w:pPr>
-      <w:r>
-        <w:t xml:space="preserve">Desarrollo y respuesta:
-_____________________________________________________________________________________
-_____________________________________________________________________________________</w:t>
-      </w:r>
-    </w:p>
-    <w:p>
-      <w:pPr>
-        <w:spacing w:after="40" w:before="100"/>
+        <w:t xml:space="preserve">Objetivo para el Adulto / Mentor: </w:t>
+      </w:r>
+      <w:r>
+        <w:t xml:space="preserve">Evaluar de manera formativa e integral el dominio de los objetivos del OA 1 de Ciencias Naturales (sexualidad como dimensión integral, caracteres sexuales, anatomía y fisiología reproductora, autocuidado y discernimiento ético) bajo el formato de Exámenes Libres del MINEDUC.</w:t>
+      </w:r>
+    </w:p>
+    <w:p>
+      <w:pPr>
+        <w:spacing w:after="80"/>
       </w:pPr>
       <w:r>
         <w:rPr>
@@ -24683,46 +22325,26 @@
           <w:bCs/>
           <w:color w:val="0F766E"/>
         </w:rPr>
-        <w:t xml:space="preserve">Ejercicio 2 [Caso 2: Superación de estereotipos en el aula]: </w:t>
-      </w:r>
-      <w:r>
-        <w:t xml:space="preserve">En una clase de tecnología y robótica, un grupo afirma que los puestos de programación son solo para hombres y que las mujeres deberían dedicarse solo a la decoración del proyecto. ¿Por qué esta afirmación es un estereotipo sin fundamento y qué impacto negativo genera?</w:t>
-      </w:r>
-    </w:p>
-    <w:p>
-      <w:pPr>
-        <w:spacing w:after="120"/>
-      </w:pPr>
-      <w:r>
-        <w:t xml:space="preserve">Desarrollo y respuesta:
-_____________________________________________________________________________________
-_____________________________________________________________________________________</w:t>
-      </w:r>
-    </w:p>
-    <w:p>
-      <w:pPr>
-        <w:spacing w:after="40" w:before="100"/>
-      </w:pPr>
-      <w:r>
-        <w:rPr>
-          <w:b/>
-          <w:bCs/>
-          <w:color w:val="0F766E"/>
-        </w:rPr>
-        <w:t xml:space="preserve">Ejercicio 3 [Caso 3: Trabajo en el Cuaderno de Ciencias]: </w:t>
-      </w:r>
-      <w:r>
-        <w:t xml:space="preserve">Abre tu cuaderno de Ciencias Naturales. Traza una tabla de dos columnas con el encabezado: 'Mito Popular vs Realidad Científica'. Escribe al menos dos mitos frecuentes sobre el cuerpo adolescente y su correspondiente refutación basada en la biología y la salud integral.</w:t>
-      </w:r>
-    </w:p>
-    <w:p>
-      <w:pPr>
-        <w:spacing w:after="120"/>
-      </w:pPr>
-      <w:r>
-        <w:t xml:space="preserve">Desarrollo y respuesta:
-_____________________________________________________________________________________
-_____________________________________________________________________________________</w:t>
+        <w:t xml:space="preserve">Clima Emocional y Acogida: </w:t>
+      </w:r>
+      <w:r>
+        <w:t xml:space="preserve">La serenidad y la lectura pausada son las mejores herramientas de un estudiante preparado. Confía en tu razonamiento.</w:t>
+      </w:r>
+    </w:p>
+    <w:p>
+      <w:pPr>
+        <w:spacing w:after="160"/>
+      </w:pPr>
+      <w:r>
+        <w:rPr>
+          <w:b/>
+          <w:bCs/>
+          <w:color w:val="8B5CF6"/>
+        </w:rPr>
+        <w:t xml:space="preserve">Ruta de Hoy (Itinerario de la Sesión): </w:t>
+      </w:r>
+      <w:r>
+        <w:t xml:space="preserve">Consolidar los aprendizajes del OA 1 mediante el análisis de reactivos psicométricos de cuatro alternativas, aplicando estrategias de descarte y justificación científica rigurosa.</w:t>
       </w:r>
     </w:p>
     <w:p>
@@ -24731,184 +22353,7 @@
         <w:spacing w:after="100" w:before="200"/>
       </w:pPr>
       <w:r>
-        <w:t xml:space="preserve">4. Miniquiz de Autocomprobación (Marca la alternativa correcta)</w:t>
-      </w:r>
-    </w:p>
-    <w:p>
-      <w:pPr>
-        <w:spacing w:after="40" w:before="80"/>
-      </w:pPr>
-      <w:r>
-        <w:rPr>
-          <w:b/>
-          <w:bCs/>
-        </w:rPr>
-        <w:t xml:space="preserve">Pregunta 1: </w:t>
-      </w:r>
-      <w:r>
-        <w:t xml:space="preserve">La variabilidad en el inicio de la pubertad (entre los 10 y 16 años) demuestra que:</w:t>
-      </w:r>
-    </w:p>
-    <w:p>
-      <w:pPr>
-        <w:spacing w:after="30"/>
-      </w:pPr>
-      <w:r>
-        <w:rPr>
-          <w:sz w:val="19"/>
-          <w:szCs w:val="19"/>
-        </w:rPr>
-        <w:t xml:space="preserve">   [   ]  A)  Cada organismo tiene un ritmo biológico y genético individual dentro de rangos normales de salud</w:t>
-      </w:r>
-    </w:p>
-    <w:p>
-      <w:pPr>
-        <w:spacing w:after="30"/>
-      </w:pPr>
-      <w:r>
-        <w:rPr>
-          <w:sz w:val="19"/>
-          <w:szCs w:val="19"/>
-        </w:rPr>
-        <w:t xml:space="preserve">   [   ]  B)  Quienes comienzan más tarde presentan obligatoriamente una deficiencia nutricional grave</w:t>
-      </w:r>
-    </w:p>
-    <w:p>
-      <w:pPr>
-        <w:spacing w:after="30"/>
-      </w:pPr>
-      <w:r>
-        <w:rPr>
-          <w:sz w:val="19"/>
-          <w:szCs w:val="19"/>
-        </w:rPr>
-        <w:t xml:space="preserve">   [   ]  C)  Todos los adolescentes deberían recibir tratamientos hormonales para igualar su estatura</w:t>
-      </w:r>
-    </w:p>
-    <w:p>
-      <w:pPr>
-        <w:spacing w:after="80"/>
-      </w:pPr>
-    </w:p>
-    <w:p>
-      <w:pPr>
-        <w:spacing w:after="40" w:before="80"/>
-      </w:pPr>
-      <w:r>
-        <w:rPr>
-          <w:b/>
-          <w:bCs/>
-        </w:rPr>
-        <w:t xml:space="preserve">Pregunta 2: </w:t>
-      </w:r>
-      <w:r>
-        <w:t xml:space="preserve">¿Cuál de las siguientes afirmaciones sobre los estereotipos de género es científicamente correcta?</w:t>
-      </w:r>
-    </w:p>
-    <w:p>
-      <w:pPr>
-        <w:spacing w:after="30"/>
-      </w:pPr>
-      <w:r>
-        <w:rPr>
-          <w:sz w:val="19"/>
-          <w:szCs w:val="19"/>
-        </w:rPr>
-        <w:t xml:space="preserve">   [   ]  A)  Son construcciones socioculturales arbitrarias que no corresponden a capacidades biológicas ni intelectuales reales</w:t>
-      </w:r>
-    </w:p>
-    <w:p>
-      <w:pPr>
-        <w:spacing w:after="30"/>
-      </w:pPr>
-      <w:r>
-        <w:rPr>
-          <w:sz w:val="19"/>
-          <w:szCs w:val="19"/>
-        </w:rPr>
-        <w:t xml:space="preserve">   [   ]  B)  Son leyes biológicas inmutables determinadas estrictamente por los cromosomas X e Y</w:t>
-      </w:r>
-    </w:p>
-    <w:p>
-      <w:pPr>
-        <w:spacing w:after="30"/>
-      </w:pPr>
-      <w:r>
-        <w:rPr>
-          <w:sz w:val="19"/>
-          <w:szCs w:val="19"/>
-        </w:rPr>
-        <w:t xml:space="preserve">   [   ]  C)  Permiten organizar a la sociedad asignando tareas según el potencial cerebral de cada sexo</w:t>
-      </w:r>
-    </w:p>
-    <w:p>
-      <w:pPr>
-        <w:spacing w:after="80"/>
-      </w:pPr>
-    </w:p>
-    <w:p>
-      <w:pPr>
-        <w:spacing w:after="40" w:before="80"/>
-      </w:pPr>
-      <w:r>
-        <w:rPr>
-          <w:b/>
-          <w:bCs/>
-        </w:rPr>
-        <w:t xml:space="preserve">Pregunta 3: </w:t>
-      </w:r>
-      <w:r>
-        <w:t xml:space="preserve">Una actitud que promueve activamente una convivencia saludable en la escuela es:</w:t>
-      </w:r>
-    </w:p>
-    <w:p>
-      <w:pPr>
-        <w:spacing w:after="30"/>
-      </w:pPr>
-      <w:r>
-        <w:rPr>
-          <w:sz w:val="19"/>
-          <w:szCs w:val="19"/>
-        </w:rPr>
-        <w:t xml:space="preserve">   [   ]  A)  Respetar la apariencia física y los ritmos personales de todos, rechazando apodos y bromas sobre el cuerpo</w:t>
-      </w:r>
-    </w:p>
-    <w:p>
-      <w:pPr>
-        <w:spacing w:after="30"/>
-      </w:pPr>
-      <w:r>
-        <w:rPr>
-          <w:sz w:val="19"/>
-          <w:szCs w:val="19"/>
-        </w:rPr>
-        <w:t xml:space="preserve">   [   ]  B)  Reírse de las bromas corporales para demostrar sentido del humor en el grupo</w:t>
-      </w:r>
-    </w:p>
-    <w:p>
-      <w:pPr>
-        <w:spacing w:after="30"/>
-      </w:pPr>
-      <w:r>
-        <w:rPr>
-          <w:sz w:val="19"/>
-          <w:szCs w:val="19"/>
-        </w:rPr>
-        <w:t xml:space="preserve">   [   ]  C)  Aconsejar a los compañeros que oculten sus emociones para no mostrar debilidad</w:t>
-      </w:r>
-    </w:p>
-    <w:p>
-      <w:pPr>
-        <w:spacing w:after="80"/>
-      </w:pPr>
-    </w:p>
-    <w:p>
-      <w:pPr>
-        <w:pStyle w:val="Heading2"/>
-        <w:spacing w:after="80" w:before="200"/>
-      </w:pPr>
-      <w:r>
-        <w:t xml:space="preserve">5. Autoevaluación y Reflexión</w:t>
+        <w:t xml:space="preserve">Paso 1: Inicio (Ruta de la Asignatura, La Clase de Hoy y Situación Inicial)</w:t>
       </w:r>
     </w:p>
     <w:p>
@@ -24919,136 +22364,12 @@
         <w:rPr>
           <w:b/>
           <w:bCs/>
-        </w:rPr>
-        <w:t xml:space="preserve">¿Cómo sentí mi aprendizaje en esta lección?
-</w:t>
-      </w:r>
-      <w:r>
-        <w:t xml:space="preserve">[   ] Comprendí muy bien y puedo explicarlo.
-[   ] Entendí la mayor parte pero requiero algo de práctica.
-[   ] Necesito revisar la explicación con mi mentor.</w:t>
-      </w:r>
-    </w:p>
-    <w:p>
-      <w:pPr>
-        <w:spacing w:after="150"/>
-      </w:pPr>
-      <w:r>
-        <w:t xml:space="preserve">Lo que más me llamó la atención hoy fue: _____________________________________________________
-_____________________________________________________________________________________</w:t>
-      </w:r>
-    </w:p>
-    <w:p>
-      <w:pPr>
-        <w:pStyle w:val="Heading1"/>
-        <w:pageBreakBefore/>
-        <w:spacing w:after="150" w:before="400"/>
-      </w:pPr>
-      <w:r>
-        <w:t xml:space="preserve">Clase 6: Síntesis Integral y Evaluación Tipo Examen Libre</w:t>
-      </w:r>
-    </w:p>
-    <w:p>
-      <w:pPr>
-        <w:spacing w:after="200"/>
-      </w:pPr>
-      <w:r>
-        <w:rPr>
-          <w:b/>
-          <w:bCs/>
-        </w:rPr>
-        <w:t xml:space="preserve">Foco didáctico: </w:t>
-      </w:r>
-      <w:r>
-        <w:t xml:space="preserve">Integrar todos los conceptos del OA 1 de Ciencias Naturales y demostrar maestría al resolver reactivos de evaluación formal de cuatro alternativas con estándar MINEDUC.</w:t>
-      </w:r>
-      <w:r>
-        <w:rPr>
-          <w:i/>
-          <w:iCs/>
-        </w:rPr>
-        <w:t xml:space="preserve"> | Duración: 30 Minutos</w:t>
-      </w:r>
-    </w:p>
-    <w:p>
-      <w:pPr>
-        <w:pStyle w:val="Heading2"/>
-        <w:spacing w:after="100" w:before="200"/>
-      </w:pPr>
-      <w:r>
-        <w:t xml:space="preserve">Antes de comenzar (Preparación)</w:t>
-      </w:r>
-    </w:p>
-    <w:p>
-      <w:pPr>
-        <w:spacing w:after="80"/>
-      </w:pPr>
-      <w:r>
-        <w:rPr>
-          <w:b/>
-          <w:bCs/>
-        </w:rPr>
-        <w:t xml:space="preserve">Duración estimada: </w:t>
-      </w:r>
-      <w:r>
-        <w:t xml:space="preserve">30 Minutos</w:t>
-      </w:r>
-    </w:p>
-    <w:p>
-      <w:pPr>
-        <w:spacing w:after="80"/>
-      </w:pPr>
-      <w:r>
-        <w:rPr>
-          <w:b/>
-          <w:bCs/>
-          <w:color w:val="0F766E"/>
-        </w:rPr>
-        <w:t xml:space="preserve">Objetivo para el Adulto / Mentor: </w:t>
-      </w:r>
-      <w:r>
-        <w:t xml:space="preserve">Evaluar de manera formativa e integral el dominio de los objetivos del OA 1 de Ciencias Naturales (sexualidad como dimensión integral, caracteres sexuales, anatomía y fisiología reproductora, autocuidado y discernimiento ético) bajo el formato de Exámenes Libres del MINEDUC.</w:t>
-      </w:r>
-    </w:p>
-    <w:p>
-      <w:pPr>
-        <w:spacing w:after="80"/>
-      </w:pPr>
-      <w:r>
-        <w:rPr>
-          <w:b/>
-          <w:bCs/>
-          <w:color w:val="0F766E"/>
-        </w:rPr>
-        <w:t xml:space="preserve">Clima Emocional y Acogida: </w:t>
-      </w:r>
-      <w:r>
-        <w:t xml:space="preserve">La serenidad y la lectura pausada son las mejores herramientas de un estudiante preparado. Confía en tu razonamiento.</w:t>
-      </w:r>
-    </w:p>
-    <w:p>
-      <w:pPr>
-        <w:spacing w:after="160"/>
-      </w:pPr>
-      <w:r>
-        <w:rPr>
-          <w:b/>
-          <w:bCs/>
-          <w:color w:val="8B5CF6"/>
-        </w:rPr>
-        <w:t xml:space="preserve">Ruta de Hoy (Itinerario de la Sesión): </w:t>
-      </w:r>
-      <w:r>
-        <w:t xml:space="preserve">Consolidar los aprendizajes del OA 1 mediante el análisis de reactivos psicométricos de cuatro alternativas, aplicando estrategias de descarte y justificación científica rigurosa.</w:t>
-      </w:r>
-    </w:p>
-    <w:p>
-      <w:pPr>
-        <w:pStyle w:val="Heading2"/>
-        <w:spacing w:after="100" w:before="200"/>
-      </w:pPr>
-      <w:r>
-        <w:t xml:space="preserve">Paso 1: Inicio (Ruta de la Asignatura, La Clase de Hoy y Situación Inicial)</w:t>
+          <w:color w:val="1E293B"/>
+        </w:rPr>
+        <w:t xml:space="preserve">Sub-etapa 1 · Nuestra Ruta de la Asignatura: </w:t>
+      </w:r>
+      <w:r>
+        <w:t xml:space="preserve">Hoy culminamos la unidad de Sexualidad y Afectividad con la sexta clase: 'Síntesis Integral y Evaluación Tipo Examen Libre'.</w:t>
       </w:r>
     </w:p>
     <w:p>
@@ -25059,27 +22380,11 @@
         <w:rPr>
           <w:b/>
           <w:bCs/>
-          <w:color w:val="1E293B"/>
-        </w:rPr>
-        <w:t xml:space="preserve">Sub-etapa 1 · Nuestra Ruta de la Asignatura: </w:t>
-      </w:r>
-      <w:r>
-        <w:t xml:space="preserve">Hoy culminamos la unidad de Sexualidad y Afectividad con la sexta clase: 'Síntesis Integral y Evaluación Tipo Examen Libre'.</w:t>
-      </w:r>
-    </w:p>
-    <w:p>
-      <w:pPr>
-        <w:spacing w:after="60"/>
-      </w:pPr>
-      <w:r>
-        <w:rPr>
-          <w:b/>
-          <w:bCs/>
         </w:rPr>
         <w:t xml:space="preserve">• Los 4 Bloques Temáticos: </w:t>
       </w:r>
       <w:r>
-        <w:t xml:space="preserve">01: Ciencias Naturales (Síntesis Curricular OA 1) | 02: Ensayo Oficial MINEDUC (Estrategia de Selección Múltiple) | 03: Práctica (Ítems Formales y Justificación en Cuaderno) | 04: Evaluación (Simulador de Examen Libre y Cierre)</w:t>
+        <w:t xml:space="preserve">01: Ciencias Naturales (Síntesis Curricular OA 1) | 02: Ensayo Formativo Tipo Examen Libre (Estrategia de Selección Múltiple) | 03: Práctica (Ítems Formales y Justificación en Cuaderno) | 04: Evaluación (Simulador de Examen Libre y Cierre)</w:t>
       </w:r>
     </w:p>
     <w:p>
@@ -25269,7 +22574,7 @@
         <w:t xml:space="preserve">• [RESPUESTA ESPERADA]: </w:t>
       </w:r>
       <w:r>
-        <w:t xml:space="preserve">Porque las Bases Curriculares y el Texto del Estudiante de Ciencias Naturales 7° Básico MINEDUC (pág. 16) definen la sexualidad como un fenómeno integral constituido por cuatro dimensiones inseparables (biológica, afectiva, social y ética), por lo que reducirla solo a lo físico es incompleto y erróneo.</w:t>
+        <w:t xml:space="preserve">Porque la sexualidad humana se organiza didácticamente en cuatro dimensiones fundamentales (biológica, afectiva, social y ética) para estructurar los aspectos curriculares del OA 1 y los valores de respeto mutuo, por lo que reducirla solo a lo biológico resulta incompleto y erróneo.</w:t>
       </w:r>
     </w:p>
     <w:p>
@@ -25917,7 +23222,7 @@
                 <w:sz w:val="17"/>
                 <w:szCs w:val="17"/>
               </w:rPr>
-              <w:t xml:space="preserve">Modern anime style 16:9 widescreen illustration. Two 13-year-old student explorers, a girl with braided hair and a boy in a teal jacket, in a high-tech science examination hall, with clean multiple-choice options A, B, C, D softly illuminated in cyan, with generous negative space for text overlays. No text drawn by AI.</w:t>
+              <w:t xml:space="preserve">Modern anime style 16:9 widescreen illustration. Two 13-year-old student explorers, a girl with braided hair and a boy in a teal jacket, in a high-tech science examination hall, with four clean blank modular rectangular panels softly illuminated in cyan, with generous negative space for text overlays. No text drawn by AI.</w:t>
             </w:r>
           </w:p>
           <w:p>
@@ -25960,7 +23265,7 @@
                 <w:sz w:val="18"/>
                 <w:szCs w:val="18"/>
               </w:rPr>
-              <w:t xml:space="preserve">La sexualidad es una vivencia integral que articula las dimensiones biológica, afectiva, social y ética, según el Texto Oficial MINEDUC (pág. 16).</w:t>
+              <w:t xml:space="preserve">La sexualidad es una vivencia integral organizada didácticamente en las dimensiones biológica, afectiva, social y ética, articulando el currículum de Ciencias Naturales con valores de respeto y responsabilidad.</w:t>
             </w:r>
           </w:p>
         </w:tc>
@@ -25997,7 +23302,7 @@
                 <w:sz w:val="18"/>
                 <w:szCs w:val="18"/>
               </w:rPr>
-              <w:t xml:space="preserve">Anatomía de una Pregunta Oficial</w:t>
+              <w:t xml:space="preserve">Anatomía del Reactivo de Selección Múltiple</w:t>
             </w:r>
           </w:p>
           <w:p>
@@ -26042,7 +23347,7 @@
                 <w:sz w:val="18"/>
                 <w:szCs w:val="18"/>
               </w:rPr>
-              <w:t xml:space="preserve">Desarmando el reactivo oficial</w:t>
+              <w:t xml:space="preserve">Desarmando el reactivo de práctica</w:t>
             </w:r>
           </w:p>
           <w:p>
@@ -26617,7 +23922,7 @@
                 <w:sz w:val="17"/>
                 <w:szCs w:val="17"/>
               </w:rPr>
-              <w:t xml:space="preserve">Modern anime style 16:9 widescreen illustration. Two 13-year-old student explorers, a girl with braided hair and a boy in a teal jacket, analyzing an official MINEDUC growth percentile chart demonstrating normal developmental tracks between 10 and 16 years, with generous negative space for text overlays. No text drawn by AI.</w:t>
+              <w:t xml:space="preserve">Modern anime style 16:9 widescreen illustration. Two 13-year-old student explorers, a girl with braided hair and a boy in a teal jacket, analyzing a medical growth percentile chart demonstrating healthy pubertal development, with generous negative space for text overlays. No text drawn by AI.</w:t>
             </w:r>
           </w:p>
           <w:p>
@@ -26660,7 +23965,7 @@
                 <w:sz w:val="18"/>
                 <w:szCs w:val="18"/>
               </w:rPr>
-              <w:t xml:space="preserve">Derribamos mitos sobre el crecimiento adolescente, fundamentando que la variabilidad entre los 10 y 16 años es un hecho biológico normal.</w:t>
+              <w:t xml:space="preserve">Derribamos mitos sobre el crecimiento adolescente, fundamentando que la variabilidad en el inicio puberal y en el estirón de estatura es un hecho biológico respaldado por la medicina.</w:t>
             </w:r>
           </w:p>
         </w:tc>
@@ -26863,7 +24168,7 @@
         <w:t xml:space="preserve">Contexto de Apertura Socrática: </w:t>
       </w:r>
       <w:r>
-        <w:t xml:space="preserve">Analizaremos en profundidad la estructura psicométrica de un reactivo oficial de 4 alternativas y modelaremos su resolución fundamentada.</w:t>
+        <w:t xml:space="preserve">Analizaremos en profundidad la estructura psicométrica de un reactivo de práctica de 4 alternativas y modelaremos su resolución fundamentada.</w:t>
       </w:r>
     </w:p>
     <w:p>
@@ -26894,7 +24199,7 @@
         <w:t xml:space="preserve">• Respuesta esperada: </w:t>
       </w:r>
       <w:r>
-        <w:t xml:space="preserve">Porque las preguntas oficiales plantean casos nuevos y situaciones aplicadas; memorizar palabras sueltas impide razonar cuando el contexto cambia.</w:t>
+        <w:t xml:space="preserve">Porque las evaluaciones tipo Examen Libre plantean casos nuevos y situaciones aplicadas; memorizar palabras sueltas impide razonar cuando el contexto cambia.</w:t>
       </w:r>
       <w:r>
         <w:rPr>
@@ -27069,7 +24374,7 @@
         <w:t xml:space="preserve">[DILE antes de la explicación]: </w:t>
       </w:r>
       <w:r>
-        <w:t xml:space="preserve">A continuación formalizaremos la técnica de resolución de ítems oficiales y analizaremos un caso modelado idéntico al primer desafío de tu práctica.</w:t>
+        <w:t xml:space="preserve">A continuación formalizaremos la técnica de resolución de reactivos de práctica tipo Examen Libre y analizaremos un caso modelado idéntico al primer desafío de tu práctica.</w:t>
       </w:r>
     </w:p>
     <w:p>
@@ -27388,7 +24693,7 @@
                 <w:sz w:val="17"/>
                 <w:szCs w:val="17"/>
               </w:rPr>
-              <w:t xml:space="preserve">Modern anime style 16:9 widescreen illustration. Two 13-year-old student explorers, a girl with braided hair and a boy in a teal jacket, standing before an exam review board showing an official MINEDUC multiple-choice item with options A, B, C, D clearly laid out, with generous negative space for text overlays. No text drawn by AI.</w:t>
+              <w:t xml:space="preserve">Modern anime style 16:9 widescreen illustration. Two 13-year-old student explorers, a girl with braided hair and a boy in a teal jacket, standing before an interactive evaluation board displaying four blank choice panels in a clean modular layout, with generous negative space for text overlays. No text drawn by AI.</w:t>
             </w:r>
           </w:p>
           <w:p>
@@ -27431,7 +24736,7 @@
                 <w:sz w:val="18"/>
                 <w:szCs w:val="18"/>
               </w:rPr>
-              <w:t xml:space="preserve">El objetivo de la lección es integrar los contenidos de sexualidad y pubertad, aplicando el análisis riguroso para resolver reactivos psicométricos tipo Examen Libre MINEDUC.</w:t>
+              <w:t xml:space="preserve">El objetivo de la lección es integrar los contenidos de sexualidad y pubertad, aplicando el análisis riguroso para resolver reactivos psicométricos de práctica tipo Examen Libre.</w:t>
             </w:r>
           </w:p>
         </w:tc>
@@ -27563,7 +24868,7 @@
                 <w:sz w:val="17"/>
                 <w:szCs w:val="17"/>
               </w:rPr>
-              <w:t xml:space="preserve">Modern anime style 16:9 widescreen illustration. Two 13-year-old student explorers, a girl with braided hair and a boy in a teal jacket, pointing at the correct option B on the screen, highlighted by a subtle green aura of valid scientific evidence, with generous negative space for text overlays. No text drawn by AI.</w:t>
+              <w:t xml:space="preserve">Modern anime style 16:9 widescreen illustration. Two 13-year-old student explorers, a girl with braided hair and a boy in a teal jacket, examining a three-category diagram of typical exam distractors: factual errors, biological reductionism, and sweeping generalizations, with generous negative space for text overlays. No text drawn by AI.</w:t>
             </w:r>
           </w:p>
           <w:p>
@@ -27606,7 +24911,7 @@
                 <w:sz w:val="18"/>
                 <w:szCs w:val="18"/>
               </w:rPr>
-              <w:t xml:space="preserve">El análisis de reactivos formales exige leer con atención el enunciado e identificar la variable disciplinaria central antes de revisar las alternativas de respuesta.</w:t>
+              <w:t xml:space="preserve">En las preguntas de ciencias encontramos tres tipos comunes de distractores: el error fáctico con datos falsos, el reduccionismo que olvida lo afectivo o social, y las generalizaciones absolutas sin respaldo.</w:t>
             </w:r>
           </w:p>
         </w:tc>
@@ -27738,7 +25043,7 @@
                 <w:sz w:val="17"/>
                 <w:szCs w:val="17"/>
               </w:rPr>
-              <w:t xml:space="preserve">Modern anime style 16:9 widescreen illustration. Two 13-year-old student explorers, a girl with braided hair and a boy in a teal jacket, demonstrating the systematic discard of distractors A, C, and D with clinical reasoning on a digital display, with generous negative space for text overlays. No text drawn by AI.</w:t>
+              <w:t xml:space="preserve">Modern anime style 16:9 widescreen illustration. Two 13-year-old student explorers, a girl with braided hair and a boy in a teal jacket, analyzing an exam question prompt on a digital display, highlighting the core verb and key scientific conditions, with generous negative space for text overlays. No text drawn by AI.</w:t>
             </w:r>
           </w:p>
           <w:p>
@@ -27781,7 +25086,7 @@
                 <w:sz w:val="18"/>
                 <w:szCs w:val="18"/>
               </w:rPr>
-              <w:t xml:space="preserve">El método de resolución descarta sistemáticamente distractores que presenten reduccionismos biológicos, afirmaciones absolutas falsas o confusiones conceptuales.</w:t>
+              <w:t xml:space="preserve">El primer paso consiste en leer el enunciado para aislar la pregunta central: identificamos el sujeto del caso, la situación descrita y el verbo rector que define la tarea científica pedida.</w:t>
             </w:r>
           </w:p>
         </w:tc>
@@ -27913,7 +25218,7 @@
                 <w:sz w:val="17"/>
                 <w:szCs w:val="17"/>
               </w:rPr>
-              <w:t xml:space="preserve">Modern anime style 16:9 widescreen illustration. Two 13-year-old student explorers, a girl with braided hair and a boy in a teal jacket, standing beside four solid pillars representing dimensions, pubertal hormones, consent, and scientific evidence, with generous negative space for text overlays. No text drawn by AI.</w:t>
+              <w:t xml:space="preserve">Modern anime style 16:9 widescreen illustration. Two 13-year-old student explorers, a girl with braided hair and a boy in a teal jacket, methodically evaluating four blank interactive choice cards against scientific criteria on a test review board, with generous negative space for text overlays. No text drawn by AI.</w:t>
             </w:r>
           </w:p>
           <w:p>
@@ -27956,7 +25261,7 @@
                 <w:sz w:val="18"/>
                 <w:szCs w:val="18"/>
               </w:rPr>
-              <w:t xml:space="preserve">La justificación de la clave correcta debe articular la evidencia biológica con las dimensiones afectivas y éticas aprobadas en las Bases Curriculares nacionales.</w:t>
+              <w:t xml:space="preserve">En el segundo paso evaluamos críticamente cada alternativa: revisamos las opciones A, B, C y D una por una, comprobando si contienen errores fácticos, si son incompletas o si cumplen todas las condiciones científicas del enunciado.</w:t>
             </w:r>
           </w:p>
         </w:tc>
@@ -28088,7 +25393,7 @@
                 <w:sz w:val="17"/>
                 <w:szCs w:val="17"/>
               </w:rPr>
-              <w:t xml:space="preserve">Modern anime style 16:9 widescreen illustration. Two 13-year-old student explorers, a girl with braided hair and a boy in a teal jacket, reviewing an official bubble answer sheet on their study desk, calm and confident with plenty of time, with generous negative space for text overlays. No text drawn by AI.</w:t>
+              <w:t xml:space="preserve">Modern anime style 16:9 widescreen illustration. Two 13-year-old student explorers, a girl with braided hair and a boy in a teal jacket, reviewing a four-option response grid on their study desk, calm and confident with plenty of time, with generous negative space for text overlays. No text drawn by AI.</w:t>
             </w:r>
           </w:p>
           <w:p>
@@ -28131,7 +25436,7 @@
                 <w:sz w:val="18"/>
                 <w:szCs w:val="18"/>
               </w:rPr>
-              <w:t xml:space="preserve">La gestión del tiempo en la evaluación formal requiere calma y seguridad: fundamentar cada elección en conceptos científicos estudiados en el cuaderno.</w:t>
+              <w:t xml:space="preserve">En el tercer paso seleccionamos la respuesta correcta asegurándonos de que sea completa y autosuficiente: debe responder directamente a lo preguntado, tener coherencia con el marco curricular del MINEDUC y carecer de contradicciones científicas.</w:t>
             </w:r>
           </w:p>
         </w:tc>
@@ -28168,7 +25473,7 @@
                 <w:sz w:val="18"/>
                 <w:szCs w:val="18"/>
               </w:rPr>
-              <w:t xml:space="preserve">Caso Modelado: Pregunta Oficial de 4 Alternativas</w:t>
+              <w:t xml:space="preserve">Caso Modelado: Reactivo de Práctica de 4 Alternativas</w:t>
             </w:r>
           </w:p>
           <w:p>
@@ -28213,7 +25518,7 @@
                 <w:sz w:val="18"/>
                 <w:szCs w:val="18"/>
               </w:rPr>
-              <w:t xml:space="preserve">Caso Modelado: Multidimensionalidad de la sexualidad</w:t>
+              <w:t xml:space="preserve">Caso Modelado: Reactivo de Práctica</w:t>
             </w:r>
           </w:p>
           <w:p>
@@ -28235,7 +25540,7 @@
                 <w:sz w:val="18"/>
                 <w:szCs w:val="18"/>
               </w:rPr>
-              <w:t xml:space="preserve">Análisis y descarte psicométrico de 4 alternativas</w:t>
+              <w:t xml:space="preserve">Análisis y descarte de 4 alternativas</w:t>
             </w:r>
           </w:p>
         </w:tc>
@@ -28263,7 +25568,7 @@
                 <w:sz w:val="17"/>
                 <w:szCs w:val="17"/>
               </w:rPr>
-              <w:t xml:space="preserve">Modern anime style 16:9 widescreen illustration. Two 13-year-old student explorers, a girl with braided hair and a boy in a teal jacket, analyzing an official four-choice exam card on their desk, comparing reasoning notes before selecting option B, with generous negative space for text overlays. No text drawn by AI.</w:t>
+              <w:t xml:space="preserve">Modern anime style 16:9 widescreen illustration. Two 13-year-old student explorers, a girl with braided hair and a boy in a teal jacket, analyzing a four-choice blank test card on their desk, comparing reasoning notes before selecting the correct option, with generous negative space for text overlays. No text drawn by AI.</w:t>
             </w:r>
           </w:p>
           <w:p>
@@ -28306,7 +25611,7 @@
                 <w:sz w:val="18"/>
                 <w:szCs w:val="18"/>
               </w:rPr>
-              <w:t xml:space="preserve">Analicemos un reactivo didáctico elaborado según estándar MINEDUC: un estudiante afirma que la sexualidad se limita exclusivamente a órganos y procreación. A partir del Texto Oficial MINEDUC (pág. 16), ¿cuál opción refuta dicha postura? La opción B es correcta porque establece que la sexualidad es una dimensión integral que une lo biológico, afectivo, social y ético durante toda la vida.</w:t>
+              <w:t xml:space="preserve">Analicemos un reactivo de práctica elaborado para esta clase según el estándar de 7° Básico: un estudiante afirma que la sexualidad se limita exclusivamente a órganos y procreación. A partir del Texto Escolar Ciencias Naturales 7° Básico Edición SM (Unidad 1, pág. 16), la opción B es correcta porque establece que la sexualidad se organiza didácticamente en cuatro dimensiones fundamentales: biológica, afectiva, social y ética.</w:t>
             </w:r>
           </w:p>
         </w:tc>
@@ -28514,7 +25819,7 @@
       <w:r>
         <w:t xml:space="preserve">A continuación se presenta un reactivo didáctico elaborado según estándar MINEDUC para 7° Básico:
 'Durante una clase de Ciencias Naturales, los estudiantes debaten sobre la sexualidad humana. Uno de ellos afirma que la sexualidad se limita exclusivamente a los procesos biológicos de maduración de los órganos reproductores y a la capacidad de procrear.'
-A partir de las Bases Curriculares y el Texto Oficial de Ciencias Naturales (pág. 16), ¿cuál de las siguientes opciones refuta con mayor precisión científica y pedagógica dicha afirmación?
+A partir del enfoque de Ciencias Naturales 7° Básico (Texto del Estudiante Edición SM, pág. 16), ¿cuál de las siguientes opciones refuta con mayor precisión científica y pedagógica dicha afirmación?
 A) La afirmación es correcta porque las hormonas y los caracteres sexuales primarios son las únicas variables medibles empíricamente.
 B) La afirmación es incompleta porque la sexualidad humana es una dimensión integral que involucra aspectos biológicos, afectivos, sociales y éticos a lo largo de toda la vida.
 C) La afirmación es incorrecta porque la sexualidad solo comienza en la adultez cuando se forman vínculos legales formales.
@@ -28646,12 +25951,12 @@
           <w:b/>
           <w:bCs/>
         </w:rPr>
-        <w:t xml:space="preserve">Ejercicio 1 (Caso 1: Reactivo didáctico de selección múltiple (Estándar MINEDUC)): </w:t>
+        <w:t xml:space="preserve">Ejercicio 1 (Caso 1: Reactivo de práctica elaborado para esta clase): </w:t>
       </w:r>
       <w:r>
         <w:t xml:space="preserve">A continuación se presenta un reactivo didáctico elaborado según estándar MINEDUC para 7° Básico:
 'Durante una clase de Ciencias Naturales, los estudiantes debaten sobre la sexualidad humana. Uno de ellos afirma que la sexualidad se limita exclusivamente a los procesos biológicos de maduración de los órganos reproductores y a la capacidad de procrear.'
-A partir de las Bases Curriculares y el Texto Oficial de Ciencias Naturales (pág. 16), ¿cuál de las siguientes opciones refuta con mayor precisión científica y pedagógica dicha afirmación?
+A partir del enfoque de Ciencias Naturales 7° Básico (Texto del Estudiante Edición SM, pág. 16), ¿cuál de las siguientes opciones refuta con mayor precisión científica y pedagógica dicha afirmación?
 A) La afirmación es correcta porque las hormonas y los caracteres sexuales primarios son las únicas variables medibles empíricamente.
 B) La afirmación es incompleta porque la sexualidad humana es una dimensión integral que involucra aspectos biológicos, afectivos, sociales y éticos a lo largo de toda la vida.
 C) La afirmación es incorrecta porque la sexualidad solo comienza en la adultez cuando se forman vínculos legales formales.
@@ -28813,7 +26118,7 @@
         <w:t xml:space="preserve">Estrategia para Pensar: </w:t>
       </w:r>
       <w:r>
-        <w:t xml:space="preserve">1. 1 · Visión Holística del OA 1: La sexualidad humana articula de forma inseparable las dimensiones biológica, afectiva, social y ética durante toda la existencia. · 2. 2 · Fisiología, Autocuidado y Consentimiento: Comprender la función hormonal, respetar los límites corporales y ejercer la asertividad garantizan una vida sana y segura. · 3. 3 · Éxito en Evaluaciones Oficiales: El análisis crítico de los enunciados y el descarte metódico de distractores permiten resolver con solidez los Exámenes Libres del MINEDUC.</w:t>
+        <w:t xml:space="preserve">1. 1 · Visión Holística del OA 1: La sexualidad humana articula de forma inseparable las dimensiones biológica, afectiva, social y ética durante toda la existencia. · 2. 2 · Fisiología, Autocuidado y Consentimiento: Comprender la función hormonal, respetar los límites corporales y ejercer la asertividad garantizan una vida sana y segura. · 3. 3 · Éxito en Evaluaciones Oficiales: El análisis crítico de los enunciados y el descarte metódico de distractores permiten resolver con solidez las evaluaciones tipo Examen Libre del MINEDUC.</w:t>
       </w:r>
     </w:p>
     <w:p>
@@ -28871,7 +26176,7 @@
         <w:t xml:space="preserve">   • 3 · Éxito en Evaluaciones Oficiales: </w:t>
       </w:r>
       <w:r>
-        <w:t xml:space="preserve">El análisis crítico de los enunciados y el descarte metódico de distractores permiten resolver con solidez los Exámenes Libres del MINEDUC.</w:t>
+        <w:t xml:space="preserve">El análisis crítico de los enunciados y el descarte metódico de distractores permiten resolver con solidez las evaluaciones tipo Examen Libre del MINEDUC.</w:t>
       </w:r>
     </w:p>
     <w:p>
@@ -29171,7 +26476,7 @@
           <w:i/>
           <w:iCs/>
         </w:rPr>
-        <w:t xml:space="preserve">La variabilidad cronológica en el inicio puberal (entre 8-13 años en niñas y 9-14 en niños según Tanner 1962 y MINEDUC) es una característica biológica normal.</w:t>
+        <w:t xml:space="preserve">La variabilidad cronológica en el inicio puberal (entre 8-13 años en niñas y 9-14 en niños según Tanner 1962, MedlinePlus y MINEDUC) y en el estirón de estatura posterior es una característica biológica normal.</w:t>
       </w:r>
     </w:p>
     <w:p>
@@ -29207,10 +26512,10 @@
           <w:b/>
           <w:bCs/>
         </w:rPr>
-        <w:t xml:space="preserve">Ítem de Recuperación 1 (Recuperación: El Enfoque Integral del MINEDUC): </w:t>
-      </w:r>
-      <w:r>
-        <w:t xml:space="preserve">¿Qué dimensiones integran la sexualidad humana de acuerdo a las Bases Curriculares y el Texto Oficial (pág. 16)?</w:t>
+        <w:t xml:space="preserve">Ítem de Recuperación 1 (Recuperación: El Enfoque Integral de la Sexualidad): </w:t>
+      </w:r>
+      <w:r>
+        <w:t xml:space="preserve">¿Qué dimensiones articulan didácticamente la sexualidad humana como organizador de esta unidad (Edición SM, pág. 16)?</w:t>
       </w:r>
     </w:p>
     <w:p>
@@ -29222,11 +26527,11 @@
           <w:i/>
           <w:iCs/>
         </w:rPr>
-        <w:t xml:space="preserve">Explicación previa: El Ministerio de Educación de Chile enfatiza que la sexualidad no es únicamente un fenómeno de órganos y hormonas. Comprende cómo nos sentimos, cómo nos relacionamos con los demás, nuestros valores éticos y el respeto por los derechos humanos de cada individuo (Texto Oficial pág. 16).
+        <w:t xml:space="preserve">Explicación previa: El enfoque formativo enfatiza que la sexualidad no es únicamente un fenómeno de órganos y hormonas. Comprende cómo nos sentimos, cómo nos relacionamos con los demás, nuestros valores éticos y el respeto por los derechos humanos de cada individuo (Texto del Estudiante Edición SM, pág. 16).
 </w:t>
       </w:r>
       <w:r>
-        <w:t xml:space="preserve">Opciones: Biológica, afectiva, social y ética a lo largo de toda la vida | Únicamente la dimensión biológica y la reproducción en la etapa adulta | Correcta: Biológica, afectiva, social y ética a lo largo de toda la vida
+        <w:t xml:space="preserve">Opciones: Únicamente la dimensión biológica y la reproducción en la etapa adulta | Biológica, afectiva, social y ética a lo largo de toda la vida | Exclusivamente la dimensión económica y laboral | Solamente los cambios anatómicos visibles en la adolescencia | Correcta: Biológica, afectiva, social y ética a lo largo de toda la vida
 </w:t>
       </w:r>
       <w:r>
@@ -29289,593 +26594,6 @@
       </w:r>
       <w:r>
         <w:t xml:space="preserve">¡Felicitaciones! Has completado con éxito la unidad completa del OA 1 de Ciencias Naturales de 7° Básico.</w:t>
-      </w:r>
-    </w:p>
-    <w:p>
-      <w:pPr>
-        <w:pStyle w:val="Heading1"/>
-        <w:pageBreakBefore/>
-        <w:spacing w:after="150" w:before="400"/>
-      </w:pPr>
-      <w:r>
-        <w:t xml:space="preserve">SECCIÓN 2: CUADERNILLO DE TRABAJO DEL ESTUDIANTE</w:t>
-      </w:r>
-    </w:p>
-    <w:p>
-      <w:pPr>
-        <w:spacing w:after="150"/>
-      </w:pPr>
-      <w:r>
-        <w:rPr>
-          <w:b/>
-          <w:bCs/>
-          <w:color w:val="0F766E"/>
-          <w:sz w:val="18"/>
-          <w:szCs w:val="18"/>
-        </w:rPr>
-        <w:t xml:space="preserve">STUDIOSIMPLE · ECOSISTEMA EDUCATIVO HOMESCHOOLING</w:t>
-      </w:r>
-    </w:p>
-    <w:tbl>
-      <w:tblPr>
-        <w:tblW w:type="pct" w:w="100%"/>
-        <w:tblBorders>
-          <w:top w:val="single" w:color="auto" w:sz="4"/>
-          <w:left w:val="single" w:color="auto" w:sz="4"/>
-          <w:bottom w:val="single" w:color="auto" w:sz="4"/>
-          <w:right w:val="single" w:color="auto" w:sz="4"/>
-          <w:insideH w:val="single" w:color="auto" w:sz="4"/>
-          <w:insideV w:val="single" w:color="auto" w:sz="4"/>
-        </w:tblBorders>
-      </w:tblPr>
-      <w:tblGrid>
-        <w:gridCol w:w="100"/>
-        <w:gridCol w:w="100"/>
-      </w:tblGrid>
-      <w:tr>
-        <w:tc>
-          <w:tcPr>
-            <w:tcW w:type="pct" w:w="60%"/>
-            <w:shd w:fill="F8FAFC" w:val="clear"/>
-          </w:tcPr>
-          <w:p>
-            <w:pPr>
-              <w:spacing w:after="80" w:before="80"/>
-            </w:pPr>
-            <w:r>
-              <w:rPr>
-                <w:b/>
-                <w:bCs/>
-                <w:sz w:val="18"/>
-                <w:szCs w:val="18"/>
-              </w:rPr>
-              <w:t xml:space="preserve">Nombre del Estudiante: </w:t>
-            </w:r>
-            <w:r>
-              <w:rPr>
-                <w:sz w:val="18"/>
-                <w:szCs w:val="18"/>
-              </w:rPr>
-              <w:t xml:space="preserve">________________________________________</w:t>
-            </w:r>
-          </w:p>
-        </w:tc>
-        <w:tc>
-          <w:tcPr>
-            <w:tcW w:type="pct" w:w="40%"/>
-            <w:shd w:fill="F8FAFC" w:val="clear"/>
-          </w:tcPr>
-          <w:p>
-            <w:pPr>
-              <w:spacing w:after="80" w:before="80"/>
-            </w:pPr>
-            <w:r>
-              <w:rPr>
-                <w:b/>
-                <w:bCs/>
-                <w:sz w:val="18"/>
-                <w:szCs w:val="18"/>
-              </w:rPr>
-              <w:t xml:space="preserve">Fecha: </w:t>
-            </w:r>
-            <w:r>
-              <w:rPr>
-                <w:sz w:val="18"/>
-                <w:szCs w:val="18"/>
-              </w:rPr>
-              <w:t xml:space="preserve">____ / ____ / ________</w:t>
-            </w:r>
-          </w:p>
-        </w:tc>
-      </w:tr>
-      <w:tr>
-        <w:tc>
-          <w:tcPr>
-            <w:tcW w:type="pct" w:w="60%"/>
-            <w:shd w:fill="FFFFFF" w:val="clear"/>
-          </w:tcPr>
-          <w:p>
-            <w:pPr>
-              <w:spacing w:after="80" w:before="80"/>
-            </w:pPr>
-            <w:r>
-              <w:rPr>
-                <w:b/>
-                <w:bCs/>
-                <w:color w:val="334155"/>
-                <w:sz w:val="18"/>
-                <w:szCs w:val="18"/>
-              </w:rPr>
-              <w:t xml:space="preserve">Curso: 7° Básico  |  Asignatura: Ciencias Naturales</w:t>
-            </w:r>
-          </w:p>
-        </w:tc>
-        <w:tc>
-          <w:tcPr>
-            <w:tcW w:type="pct" w:w="40%"/>
-            <w:shd w:fill="FFFFFF" w:val="clear"/>
-          </w:tcPr>
-          <w:p>
-            <w:pPr>
-              <w:spacing w:after="80" w:before="80"/>
-            </w:pPr>
-            <w:r>
-              <w:rPr>
-                <w:b/>
-                <w:bCs/>
-                <w:color w:val="0F766E"/>
-                <w:sz w:val="18"/>
-                <w:szCs w:val="18"/>
-              </w:rPr>
-              <w:t xml:space="preserve">Clase 6: Síntesis Integral y Evaluación Tipo Examen Libre</w:t>
-            </w:r>
-          </w:p>
-        </w:tc>
-      </w:tr>
-    </w:tbl>
-    <w:p>
-      <w:pPr>
-        <w:spacing w:after="120" w:before="200"/>
-      </w:pPr>
-      <w:r>
-        <w:rPr>
-          <w:b/>
-          <w:bCs/>
-          <w:color w:val="1E293B"/>
-        </w:rPr>
-        <w:t xml:space="preserve">Meta de Aprendizaje de Hoy: </w:t>
-      </w:r>
-      <w:r>
-        <w:rPr>
-          <w:i/>
-          <w:iCs/>
-        </w:rPr>
-        <w:t xml:space="preserve">Integrar todos los conceptos del OA 1 de Ciencias Naturales y demostrar maestría al resolver reactivos de evaluación formal de cuatro alternativas con estándar MINEDUC.</w:t>
-      </w:r>
-    </w:p>
-    <w:p>
-      <w:pPr>
-        <w:pStyle w:val="Heading2"/>
-        <w:spacing w:after="80" w:before="200"/>
-      </w:pPr>
-      <w:r>
-        <w:t xml:space="preserve">1. Desafío de Exploración Inicial (Situación Detonante)</w:t>
-      </w:r>
-    </w:p>
-    <w:p>
-      <w:pPr>
-        <w:spacing w:after="100"/>
-      </w:pPr>
-      <w:r>
-        <w:t xml:space="preserve">Imagina que estás frente al cuadernillo oficial del Examen Libre de Ciencias Naturales. Te encuentras con una pregunta que describe una situación cotidiana y te ofrece cuatro alternativas muy parecidas entre sí. ¿Qué método sistemático debes emplear para evitar caer en trampas o distractores y seleccionar la respuesta correcta?</w:t>
-      </w:r>
-    </w:p>
-    <w:p>
-      <w:pPr>
-        <w:spacing w:after="60"/>
-      </w:pPr>
-      <w:r>
-        <w:rPr>
-          <w:b/>
-          <w:bCs/>
-          <w:color w:val="64748B"/>
-          <w:sz w:val="18"/>
-          <w:szCs w:val="18"/>
-        </w:rPr>
-        <w:t xml:space="preserve">Registra tu respuesta o deducción inicial en las siguientes líneas:</w:t>
-      </w:r>
-    </w:p>
-    <w:p>
-      <w:pPr>
-        <w:spacing w:after="60"/>
-      </w:pPr>
-      <w:r>
-        <w:t xml:space="preserve">_____________________________________________________________________________________
-_____________________________________________________________________________________
-_____________________________________________________________________________________</w:t>
-      </w:r>
-    </w:p>
-    <w:p>
-      <w:pPr>
-        <w:pStyle w:val="Heading2"/>
-        <w:spacing w:after="80" w:before="200"/>
-      </w:pPr>
-      <w:r>
-        <w:t xml:space="preserve">2. Organizador Gráfico de Aprendizaje</w:t>
-      </w:r>
-    </w:p>
-    <w:p>
-      <w:pPr>
-        <w:spacing w:after="80"/>
-      </w:pPr>
-      <w:r>
-        <w:rPr>
-          <w:i/>
-          <w:iCs/>
-        </w:rPr>
-        <w:t xml:space="preserve">Completa el organizador conceptual con las ideas clave y evidencias analizadas en la clase:</w:t>
-      </w:r>
-    </w:p>
-    <w:p>
-      <w:pPr>
-        <w:spacing w:after="150"/>
-      </w:pPr>
-      <w:r>
-        <w:rPr>
-          <w:i/>
-          <w:iCs/>
-          <w:color w:val="94A3B8"/>
-        </w:rPr>
-        <w:t xml:space="preserve">Espacio para anotaciones o diagrama del estudiante:
-</w:t>
-      </w:r>
-    </w:p>
-    <w:p>
-      <w:pPr>
-        <w:pStyle w:val="Heading2"/>
-        <w:spacing w:after="100" w:before="200"/>
-      </w:pPr>
-      <w:r>
-        <w:t xml:space="preserve">3. Desafíos de Práctica en Cuaderno (Resolución Aplicada)</w:t>
-      </w:r>
-    </w:p>
-    <w:p>
-      <w:pPr>
-        <w:spacing w:after="40" w:before="100"/>
-      </w:pPr>
-      <w:r>
-        <w:rPr>
-          <w:b/>
-          <w:bCs/>
-          <w:color w:val="0F766E"/>
-        </w:rPr>
-        <w:t xml:space="preserve">Ejercicio 1 [Caso 1: Reactivo didáctico de selección múltiple (Estándar MINEDUC)]: </w:t>
-      </w:r>
-      <w:r>
-        <w:t xml:space="preserve">A continuación se presenta un reactivo didáctico elaborado según estándar MINEDUC para 7° Básico:
-'Durante una clase de Ciencias Naturales, los estudiantes debaten sobre la sexualidad humana. Uno de ellos afirma que la sexualidad se limita exclusivamente a los procesos biológicos de maduración de los órganos reproductores y a la capacidad de procrear.'
-A partir de las Bases Curriculares y el Texto Oficial de Ciencias Naturales (pág. 16), ¿cuál de las siguientes opciones refuta con mayor precisión científica y pedagógica dicha afirmación?
-A) La afirmación es correcta porque las hormonas y los caracteres sexuales primarios son las únicas variables medibles empíricamente.
-B) La afirmación es incompleta porque la sexualidad humana es una dimensión integral que involucra aspectos biológicos, afectivos, sociales y éticos a lo largo de toda la vida.
-C) La afirmación es incorrecta porque la sexualidad solo comienza en la adultez cuando se forman vínculos legales formales.
-D) La afirmación es válida únicamente para la etapa de la pubertad, pues en la niñez no existen influencias afectivas ni sociales.
-Indica la alternativa correcta y justifica por qué descartaste las otras tres opciones.</w:t>
-      </w:r>
-    </w:p>
-    <w:p>
-      <w:pPr>
-        <w:spacing w:after="120"/>
-      </w:pPr>
-      <w:r>
-        <w:t xml:space="preserve">Desarrollo y respuesta:
-_____________________________________________________________________________________
-_____________________________________________________________________________________</w:t>
-      </w:r>
-    </w:p>
-    <w:p>
-      <w:pPr>
-        <w:spacing w:after="40" w:before="100"/>
-      </w:pPr>
-      <w:r>
-        <w:rPr>
-          <w:b/>
-          <w:bCs/>
-          <w:color w:val="0F766E"/>
-        </w:rPr>
-        <w:t xml:space="preserve">Ejercicio 2 [Caso 2: Ítem de aplicación sobre caracteres sexuales y hormonas]: </w:t>
-      </w:r>
-      <w:r>
-        <w:t xml:space="preserve">Un ítem del examen pregunta: '¿Qué relación de causalidad existe entre la secreción de testosterona en los testículos durante la pubertad y la aparición de caracteres sexuales secundarios en el varón?'
-A) La testosterona inhibe el desarrollo muscular para permitir el cambio de tono de voz.
-B) La testosterona estimula el crecimiento de la laringe, el desarrollo óseo-muscular y la aparición de vello facial y corporal.
-C) La testosterona solo actúa sobre los túbulos seminíferos y no tiene efectos en el resto del cuerpo.
-D) La testosterona es producida por la hipófisis y destruye las glándulas sudoríparas.
-Selecciona la alternativa correcta y explica brevemente su funcionamiento biológico.</w:t>
-      </w:r>
-    </w:p>
-    <w:p>
-      <w:pPr>
-        <w:spacing w:after="120"/>
-      </w:pPr>
-      <w:r>
-        <w:t xml:space="preserve">Desarrollo y respuesta:
-_____________________________________________________________________________________
-_____________________________________________________________________________________</w:t>
-      </w:r>
-    </w:p>
-    <w:p>
-      <w:pPr>
-        <w:spacing w:after="40" w:before="100"/>
-      </w:pPr>
-      <w:r>
-        <w:rPr>
-          <w:b/>
-          <w:bCs/>
-          <w:color w:val="0F766E"/>
-        </w:rPr>
-        <w:t xml:space="preserve">Ejercicio 3 [Caso 3: Trabajo en el Cuaderno de Ciencias - Hoja de Examen]: </w:t>
-      </w:r>
-      <w:r>
-        <w:t xml:space="preserve">Abre tu cuaderno de Ciencias Naturales en una página limpia. Escribe como título: 'Hoja de Respuestas y Síntesis Final OA 1'. Diseña un cuadro resumen con los 4 grandes ejes de la unidad: 1. Las 4 dimensiones humanas (biológica, afectiva, social y ética), 2. Órganos y hormonas de la pubertad, 3. Autocuidado y consentimiento, 4. Mitos derribados. Escribe dos conceptos clave para cada eje.</w:t>
-      </w:r>
-    </w:p>
-    <w:p>
-      <w:pPr>
-        <w:spacing w:after="120"/>
-      </w:pPr>
-      <w:r>
-        <w:t xml:space="preserve">Desarrollo y respuesta:
-_____________________________________________________________________________________
-_____________________________________________________________________________________</w:t>
-      </w:r>
-    </w:p>
-    <w:p>
-      <w:pPr>
-        <w:pStyle w:val="Heading2"/>
-        <w:spacing w:after="100" w:before="200"/>
-      </w:pPr>
-      <w:r>
-        <w:t xml:space="preserve">4. Miniquiz de Autocomprobación (Marca la alternativa correcta)</w:t>
-      </w:r>
-    </w:p>
-    <w:p>
-      <w:pPr>
-        <w:spacing w:after="40" w:before="80"/>
-      </w:pPr>
-      <w:r>
-        <w:rPr>
-          <w:b/>
-          <w:bCs/>
-        </w:rPr>
-        <w:t xml:space="preserve">Pregunta 1: </w:t>
-      </w:r>
-      <w:r>
-        <w:t xml:space="preserve">¿Cuál es la función principal de la hormona folículo estimulante (FSH) y la hormona luteinizante (LH) producidas por la hipófisis durante la pubertad?</w:t>
-      </w:r>
-    </w:p>
-    <w:p>
-      <w:pPr>
-        <w:spacing w:after="30"/>
-      </w:pPr>
-      <w:r>
-        <w:rPr>
-          <w:sz w:val="19"/>
-          <w:szCs w:val="19"/>
-        </w:rPr>
-        <w:t xml:space="preserve">   [   ]  A)  Estimular a las gónadas (ovarios y testículos) para producir gametos y secretar hormonas sexuales</w:t>
-      </w:r>
-    </w:p>
-    <w:p>
-      <w:pPr>
-        <w:spacing w:after="30"/>
-      </w:pPr>
-      <w:r>
-        <w:rPr>
-          <w:sz w:val="19"/>
-          <w:szCs w:val="19"/>
-        </w:rPr>
-        <w:t xml:space="preserve">   [   ]  B)  Detener el crecimiento óseo para evitar un estirón excesivo en la adolescencia</w:t>
-      </w:r>
-    </w:p>
-    <w:p>
-      <w:pPr>
-        <w:spacing w:after="30"/>
-      </w:pPr>
-      <w:r>
-        <w:rPr>
-          <w:sz w:val="19"/>
-          <w:szCs w:val="19"/>
-        </w:rPr>
-        <w:t xml:space="preserve">   [   ]  C)  Aumentar únicamente la temperatura corporal sin intervenir en la reproducción</w:t>
-      </w:r>
-    </w:p>
-    <w:p>
-      <w:pPr>
-        <w:spacing w:after="30"/>
-      </w:pPr>
-      <w:r>
-        <w:rPr>
-          <w:sz w:val="19"/>
-          <w:szCs w:val="19"/>
-        </w:rPr>
-        <w:t xml:space="preserve">   [   ]  D)  Destruir los tejidos linfáticos y reemplazar el sistema inmunitario</w:t>
-      </w:r>
-    </w:p>
-    <w:p>
-      <w:pPr>
-        <w:spacing w:after="80"/>
-      </w:pPr>
-    </w:p>
-    <w:p>
-      <w:pPr>
-        <w:spacing w:after="40" w:before="80"/>
-      </w:pPr>
-      <w:r>
-        <w:rPr>
-          <w:b/>
-          <w:bCs/>
-        </w:rPr>
-        <w:t xml:space="preserve">Pregunta 2: </w:t>
-      </w:r>
-      <w:r>
-        <w:t xml:space="preserve">Un estudiante lee en internet que 'el consentimiento otorgado verbalmente una vez compromete para siempre'. ¿Por qué esta afirmación es éticamente nula y falsa?</w:t>
-      </w:r>
-    </w:p>
-    <w:p>
-      <w:pPr>
-        <w:spacing w:after="30"/>
-      </w:pPr>
-      <w:r>
-        <w:rPr>
-          <w:sz w:val="19"/>
-          <w:szCs w:val="19"/>
-        </w:rPr>
-        <w:t xml:space="preserve">   [   ]  A)  Porque el consentimiento es por definición continuo y revocable en cualquier momento si la persona decide cambiar de opinión</w:t>
-      </w:r>
-    </w:p>
-    <w:p>
-      <w:pPr>
-        <w:spacing w:after="30"/>
-      </w:pPr>
-      <w:r>
-        <w:rPr>
-          <w:sz w:val="19"/>
-          <w:szCs w:val="19"/>
-        </w:rPr>
-        <w:t xml:space="preserve">   [   ]  B)  Porque los acuerdos verbales solo tienen validez si se firman ante un notario público</w:t>
-      </w:r>
-    </w:p>
-    <w:p>
-      <w:pPr>
-        <w:spacing w:after="30"/>
-      </w:pPr>
-      <w:r>
-        <w:rPr>
-          <w:sz w:val="19"/>
-          <w:szCs w:val="19"/>
-        </w:rPr>
-        <w:t xml:space="preserve">   [   ]  C)  Porque el consentimiento solo lo pueden otorgar los adultos después de los 21 años</w:t>
-      </w:r>
-    </w:p>
-    <w:p>
-      <w:pPr>
-        <w:spacing w:after="30"/>
-      </w:pPr>
-      <w:r>
-        <w:rPr>
-          <w:sz w:val="19"/>
-          <w:szCs w:val="19"/>
-        </w:rPr>
-        <w:t xml:space="preserve">   [   ]  D)  Porque en las relaciones de amistad no existen los límites ni el consentimiento</w:t>
-      </w:r>
-    </w:p>
-    <w:p>
-      <w:pPr>
-        <w:spacing w:after="80"/>
-      </w:pPr>
-    </w:p>
-    <w:p>
-      <w:pPr>
-        <w:spacing w:after="40" w:before="80"/>
-      </w:pPr>
-      <w:r>
-        <w:rPr>
-          <w:b/>
-          <w:bCs/>
-        </w:rPr>
-        <w:t xml:space="preserve">Pregunta 3: </w:t>
-      </w:r>
-      <w:r>
-        <w:t xml:space="preserve">La afirmación 'la diversidad de edades en la aparición del botón mamario o el crecimiento testicular es normal' se fundamenta en que:</w:t>
-      </w:r>
-    </w:p>
-    <w:p>
-      <w:pPr>
-        <w:spacing w:after="30"/>
-      </w:pPr>
-      <w:r>
-        <w:rPr>
-          <w:sz w:val="19"/>
-          <w:szCs w:val="19"/>
-        </w:rPr>
-        <w:t xml:space="preserve">   [   ]  A)  Los relojes biológicos y factores genéticos determinan ventanas temporales amplias y saludables de maduración puberal</w:t>
-      </w:r>
-    </w:p>
-    <w:p>
-      <w:pPr>
-        <w:spacing w:after="30"/>
-      </w:pPr>
-      <w:r>
-        <w:rPr>
-          <w:sz w:val="19"/>
-          <w:szCs w:val="19"/>
-        </w:rPr>
-        <w:t xml:space="preserve">   [   ]  B)  La alimentación escolar contiene sustancias que alteran artificialmente el ADN de todos los estudiantes</w:t>
-      </w:r>
-    </w:p>
-    <w:p>
-      <w:pPr>
-        <w:spacing w:after="30"/>
-      </w:pPr>
-      <w:r>
-        <w:rPr>
-          <w:sz w:val="19"/>
-          <w:szCs w:val="19"/>
-        </w:rPr>
-        <w:t xml:space="preserve">   [   ]  C)  Los cambios corporales no tienen relación alguna con el sistema endocrino ni con la herencia</w:t>
-      </w:r>
-    </w:p>
-    <w:p>
-      <w:pPr>
-        <w:spacing w:after="30"/>
-      </w:pPr>
-      <w:r>
-        <w:rPr>
-          <w:sz w:val="19"/>
-          <w:szCs w:val="19"/>
-        </w:rPr>
-        <w:t xml:space="preserve">   [   ]  D)  Solo las personas que presentan cambios tempranos logran una salud reproductiva adecuada</w:t>
-      </w:r>
-    </w:p>
-    <w:p>
-      <w:pPr>
-        <w:spacing w:after="80"/>
-      </w:pPr>
-    </w:p>
-    <w:p>
-      <w:pPr>
-        <w:pStyle w:val="Heading2"/>
-        <w:spacing w:after="80" w:before="200"/>
-      </w:pPr>
-      <w:r>
-        <w:t xml:space="preserve">5. Autoevaluación y Reflexión</w:t>
-      </w:r>
-    </w:p>
-    <w:p>
-      <w:pPr>
-        <w:spacing w:after="60"/>
-      </w:pPr>
-      <w:r>
-        <w:rPr>
-          <w:b/>
-          <w:bCs/>
-        </w:rPr>
-        <w:t xml:space="preserve">¿Cómo sentí mi aprendizaje en esta lección?
-</w:t>
-      </w:r>
-      <w:r>
-        <w:t xml:space="preserve">[   ] Comprendí muy bien y puedo explicarlo.
-[   ] Entendí la mayor parte pero requiero algo de práctica.
-[   ] Necesito revisar la explicación con mi mentor.</w:t>
-      </w:r>
-    </w:p>
-    <w:p>
-      <w:pPr>
-        <w:spacing w:after="150"/>
-      </w:pPr>
-      <w:r>
-        <w:t xml:space="preserve">Lo que más me llamó la atención hoy fue: _____________________________________________________
-_____________________________________________________________________________________</w:t>
       </w:r>
     </w:p>
     <w:sectPr>

</xml_diff>

<commit_message>
feat(ciencias): aprobacion canonica de 7B OA01 con isomorfismo 6/6 y certificacion en manifest
</commit_message>
<xml_diff>
--- a/LECCIONES/110-7/Ciencias_Naturales/OA01/Plan_Maestro_7Básico_110-7-CIE-OA01_6Lecciones.docx
+++ b/LECCIONES/110-7/Ciencias_Naturales/OA01/Plan_Maestro_7Básico_110-7-CIE-OA01_6Lecciones.docx
@@ -21159,7 +21159,7 @@
                 <w:sz w:val="17"/>
                 <w:szCs w:val="17"/>
               </w:rPr>
-              <w:t xml:space="preserve">Duración asignada: 23 s</w:t>
+              <w:t xml:space="preserve">Duración asignada: 38 s</w:t>
             </w:r>
           </w:p>
         </w:tc>
@@ -21189,7 +21189,7 @@
                 <w:sz w:val="18"/>
                 <w:szCs w:val="18"/>
               </w:rPr>
-              <w:t xml:space="preserve">Caso Modelado: Variabilidad en el crecimiento</w:t>
+              <w:t xml:space="preserve">Caso 1: El mito del estirón puberal simultáneo</w:t>
             </w:r>
           </w:p>
           <w:p>
@@ -21211,7 +21211,7 @@
                 <w:sz w:val="18"/>
                 <w:szCs w:val="18"/>
               </w:rPr>
-              <w:t xml:space="preserve">Comprender ritmos diversos sin diagnósticos apresurados</w:t>
+              <w:t xml:space="preserve">Variabilidad biológica y ritmos genéticos de crecimiento</w:t>
             </w:r>
           </w:p>
         </w:tc>
@@ -21261,7 +21261,7 @@
                 <w:sz w:val="17"/>
                 <w:szCs w:val="17"/>
               </w:rPr>
-              <w:t xml:space="preserve">El ritmo de crecimiento es individual; ante dudas o inquietudes, consultar con un adulto de confianza o profesional de salud</w:t>
+              <w:t xml:space="preserve">Caso 1 modelado: Estudiante de 13 años con angustia por estirón -&gt; Evidencia científica: ritmos genéticos normales (10 a 16 años) -&gt; Desarrollo biológico saludable</w:t>
             </w:r>
           </w:p>
         </w:tc>
@@ -21282,7 +21282,7 @@
                 <w:sz w:val="18"/>
                 <w:szCs w:val="18"/>
               </w:rPr>
-              <w:t xml:space="preserve">Si un estudiante de 13 años nota que sus compañeros crecen a distinto ritmo, debe recordar que los momentos del estirón varían. Una curva general no diagnostica a una persona; ante cualquier inquietud, lo adecuado es conversarlo con un adulto de confianza o un profesional de salud.</w:t>
+              <w:t xml:space="preserve">Analicemos el Caso 1: un estudiante de 13 años siente angustia porque varios compañeros ya tuvieron el estirón puberal y él aún no, creyendo que tiene un problema de salud o no crecerá. ¿Qué evidencia biológica desmiente este mito? La evidencia indica que el estirón puberal no ocurre a la misma edad para todos; responde a ritmos genéticos individuales que se extienden normalmente entre los 10 y los 16 años, por lo que su desarrollo es biológicamente normal y no constituye una anomalía.</w:t>
             </w:r>
           </w:p>
         </w:tc>

</xml_diff>

<commit_message>
fix(ciencias-oa01): correccion integral plan maestro, prompts y skill coherencia
</commit_message>
<xml_diff>
--- a/LECCIONES/110-7/Ciencias_Naturales/OA01/Plan_Maestro_7Básico_110-7-CIE-OA01_6Lecciones.docx
+++ b/LECCIONES/110-7/Ciencias_Naturales/OA01/Plan_Maestro_7Básico_110-7-CIE-OA01_6Lecciones.docx
@@ -52,7 +52,8 @@
           <w:szCs w:val="20"/>
         </w:rPr>
         <w:t xml:space="preserve">Desglose Instruccional en 6 Lecciones de 30 Minutos (8 Pasos Pedagógicos Oficiales)
-Incluye Enlaces a Videos en Cloudflare R2, Prompts Anime Moderno 16:9 y Ficha Técnica de Aula</w:t>
+Incluye Enlaces a Videos en Cloudflare R2, Prompts Anime Moderno 16:9 y Ficha Técnica de Aula
+Fecha de Actualización Oficial: 08-10-2026, 1:25:30 p. m. (America/Santiago)</w:t>
       </w:r>
     </w:p>
     <w:p>
@@ -592,7 +593,7 @@
                 <w:sz w:val="18"/>
                 <w:szCs w:val="18"/>
               </w:rPr>
-              <w:t xml:space="preserve">Integrar todos los conceptos del OA 1 de Ciencias Naturales y demostrar maestría al resolver reactivos de evaluación formal de cuatro alternativas con estándar MINEDUC.</w:t>
+              <w:t xml:space="preserve">Integrar todos los conceptos del OA 1 de Ciencias Naturales y resolver con maestría reactivos de práctica de EstudioSimple de cuatro alternativas.</w:t>
             </w:r>
           </w:p>
         </w:tc>
@@ -667,7 +668,7 @@
         <w:t xml:space="preserve">Objetivo para el Adulto / Mentor: </w:t>
       </w:r>
       <w:r>
-        <w:t xml:space="preserve">Guiar al estudiante a comprender que la sexualidad humana es una vivencia integral organizada didácticamente en cuatro dimensiones fundamentales: biológica, afectiva, social y ética, articulando los aspectos curriculares del Texto Escolar Ciencias Naturales 7° Básico MINEDUC (Edición SM, Unidad 1, Lección 1, págs. 16 a 29) con valores de respeto mutuo y responsabilidad personal, superando la visión reducida a lo reproductivo.</w:t>
+        <w:t xml:space="preserve">Guiar al estudiante a comprender que la sexualidad humana es una vivencia integral organizada didácticamente en cuatro dimensiones fundamentales: biológica, afectiva, social y ética, articulando los aspectos curriculares del Texto Escolar Ciencias Naturales 7° Básico MINEDUC (Edición SM, Unidad 4: Salud sexual y reproducción, Lección 8: Sexualidad y autocuidado, págs. 114 a 137, inicio temático pág. 116) con valores de respeto mutuo y responsabilidad personal, superando la visión reducida a lo reproductivo.</w:t>
       </w:r>
     </w:p>
     <w:p>
@@ -1148,11 +1149,11 @@
         <w:rPr>
           <w:b/>
           <w:bCs/>
-          <w:color w:val="B45309"/>
+          <w:color w:val="0F766E"/>
           <w:sz w:val="19"/>
           <w:szCs w:val="19"/>
         </w:rPr>
-        <w:t xml:space="preserve">• Protocolo de Comprobación Acústica Obligatoria (Google Vids): </w:t>
+        <w:t xml:space="preserve">• Calibración Audiovisual (Google Vids): </w:t>
       </w:r>
       <w:r>
         <w:rPr>
@@ -1160,7 +1161,7 @@
           <w:sz w:val="19"/>
           <w:szCs w:val="19"/>
         </w:rPr>
-        <w:t xml:space="preserve">Tras generar y exportar el audio en Google Vids, medir la duración real del archivo exportado con cronómetro o analizador de audio. El conteo de palabras no garantiza por sí solo que se obtengan 60 o 90 segundos exactos. Si la duración real no es exacta (60 s en gancho y 90 s en explicación), ajustar la narración, las pausas o el ritmo, volver a exportar y medir nuevamente. Registrar la duración comprobada; no marcar el requisito como cumplido basándose solo en el número de palabras o en una duración estimada.</w:t>
+        <w:t xml:space="preserve">El guion continuo está redactado con un presupuesto léxico referencial adaptado al nivel escolar. La calibración acústica, pausas y ritmo de locución se ajustan directamente en Google Vids durante la síntesis y renderizado, sin que el conteo de palabras ni la duración en segundos constituyan un criterio de bloqueo pedagógico.</w:t>
       </w:r>
     </w:p>
     <w:tbl>
@@ -2794,11 +2795,11 @@
         <w:rPr>
           <w:b/>
           <w:bCs/>
-          <w:color w:val="B45309"/>
+          <w:color w:val="0F766E"/>
           <w:sz w:val="19"/>
           <w:szCs w:val="19"/>
         </w:rPr>
-        <w:t xml:space="preserve">• Protocolo de Comprobación Acústica Obligatoria (Google Vids): </w:t>
+        <w:t xml:space="preserve">• Calibración Audiovisual (Google Vids): </w:t>
       </w:r>
       <w:r>
         <w:rPr>
@@ -2806,7 +2807,7 @@
           <w:sz w:val="19"/>
           <w:szCs w:val="19"/>
         </w:rPr>
-        <w:t xml:space="preserve">Tras generar y exportar el audio en Google Vids, medir la duración real del archivo exportado con cronómetro o analizador de audio. El conteo de palabras no garantiza por sí solo que se obtengan 60 o 90 segundos exactos. Si la duración real no es exacta (60 s en gancho y 90 s en explicación), ajustar la narración, las pausas o el ritmo, volver a exportar y medir nuevamente. Registrar la duración comprobada; no marcar el requisito como cumplido basándose solo en el número de palabras o en una duración estimada.</w:t>
+        <w:t xml:space="preserve">El guion continuo está redactado con un presupuesto léxico referencial adaptado al nivel escolar. La calibración acústica, pausas y ritmo de locución se ajustan directamente en Google Vids durante la síntesis y renderizado, sin que el conteo de palabras ni la duración en segundos constituyan un criterio de bloqueo pedagógico.</w:t>
       </w:r>
     </w:p>
     <w:tbl>
@@ -4996,7 +4997,7 @@
         <w:t xml:space="preserve">Objetivo para el Adulto / Mentor: </w:t>
       </w:r>
       <w:r>
-        <w:t xml:space="preserve">Acompañar al estudiante a distinguir entre caracteres sexuales primarios y secundarios, reconociendo la acción del sistema endocrino en los cambios físicos y emocionales propios de la pubertad, diferenciando el inicio puberal (8 a 13 años en niñas y 9 a 14 en niños) del estirón puberal de estatura (10 a 14 en niñas y 12 a 16 en niños) según los estadios de Tanner (1962) y orientaciones del MINEDUC.</w:t>
+        <w:t xml:space="preserve">Acompañar al estudiante a distinguir entre caracteres sexuales primarios y secundarios, reconociendo la acción del sistema endocrino en los cambios físicos y emocionales propios de la pubertad, diferenciando el inicio puberal habitual (8 a 13 años en niñas y 9 a 14 en niños) de la aceleración del crecimiento, cuyo peak de velocidad de crecimiento alcanza promedios poblacionales de ~11,5 años en niñas y ~13,5 años en niños dentro de una amplia ventana normal (10 a 16 años según Tanner y MINEDUC).</w:t>
       </w:r>
     </w:p>
     <w:p>
@@ -5477,11 +5478,11 @@
         <w:rPr>
           <w:b/>
           <w:bCs/>
-          <w:color w:val="B45309"/>
+          <w:color w:val="0F766E"/>
           <w:sz w:val="19"/>
           <w:szCs w:val="19"/>
         </w:rPr>
-        <w:t xml:space="preserve">• Protocolo de Comprobación Acústica Obligatoria (Google Vids): </w:t>
+        <w:t xml:space="preserve">• Calibración Audiovisual (Google Vids): </w:t>
       </w:r>
       <w:r>
         <w:rPr>
@@ -5489,7 +5490,7 @@
           <w:sz w:val="19"/>
           <w:szCs w:val="19"/>
         </w:rPr>
-        <w:t xml:space="preserve">Tras generar y exportar el audio en Google Vids, medir la duración real del archivo exportado con cronómetro o analizador de audio. El conteo de palabras no garantiza por sí solo que se obtengan 60 o 90 segundos exactos. Si la duración real no es exacta (60 s en gancho y 90 s en explicación), ajustar la narración, las pausas o el ritmo, volver a exportar y medir nuevamente. Registrar la duración comprobada; no marcar el requisito como cumplido basándose solo en el número de palabras o en una duración estimada.</w:t>
+        <w:t xml:space="preserve">El guion continuo está redactado con un presupuesto léxico referencial adaptado al nivel escolar. La calibración acústica, pausas y ritmo de locución se ajustan directamente en Google Vids durante la síntesis y renderizado, sin que el conteo de palabras ni la duración en segundos constituyan un criterio de bloqueo pedagógico.</w:t>
       </w:r>
     </w:p>
     <w:tbl>
@@ -7123,11 +7124,11 @@
         <w:rPr>
           <w:b/>
           <w:bCs/>
-          <w:color w:val="B45309"/>
+          <w:color w:val="0F766E"/>
           <w:sz w:val="19"/>
           <w:szCs w:val="19"/>
         </w:rPr>
-        <w:t xml:space="preserve">• Protocolo de Comprobación Acústica Obligatoria (Google Vids): </w:t>
+        <w:t xml:space="preserve">• Calibración Audiovisual (Google Vids): </w:t>
       </w:r>
       <w:r>
         <w:rPr>
@@ -7135,7 +7136,7 @@
           <w:sz w:val="19"/>
           <w:szCs w:val="19"/>
         </w:rPr>
-        <w:t xml:space="preserve">Tras generar y exportar el audio en Google Vids, medir la duración real del archivo exportado con cronómetro o analizador de audio. El conteo de palabras no garantiza por sí solo que se obtengan 60 o 90 segundos exactos. Si la duración real no es exacta (60 s en gancho y 90 s en explicación), ajustar la narración, las pausas o el ritmo, volver a exportar y medir nuevamente. Registrar la duración comprobada; no marcar el requisito como cumplido basándose solo en el número de palabras o en una duración estimada.</w:t>
+        <w:t xml:space="preserve">El guion continuo está redactado con un presupuesto léxico referencial adaptado al nivel escolar. La calibración acústica, pausas y ritmo de locución se ajustan directamente en Google Vids durante la síntesis y renderizado, sin que el conteo de palabras ni la duración en segundos constituyan un criterio de bloqueo pedagógico.</w:t>
       </w:r>
     </w:p>
     <w:tbl>
@@ -9806,11 +9807,11 @@
         <w:rPr>
           <w:b/>
           <w:bCs/>
-          <w:color w:val="B45309"/>
+          <w:color w:val="0F766E"/>
           <w:sz w:val="19"/>
           <w:szCs w:val="19"/>
         </w:rPr>
-        <w:t xml:space="preserve">• Protocolo de Comprobación Acústica Obligatoria (Google Vids): </w:t>
+        <w:t xml:space="preserve">• Calibración Audiovisual (Google Vids): </w:t>
       </w:r>
       <w:r>
         <w:rPr>
@@ -9818,7 +9819,7 @@
           <w:sz w:val="19"/>
           <w:szCs w:val="19"/>
         </w:rPr>
-        <w:t xml:space="preserve">Tras generar y exportar el audio en Google Vids, medir la duración real del archivo exportado con cronómetro o analizador de audio. El conteo de palabras no garantiza por sí solo que se obtengan 60 o 90 segundos exactos. Si la duración real no es exacta (60 s en gancho y 90 s en explicación), ajustar la narración, las pausas o el ritmo, volver a exportar y medir nuevamente. Registrar la duración comprobada; no marcar el requisito como cumplido basándose solo en el número de palabras o en una duración estimada.</w:t>
+        <w:t xml:space="preserve">El guion continuo está redactado con un presupuesto léxico referencial adaptado al nivel escolar. La calibración acústica, pausas y ritmo de locución se ajustan directamente en Google Vids durante la síntesis y renderizado, sin que el conteo de palabras ni la duración en segundos constituyan un criterio de bloqueo pedagógico.</w:t>
       </w:r>
     </w:p>
     <w:tbl>
@@ -10935,7 +10936,7 @@
                 <w:sz w:val="17"/>
                 <w:szCs w:val="17"/>
               </w:rPr>
-              <w:t xml:space="preserve">Modern anime style 16:9 widescreen illustration. Two 13-year-old student explorers, a girl with braided hair and a boy in a teal jacket, agreeing on respectful group rules with classmates in a bright school library with thumbs-up gestures, with generous negative space for text overlays. No text drawn by AI.</w:t>
+              <w:t xml:space="preserve">Modern anime style 16:9 widescreen illustration. Two 13-year-old student explorers, a girl with braided hair and a boy in a teal jacket, engaged in a warm, open dialogue with family members in a welcoming living room setting, experiencing emotional support and understanding, with generous negative space for text overlays. No text drawn by AI.</w:t>
             </w:r>
           </w:p>
           <w:p>
@@ -11452,11 +11453,11 @@
         <w:rPr>
           <w:b/>
           <w:bCs/>
-          <w:color w:val="B45309"/>
+          <w:color w:val="0F766E"/>
           <w:sz w:val="19"/>
           <w:szCs w:val="19"/>
         </w:rPr>
-        <w:t xml:space="preserve">• Protocolo de Comprobación Acústica Obligatoria (Google Vids): </w:t>
+        <w:t xml:space="preserve">• Calibración Audiovisual (Google Vids): </w:t>
       </w:r>
       <w:r>
         <w:rPr>
@@ -11464,7 +11465,7 @@
           <w:sz w:val="19"/>
           <w:szCs w:val="19"/>
         </w:rPr>
-        <w:t xml:space="preserve">Tras generar y exportar el audio en Google Vids, medir la duración real del archivo exportado con cronómetro o analizador de audio. El conteo de palabras no garantiza por sí solo que se obtengan 60 o 90 segundos exactos. Si la duración real no es exacta (60 s en gancho y 90 s en explicación), ajustar la narración, las pausas o el ritmo, volver a exportar y medir nuevamente. Registrar la duración comprobada; no marcar el requisito como cumplido basándose solo en el número de palabras o en una duración estimada.</w:t>
+        <w:t xml:space="preserve">El guion continuo está redactado con un presupuesto léxico referencial adaptado al nivel escolar. La calibración acústica, pausas y ritmo de locución se ajustan directamente en Google Vids durante la síntesis y renderizado, sin que el conteo de palabras ni la duración en segundos constituyan un criterio de bloqueo pedagógico.</w:t>
       </w:r>
     </w:p>
     <w:tbl>
@@ -11924,7 +11925,7 @@
                 <w:sz w:val="18"/>
                 <w:szCs w:val="18"/>
               </w:rPr>
-              <w:t xml:space="preserve">Los vínculos afectivos sanos se construyen sobre la reciprocidad y la confianza. Cuando ambas partes se sienten escuchadas y valoradas, la amistad se fortalece y genera bienestar.</w:t>
+              <w:t xml:space="preserve">La empatía es la capacidad de comprender y sintonizar con los sentimientos del otro; nos permite escuchar activamente sin juzgar y validar las emociones de nuestros pares.</w:t>
             </w:r>
           </w:p>
         </w:tc>
@@ -12056,7 +12057,7 @@
                 <w:sz w:val="17"/>
                 <w:szCs w:val="17"/>
               </w:rPr>
-              <w:t xml:space="preserve">Modern anime style 16:9 widescreen illustration. Two 13-year-old student explorers, a girl with braided hair and a boy in a teal jacket, keeping personal confidences safe beside a study desk with an illustrated lock and diary, with generous negative space for text overlays. No text drawn by AI.</w:t>
+              <w:t xml:space="preserve">Modern anime style 16:9 widescreen illustration. Two 13-year-old student explorers, a girl with braided hair and a boy in a teal jacket, observing a balanced scale of reciprocal care and mutual respect glowing softly in cyan and gold, with generous negative space for text overlays. No text drawn by AI.</w:t>
             </w:r>
           </w:p>
           <w:p>
@@ -12099,7 +12100,7 @@
                 <w:sz w:val="18"/>
                 <w:szCs w:val="18"/>
               </w:rPr>
-              <w:t xml:space="preserve">La empatía permite conectar con los sentimientos ajenos sin invalidarlos. Escuchar activamente a un amigo que pasa por un momento difícil es una manifestación concreta de madurez afectiva.</w:t>
+              <w:t xml:space="preserve">El principio de reciprocidad establece que el afecto, la consideración y el cuidado deben ser mutuos; ninguna persona debe asumir toda la carga emocional o someterse a la otra.</w:t>
             </w:r>
           </w:p>
         </w:tc>
@@ -12231,7 +12232,7 @@
                 <w:sz w:val="17"/>
                 <w:szCs w:val="17"/>
               </w:rPr>
-              <w:t xml:space="preserve">Modern anime style 16:9 widescreen illustration. Two 13-year-old student explorers, a girl with braided hair and a boy in a teal jacket, observing a balanced scale of reciprocal care and mutual respect glowing softly in cyan and gold, with generous negative space for text overlays. No text drawn by AI.</w:t>
+              <w:t xml:space="preserve">Modern anime style 16:9 widescreen illustration. Two 13-year-old student explorers, a girl with braided hair and a boy in a teal jacket, keeping personal confidences safe beside a study desk with an illustrated lock and diary, with generous negative space for text overlays. No text drawn by AI.</w:t>
             </w:r>
           </w:p>
           <w:p>
@@ -12274,7 +12275,7 @@
                 <w:sz w:val="18"/>
                 <w:szCs w:val="18"/>
               </w:rPr>
-              <w:t xml:space="preserve">El respeto a la intimidad exige no divulgar confidencias, no revisar pertenencias ajenas y no presionar a nadie para que revele aspectos reservados de su vida personal o familiar.</w:t>
+              <w:t xml:space="preserve">La intimidad es el espacio inviolable de vivencias, pensamientos y emociones personales; respetarla implica no forzar revelaciones, guardar confidencias y proteger la privacidad.</w:t>
             </w:r>
           </w:p>
         </w:tc>
@@ -12449,7 +12450,7 @@
                 <w:sz w:val="18"/>
                 <w:szCs w:val="18"/>
               </w:rPr>
-              <w:t xml:space="preserve">La reciprocidad evita relaciones desiguales. Compartir decisiones en el grupo escolar garantiza que nadie se sienta excluido o sometido a las preferencias de los demás.</w:t>
+              <w:t xml:space="preserve">En entornos digitales, cuidar la intimidad exige contar siempre con consentimiento explícito antes de reenviar fotos o mensajes privados; lo íntimo debe mantenerse en reserva.</w:t>
             </w:r>
           </w:p>
         </w:tc>
@@ -13884,7 +13885,7 @@
         <w:t xml:space="preserve">Sub-etapa 4 · Comprendamos la Respuesta (Punto de Referencia): </w:t>
       </w:r>
       <w:r>
-        <w:t xml:space="preserve">El consentimiento es la manifestación libre, voluntaria, clara y consciente de aceptar o no una situación, contacto o propuesta. Un consentimiento real jamás se obtiene mediante amenazas, engaños o insistencias insistentes.</w:t>
+        <w:t xml:space="preserve">El consentimiento es la manifestación libre, voluntaria, clara y consciente de aceptar o no una situación, contacto o propuesta. Un consentimiento real jamás se obtiene mediante amenazas, engaños o presiones indebidas.</w:t>
       </w:r>
     </w:p>
     <w:p>
@@ -14135,11 +14136,11 @@
         <w:rPr>
           <w:b/>
           <w:bCs/>
-          <w:color w:val="B45309"/>
+          <w:color w:val="0F766E"/>
           <w:sz w:val="19"/>
           <w:szCs w:val="19"/>
         </w:rPr>
-        <w:t xml:space="preserve">• Protocolo de Comprobación Acústica Obligatoria (Google Vids): </w:t>
+        <w:t xml:space="preserve">• Calibración Audiovisual (Google Vids): </w:t>
       </w:r>
       <w:r>
         <w:rPr>
@@ -14147,7 +14148,7 @@
           <w:sz w:val="19"/>
           <w:szCs w:val="19"/>
         </w:rPr>
-        <w:t xml:space="preserve">Tras generar y exportar el audio en Google Vids, medir la duración real del archivo exportado con cronómetro o analizador de audio. El conteo de palabras no garantiza por sí solo que se obtengan 60 o 90 segundos exactos. Si la duración real no es exacta (60 s en gancho y 90 s en explicación), ajustar la narración, las pausas o el ritmo, volver a exportar y medir nuevamente. Registrar la duración comprobada; no marcar el requisito como cumplido basándose solo en el número de palabras o en una duración estimada.</w:t>
+        <w:t xml:space="preserve">El guion continuo está redactado con un presupuesto léxico referencial adaptado al nivel escolar. La calibración acústica, pausas y ritmo de locución se ajustan directamente en Google Vids durante la síntesis y renderizado, sin que el conteo de palabras ni la duración en segundos constituyan un criterio de bloqueo pedagógico.</w:t>
       </w:r>
     </w:p>
     <w:tbl>
@@ -15781,11 +15782,11 @@
         <w:rPr>
           <w:b/>
           <w:bCs/>
-          <w:color w:val="B45309"/>
+          <w:color w:val="0F766E"/>
           <w:sz w:val="19"/>
           <w:szCs w:val="19"/>
         </w:rPr>
-        <w:t xml:space="preserve">• Protocolo de Comprobación Acústica Obligatoria (Google Vids): </w:t>
+        <w:t xml:space="preserve">• Calibración Audiovisual (Google Vids): </w:t>
       </w:r>
       <w:r>
         <w:rPr>
@@ -15793,7 +15794,7 @@
           <w:sz w:val="19"/>
           <w:szCs w:val="19"/>
         </w:rPr>
-        <w:t xml:space="preserve">Tras generar y exportar el audio en Google Vids, medir la duración real del archivo exportado con cronómetro o analizador de audio. El conteo de palabras no garantiza por sí solo que se obtengan 60 o 90 segundos exactos. Si la duración real no es exacta (60 s en gancho y 90 s en explicación), ajustar la narración, las pausas o el ritmo, volver a exportar y medir nuevamente. Registrar la duración comprobada; no marcar el requisito como cumplido basándose solo en el número de palabras o en una duración estimada.</w:t>
+        <w:t xml:space="preserve">El guion continuo está redactado con un presupuesto léxico referencial adaptado al nivel escolar. La calibración acústica, pausas y ritmo de locución se ajustan directamente en Google Vids durante la síntesis y renderizado, sin que el conteo de palabras ni la duración en segundos constituyan un criterio de bloqueo pedagógico.</w:t>
       </w:r>
     </w:p>
     <w:tbl>
@@ -16428,7 +16429,7 @@
                 <w:sz w:val="18"/>
                 <w:szCs w:val="18"/>
               </w:rPr>
-              <w:t xml:space="preserve">El segundo criterio exige que sea informado: conocer con claridad qué se propone y qué consecuencias tiene. El tercer criterio establece que sea específico para cada momento.</w:t>
+              <w:t xml:space="preserve">El consentimiento válido requiere cuatro condiciones ineludibles: ser libre de presiones, plenamente informado, específico para la situación concreta y revocable en cualquier momento.</w:t>
             </w:r>
           </w:p>
         </w:tc>
@@ -16603,7 +16604,7 @@
                 <w:sz w:val="18"/>
                 <w:szCs w:val="18"/>
               </w:rPr>
-              <w:t xml:space="preserve">El cuarto criterio es decisivo: el consentimiento es revocable. Cualquier persona tiene derecho a cambiar de opinión y detener una actividad cuando lo decida.</w:t>
+              <w:t xml:space="preserve">La asertividad es la capacidad de expresar límites y decisiones de manera clara, serena y firme, sin agredir a otros ni someterse a presiones grupales contrarias a nuestras convicciones.</w:t>
             </w:r>
           </w:p>
         </w:tc>
@@ -16735,7 +16736,7 @@
                 <w:sz w:val="17"/>
                 <w:szCs w:val="17"/>
               </w:rPr>
-              <w:t xml:space="preserve">Modern anime style 16:9 widescreen illustration. Two 13-year-old student explorers, a girl with braided hair and a boy in a teal jacket, visualizing a glowing circle of trust with school counselors, teachers, and parents forming a protective network, with generous negative space for text overlays. No text drawn by AI.</w:t>
+              <w:t xml:space="preserve">Modern anime style 16:9 widescreen illustration. Two 13-year-old student explorers, a girl with braided hair and a boy in a teal jacket, pausing thoughtfully before a decision pathway flowchart, carefully weighing causes and consequences of actions, with generous negative space for text overlays. No text drawn by AI.</w:t>
             </w:r>
           </w:p>
           <w:p>
@@ -16778,7 +16779,7 @@
                 <w:sz w:val="18"/>
                 <w:szCs w:val="18"/>
               </w:rPr>
-              <w:t xml:space="preserve">La asertividad es la habilidad de expresar límites con firmeza y respeto. Reconocer situaciones de riesgo y pedir apoyo a docentes o apoderados refuerza la seguridad.</w:t>
+              <w:t xml:space="preserve">Pensar antes de actuar implica evaluar las consecuencias individuales y sociales de nuestras acciones; la responsabilidad personal exige cuidar la propia integridad y la de los demás.</w:t>
             </w:r>
           </w:p>
         </w:tc>
@@ -18464,11 +18465,11 @@
         <w:rPr>
           <w:b/>
           <w:bCs/>
-          <w:color w:val="B45309"/>
+          <w:color w:val="0F766E"/>
           <w:sz w:val="19"/>
           <w:szCs w:val="19"/>
         </w:rPr>
-        <w:t xml:space="preserve">• Protocolo de Comprobación Acústica Obligatoria (Google Vids): </w:t>
+        <w:t xml:space="preserve">• Calibración Audiovisual (Google Vids): </w:t>
       </w:r>
       <w:r>
         <w:rPr>
@@ -18476,7 +18477,7 @@
           <w:sz w:val="19"/>
           <w:szCs w:val="19"/>
         </w:rPr>
-        <w:t xml:space="preserve">Tras generar y exportar el audio en Google Vids, medir la duración real del archivo exportado con cronómetro o analizador de audio. El conteo de palabras no garantiza por sí solo que se obtengan 60 o 90 segundos exactos. Si la duración real no es exacta (60 s en gancho y 90 s en explicación), ajustar la narración, las pausas o el ritmo, volver a exportar y medir nuevamente. Registrar la duración comprobada; no marcar el requisito como cumplido basándose solo en el número de palabras o en una duración estimada.</w:t>
+        <w:t xml:space="preserve">El guion continuo está redactado con un presupuesto léxico referencial adaptado al nivel escolar. La calibración acústica, pausas y ritmo de locución se ajustan directamente en Google Vids durante la síntesis y renderizado, sin que el conteo de palabras ni la duración en segundos constituyan un criterio de bloqueo pedagógico.</w:t>
       </w:r>
     </w:p>
     <w:tbl>
@@ -18936,7 +18937,7 @@
                 <w:sz w:val="18"/>
                 <w:szCs w:val="18"/>
               </w:rPr>
-              <w:t xml:space="preserve">Muchos creen que todos los adolescentes deben pegar el estirón al mismo tiempo. La biología demuestra que cada cuerpo tiene su propio reloj genético.</w:t>
+              <w:t xml:space="preserve">El inicio puberal habitual (8 a 13 años en niñas y 9 a 14 en niños) no debe confundirse con el peak de velocidad de crecimiento, cuyos promedios poblacionales rondan los 11,5 años en niñas y 13,5 en niños con amplia variación saludable.</w:t>
             </w:r>
           </w:p>
         </w:tc>
@@ -20110,11 +20111,11 @@
         <w:rPr>
           <w:b/>
           <w:bCs/>
-          <w:color w:val="B45309"/>
+          <w:color w:val="0F766E"/>
           <w:sz w:val="19"/>
           <w:szCs w:val="19"/>
         </w:rPr>
-        <w:t xml:space="preserve">• Protocolo de Comprobación Acústica Obligatoria (Google Vids): </w:t>
+        <w:t xml:space="preserve">• Calibración Audiovisual (Google Vids): </w:t>
       </w:r>
       <w:r>
         <w:rPr>
@@ -20122,7 +20123,7 @@
           <w:sz w:val="19"/>
           <w:szCs w:val="19"/>
         </w:rPr>
-        <w:t xml:space="preserve">Tras generar y exportar el audio en Google Vids, medir la duración real del archivo exportado con cronómetro o analizador de audio. El conteo de palabras no garantiza por sí solo que se obtengan 60 o 90 segundos exactos. Si la duración real no es exacta (60 s en gancho y 90 s en explicación), ajustar la narración, las pausas o el ritmo, volver a exportar y medir nuevamente. Registrar la duración comprobada; no marcar el requisito como cumplido basándose solo en el número de palabras o en una duración estimada.</w:t>
+        <w:t xml:space="preserve">El guion continuo está redactado con un presupuesto léxico referencial adaptado al nivel escolar. La calibración acústica, pausas y ritmo de locución se ajustan directamente en Google Vids durante la síntesis y renderizado, sin que el conteo de palabras ni la duración en segundos constituyan un criterio de bloqueo pedagógico.</w:t>
       </w:r>
     </w:p>
     <w:tbl>
@@ -20561,7 +20562,7 @@
                 <w:sz w:val="17"/>
                 <w:szCs w:val="17"/>
               </w:rPr>
-              <w:t xml:space="preserve">Inicio puberal habitual: 8 a 13 años en niñas y 9 a 14 años en niños (MedlinePlus / OMS)</w:t>
+              <w:t xml:space="preserve">Inicio puberal: 8-13 años (niñas), 9-14 años (niños) | Peak de crecimiento: promedios poblacionales ~11,5 (niñas) y ~13,5 (niños)</w:t>
             </w:r>
           </w:p>
         </w:tc>
@@ -20582,7 +20583,7 @@
                 <w:sz w:val="18"/>
                 <w:szCs w:val="18"/>
               </w:rPr>
-              <w:t xml:space="preserve">El inicio de la pubertad varía entre personas: suele ocurrir entre los 8 y 13 años en niñas y entre los 9 y 14 en niños según MedlinePlus y la OMS. Este inicio habitual no debe confundirse con el momento del estirón de estatura, que ocurre en etapas posteriores.</w:t>
+              <w:t xml:space="preserve">El inicio de la pubertad suele ocurrir entre los 8 y 13 años en niñas y entre los 9 y 14 en niños (MedlinePlus/OMS). Distinto del inicio, el peak de velocidad de crecimiento en estatura alcanza promedios poblacionales de ~11,5 años en niñas y ~13,5 años en niños dentro de una amplia ventana normal (10 a 16 años según Tanner).</w:t>
             </w:r>
           </w:p>
         </w:tc>
@@ -20714,7 +20715,7 @@
                 <w:sz w:val="17"/>
                 <w:szCs w:val="17"/>
               </w:rPr>
-              <w:t xml:space="preserve">Modern anime style 16:9 widescreen illustration. Two 13-year-old student explorers, a girl with braided hair and a boy in a teal jacket, visualizing neural pathways and equal cognitive capabilities across diverse vocations and scientific fields, with generous negative space for text overlays. No text drawn by AI.</w:t>
+              <w:t xml:space="preserve">Modern anime style 16:9 widescreen illustration. Two 13-year-old student explorers, a girl with braided hair and a boy in a teal jacket, in a modern biology lab examining interactive infographic panels of biological growth factors including genetics, nutrition, healthy sleep, and hormonal regulation, with generous negative space for text overlays. No text drawn by AI.</w:t>
             </w:r>
           </w:p>
           <w:p>
@@ -20757,7 +20758,7 @@
                 <w:sz w:val="18"/>
                 <w:szCs w:val="18"/>
               </w:rPr>
-              <w:t xml:space="preserve">El desarrollo puberal no es una carrera. Quienes experimentan cambios tempranos o tardíos alcanzan igualmente la madurez biológica completa con salud.</w:t>
+              <w:t xml:space="preserve">El ritmo de crecimiento depende de factores genéticos hereditarios, secreción hormonal equilibrada y hábitos saludables de nutrición y sueño profundo, los cuales regulan el desarrollo biológico.</w:t>
             </w:r>
           </w:p>
         </w:tc>
@@ -20889,7 +20890,7 @@
                 <w:sz w:val="17"/>
                 <w:szCs w:val="17"/>
               </w:rPr>
-              <w:t xml:space="preserve">Modern anime style 16:9 widescreen illustration. Two 13-year-old student explorers, a girl with braided hair and a boy in a teal jacket, examining a scientific anatomical model of skin glands and hormonal changes during puberty, with generous negative space for text overlays. No text drawn by AI.</w:t>
+              <w:t xml:space="preserve">Modern anime style 16:9 widescreen illustration. Two 13-year-old student explorers, a girl with braided hair and a boy in a teal jacket, enthusiastically collaborating in robotics and creative artistic design in a modern school workshop, breaking gender stereotypes, with generous negative space for text overlays. No text drawn by AI.</w:t>
             </w:r>
           </w:p>
           <w:p>
@@ -20932,7 +20933,7 @@
                 <w:sz w:val="18"/>
                 <w:szCs w:val="18"/>
               </w:rPr>
-              <w:t xml:space="preserve">Los estereotipos que asignan roles rígidos carecen de fundamento científico. Los estereotipos sociales no deben limitar los intereses, talentos ni oportunidades de cada estudiante.</w:t>
+              <w:t xml:space="preserve">Los estereotipos que asignan roles rígidos carecen de fundamento científico. Todos los estudiantes pueden destacar plenamente en ciencias, tecnología, artes y deportes sin límites impuestos por el género.</w:t>
             </w:r>
           </w:p>
         </w:tc>
@@ -22265,7 +22266,7 @@
         <w:t xml:space="preserve">Foco didáctico: </w:t>
       </w:r>
       <w:r>
-        <w:t xml:space="preserve">Integrar todos los conceptos del OA 1 de Ciencias Naturales y demostrar maestría al resolver reactivos de evaluación formal de cuatro alternativas con estándar MINEDUC.</w:t>
+        <w:t xml:space="preserve">Integrar todos los conceptos del OA 1 de Ciencias Naturales y resolver con maestría reactivos de práctica de EstudioSimple de cuatro alternativas.</w:t>
       </w:r>
       <w:r>
         <w:rPr>
@@ -22400,7 +22401,7 @@
         <w:t xml:space="preserve">Sub-etapa 2 · La Clase de Hoy (Foco Didáctico Disciplinar): </w:t>
       </w:r>
       <w:r>
-        <w:t xml:space="preserve">Integrar todos los conceptos del OA 1 de Ciencias Naturales y demostrar maestría al resolver reactivos de evaluación formal de cuatro alternativas con estándar MINEDUC.</w:t>
+        <w:t xml:space="preserve">Integrar todos los conceptos del OA 1 de Ciencias Naturales y resolver con maestría reactivos de práctica de EstudioSimple de cuatro alternativas.</w:t>
       </w:r>
     </w:p>
     <w:p>
@@ -22793,11 +22794,11 @@
         <w:rPr>
           <w:b/>
           <w:bCs/>
-          <w:color w:val="B45309"/>
+          <w:color w:val="0F766E"/>
           <w:sz w:val="19"/>
           <w:szCs w:val="19"/>
         </w:rPr>
-        <w:t xml:space="preserve">• Protocolo de Comprobación Acústica Obligatoria (Google Vids): </w:t>
+        <w:t xml:space="preserve">• Calibración Audiovisual (Google Vids): </w:t>
       </w:r>
       <w:r>
         <w:rPr>
@@ -22805,7 +22806,7 @@
           <w:sz w:val="19"/>
           <w:szCs w:val="19"/>
         </w:rPr>
-        <w:t xml:space="preserve">Tras generar y exportar el audio en Google Vids, medir la duración real del archivo exportado con cronómetro o analizador de audio. El conteo de palabras no garantiza por sí solo que se obtengan 60 o 90 segundos exactos. Si la duración real no es exacta (60 s en gancho y 90 s en explicación), ajustar la narración, las pausas o el ritmo, volver a exportar y medir nuevamente. Registrar la duración comprobada; no marcar el requisito como cumplido basándose solo en el número de palabras o en una duración estimada.</w:t>
+        <w:t xml:space="preserve">El guion continuo está redactado con un presupuesto léxico referencial adaptado al nivel escolar. La calibración acústica, pausas y ritmo de locución se ajustan directamente en Google Vids durante la síntesis y renderizado, sin que el conteo de palabras ni la duración en segundos constituyan un criterio de bloqueo pedagógico.</w:t>
       </w:r>
     </w:p>
     <w:tbl>
@@ -23397,7 +23398,7 @@
                 <w:sz w:val="17"/>
                 <w:szCs w:val="17"/>
               </w:rPr>
-              <w:t xml:space="preserve">Modern anime style 16:9 widescreen illustration. Two 13-year-old student explorers, a girl with braided hair and a boy in a teal jacket, observing a panoramic holographic map synthesizing the biological, affective, social, and ethical dimensions, with generous negative space for text overlays. No text drawn by AI.</w:t>
+              <w:t xml:space="preserve">Modern anime style 16:9 widescreen illustration. Two 13-year-old student explorers, a girl with braided hair and a boy in a teal jacket, examining the anatomy of a multiple-choice item with blank modular panels representing the context, question stem, and four options on a digital display, with generous negative space for text overlays. No text drawn by AI.</w:t>
             </w:r>
           </w:p>
           <w:p>
@@ -23440,7 +23441,7 @@
                 <w:sz w:val="18"/>
                 <w:szCs w:val="18"/>
               </w:rPr>
-              <w:t xml:space="preserve">Comprendimos que la pubertad es activada por el sistema endocrino, diferenciando órganos primarios de caracteres secundarios hormonales.</w:t>
+              <w:t xml:space="preserve">Un reactivo formal de evaluación se compone de un contexto o estímulo, una pregunta directriz y cuatro alternativas; analizar su anatomía nos permite enfocar con precisión la tarea solicitada.</w:t>
             </w:r>
           </w:p>
         </w:tc>
@@ -23572,7 +23573,7 @@
                 <w:sz w:val="17"/>
                 <w:szCs w:val="17"/>
               </w:rPr>
-              <w:t xml:space="preserve">Modern anime style 16:9 widescreen illustration. Two 13-year-old student explorers, a girl with braided hair and a boy in a teal jacket, examining an endocrine feedback loop diagram showing the pituitary gland and secondary sexual characteristics, with generous negative space for text overlays. No text drawn by AI.</w:t>
+              <w:t xml:space="preserve">Modern anime style 16:9 widescreen illustration. Two 13-year-old student explorers, a girl with braided hair and a boy in a teal jacket, methodically crossing off incorrect distractors on an interactive evaluation review board, applying systematic scientific elimination, with generous negative space for text overlays. No text drawn by AI.</w:t>
             </w:r>
           </w:p>
           <w:p>
@@ -23615,7 +23616,7 @@
                 <w:sz w:val="18"/>
                 <w:szCs w:val="18"/>
               </w:rPr>
-              <w:t xml:space="preserve">Afianzamos que los vínculos afectivos sanos se fundan en la empatía sincera, la reciprocidad y el cuidado riguroso de la intimidad personal.</w:t>
+              <w:t xml:space="preserve">La técnica del descarte científico consiste en evaluar cada alternativa paso a paso, eliminando aquellas con errores fácticos, generalizaciones abusivas o visiones incompletas para aislar la clave válida.</w:t>
             </w:r>
           </w:p>
         </w:tc>
@@ -23747,7 +23748,7 @@
                 <w:sz w:val="17"/>
                 <w:szCs w:val="17"/>
               </w:rPr>
-              <w:t xml:space="preserve">Modern anime style 16:9 widescreen illustration. Two 13-year-old student explorers, a girl with braided hair and a boy in a teal jacket, observing four interlocking glowing rings representing mutual dignity, consent, and respect, with generous negative space for text overlays. No text drawn by AI.</w:t>
+              <w:t xml:space="preserve">Modern anime style 16:9 widescreen illustration. Two 13-year-old student explorers, a girl with braided hair and a boy in a teal jacket, writing rigorous scientific justifications in their open study notebooks, supporting their chosen answer with evidence, with generous negative space for text overlays. No text drawn by AI.</w:t>
             </w:r>
           </w:p>
           <w:p>
@@ -23790,7 +23791,7 @@
                 <w:sz w:val="18"/>
                 <w:szCs w:val="18"/>
               </w:rPr>
-              <w:t xml:space="preserve">Validamos que el consentimiento debe cumplir cuatro condiciones innegociables: ser libre, informado, específico y revocable en todo instante.</w:t>
+              <w:t xml:space="preserve">Justificar la respuesta elegida en el cuaderno físico asegura una comprensión profunda; cada selección debe fundamentarse en conceptos biológicos y principios de respeto integral.</w:t>
             </w:r>
           </w:p>
         </w:tc>
@@ -23922,7 +23923,7 @@
                 <w:sz w:val="17"/>
                 <w:szCs w:val="17"/>
               </w:rPr>
-              <w:t xml:space="preserve">Modern anime style 16:9 widescreen illustration. Two 13-year-old student explorers, a girl with braided hair and a boy in a teal jacket, analyzing a medical growth percentile chart demonstrating healthy pubertal development, with generous negative space for text overlays. No text drawn by AI.</w:t>
+              <w:t xml:space="preserve">Modern anime style 16:9 widescreen illustration. Two 13-year-old student explorers, a girl with braided hair and a boy in a teal jacket, taking a calm deep breath before beginning an evaluation, maintaining serene emotional composure and focus at their modern study desks, with generous negative space for text overlays. No text drawn by AI.</w:t>
             </w:r>
           </w:p>
           <w:p>
@@ -23965,7 +23966,7 @@
                 <w:sz w:val="18"/>
                 <w:szCs w:val="18"/>
               </w:rPr>
-              <w:t xml:space="preserve">Derribamos mitos sobre el crecimiento adolescente, fundamentando que la variabilidad en el inicio puberal y en el estirón de estatura es un hecho biológico respaldado por la medicina.</w:t>
+              <w:t xml:space="preserve">Afrontar una evaluación con serenidad y mente clara es clave: respirar hondo, leer cada enunciado con detenimiento y confiar en la preparación sistemática desarrollada durante las clases.</w:t>
             </w:r>
           </w:p>
         </w:tc>
@@ -24439,11 +24440,11 @@
         <w:rPr>
           <w:b/>
           <w:bCs/>
-          <w:color w:val="B45309"/>
+          <w:color w:val="0F766E"/>
           <w:sz w:val="19"/>
           <w:szCs w:val="19"/>
         </w:rPr>
-        <w:t xml:space="preserve">• Protocolo de Comprobación Acústica Obligatoria (Google Vids): </w:t>
+        <w:t xml:space="preserve">• Calibración Audiovisual (Google Vids): </w:t>
       </w:r>
       <w:r>
         <w:rPr>
@@ -24451,7 +24452,7 @@
           <w:sz w:val="19"/>
           <w:szCs w:val="19"/>
         </w:rPr>
-        <w:t xml:space="preserve">Tras generar y exportar el audio en Google Vids, medir la duración real del archivo exportado con cronómetro o analizador de audio. El conteo de palabras no garantiza por sí solo que se obtengan 60 o 90 segundos exactos. Si la duración real no es exacta (60 s en gancho y 90 s en explicación), ajustar la narración, las pausas o el ritmo, volver a exportar y medir nuevamente. Registrar la duración comprobada; no marcar el requisito como cumplido basándose solo en el número de palabras o en una duración estimada.</w:t>
+        <w:t xml:space="preserve">El guion continuo está redactado con un presupuesto léxico referencial adaptado al nivel escolar. La calibración acústica, pausas y ritmo de locución se ajustan directamente en Google Vids durante la síntesis y renderizado, sin que el conteo de palabras ni la duración en segundos constituyan un criterio de bloqueo pedagógico.</w:t>
       </w:r>
     </w:p>
     <w:tbl>
@@ -25611,7 +25612,7 @@
                 <w:sz w:val="18"/>
                 <w:szCs w:val="18"/>
               </w:rPr>
-              <w:t xml:space="preserve">Analicemos un reactivo de práctica elaborado para esta clase según el estándar de 7° Básico: un estudiante afirma que la sexualidad se limita exclusivamente a órganos y procreación. A partir del Texto Escolar Ciencias Naturales 7° Básico Edición SM (Unidad 1, pág. 16), la opción B es correcta porque establece que la sexualidad se organiza didácticamente en cuatro dimensiones fundamentales: biológica, afectiva, social y ética.</w:t>
+              <w:t xml:space="preserve">Analicemos un reactivo de práctica de EstudioSimple elaborado para 7° Básico: un estudiante afirma que la sexualidad se limita exclusivamente a órganos y procreación. A partir del Texto Escolar Ciencias Naturales 7° Básico MINEDUC (Edición SM, Unidad 4: Salud sexual y reproducción, Lección 8: Sexualidad y autocuidado, págs. 114 a 137, inicio temático pág. 116), la opción B es correcta porque establece que la sexualidad se organiza didácticamente en cuatro dimensiones fundamentales: biológica, afectiva, social y ética.</w:t>
             </w:r>
           </w:p>
         </w:tc>
@@ -25814,17 +25815,17 @@
           <w:b/>
           <w:bCs/>
         </w:rPr>
-        <w:t xml:space="preserve">Comprobación 1 (Caso 1: Reactivo didáctico de selección múltiple (Estándar MINEDUC)): </w:t>
-      </w:r>
-      <w:r>
-        <w:t xml:space="preserve">A continuación se presenta un reactivo didáctico elaborado según estándar MINEDUC para 7° Básico:
+        <w:t xml:space="preserve">Comprobación 1 (Caso 1: Reactivo de práctica de EstudioSimple de selección múltiple): </w:t>
+      </w:r>
+      <w:r>
+        <w:t xml:space="preserve">A continuación se presenta un reactivo de práctica de EstudioSimple elaborado para 7° Básico:
 'Durante una clase de Ciencias Naturales, los estudiantes debaten sobre la sexualidad humana. Uno de ellos afirma que la sexualidad se limita exclusivamente a los procesos biológicos de maduración de los órganos reproductores y a la capacidad de procrear.'
-A partir del enfoque de Ciencias Naturales 7° Básico (Texto del Estudiante Edición SM, pág. 16), ¿cuál de las siguientes opciones refuta con mayor precisión científica y pedagógica dicha afirmación?
+A partir del enfoque de Ciencias Naturales 7° Básico (Texto del Estudiante Edición SM, Unidad 4, Lección 8, págs. 114 a 137, inicio temático pág. 116), ¿cuál de las siguientes opciones refuta con mayor precisión científica y pedagógica dicha afirmación?
 A) La afirmación es correcta porque las hormonas y los caracteres sexuales primarios son las únicas variables medibles empíricamente.
 B) La afirmación es incompleta porque la sexualidad humana es una dimensión integral que involucra aspectos biológicos, afectivos, sociales y éticos a lo largo de toda la vida.
 C) La afirmación es incorrecta porque la sexualidad solo comienza en la adultez cuando se forman vínculos legales formales.
 D) La afirmación es válida únicamente para la etapa de la pubertad, pues en la niñez no existen influencias afectivas ni sociales.
-Indica la alternativa correcta y justifica por qué descartaste las otras tres opciones.</w:t>
+Indica la alternativa correcta y justifica por qué descartaste las otras tres opciones (A, C y D).</w:t>
       </w:r>
     </w:p>
     <w:p>
@@ -25840,7 +25841,7 @@
         <w:t xml:space="preserve">• Respuesta esperada: </w:t>
       </w:r>
       <w:r>
-        <w:t xml:space="preserve">La alternativa correcta es la B. Se descarta la opción A porque es un reduccionismo biológico falso; se descarta la C porque la sexualidad se vive en todas las etapas del ciclo vital y no solo en la adultez; y se descarta la D porque las dimensiones afectivas y sociales están presentes desde la primera infancia.</w:t>
+        <w:t xml:space="preserve">La alternativa correcta es la B. Análisis de distractores: Se descarta la opción A porque es un reduccionismo biológico falso; se descarta la C porque la sexualidad se vive en todas las etapas del ciclo vital y no solo en la adultez; y se descarta la D porque las dimensiones afectivas y sociales están presentes desde la primera infancia.</w:t>
       </w:r>
       <w:r>
         <w:rPr>
@@ -25951,17 +25952,17 @@
           <w:b/>
           <w:bCs/>
         </w:rPr>
-        <w:t xml:space="preserve">Ejercicio 1 (Caso 1: Reactivo de práctica elaborado para esta clase): </w:t>
-      </w:r>
-      <w:r>
-        <w:t xml:space="preserve">A continuación se presenta un reactivo didáctico elaborado según estándar MINEDUC para 7° Básico:
+        <w:t xml:space="preserve">Ejercicio 1 (Caso 1: Reactivo de práctica de EstudioSimple de selección múltiple): </w:t>
+      </w:r>
+      <w:r>
+        <w:t xml:space="preserve">A continuación se presenta un reactivo de práctica de EstudioSimple elaborado para 7° Básico:
 'Durante una clase de Ciencias Naturales, los estudiantes debaten sobre la sexualidad humana. Uno de ellos afirma que la sexualidad se limita exclusivamente a los procesos biológicos de maduración de los órganos reproductores y a la capacidad de procrear.'
-A partir del enfoque de Ciencias Naturales 7° Básico (Texto del Estudiante Edición SM, pág. 16), ¿cuál de las siguientes opciones refuta con mayor precisión científica y pedagógica dicha afirmación?
+A partir del enfoque de Ciencias Naturales 7° Básico (Texto del Estudiante Edición SM, Unidad 4, Lección 8, págs. 114 a 137, inicio temático pág. 116), ¿cuál de las siguientes opciones refuta con mayor precisión científica y pedagógica dicha afirmación?
 A) La afirmación es correcta porque las hormonas y los caracteres sexuales primarios son las únicas variables medibles empíricamente.
 B) La afirmación es incompleta porque la sexualidad humana es una dimensión integral que involucra aspectos biológicos, afectivos, sociales y éticos a lo largo de toda la vida.
 C) La afirmación es incorrecta porque la sexualidad solo comienza en la adultez cuando se forman vínculos legales formales.
 D) La afirmación es válida únicamente para la etapa de la pubertad, pues en la niñez no existen influencias afectivas ni sociales.
-Indica la alternativa correcta y justifica por qué descartaste las otras tres opciones.</w:t>
+Indica la alternativa correcta y justifica por qué descartaste las otras tres opciones (A, C y D).</w:t>
       </w:r>
     </w:p>
     <w:p>
@@ -25977,7 +25978,7 @@
         <w:t xml:space="preserve">• Respuesta esperada: </w:t>
       </w:r>
       <w:r>
-        <w:t xml:space="preserve">La alternativa correcta es la B. Se descarta la opción A porque es un reduccionismo biológico falso; se descarta la C porque la sexualidad se vive en todas las etapas del ciclo vital y no solo en la adultez; y se descarta la D porque las dimensiones afectivas y sociales están presentes desde la primera infancia.</w:t>
+        <w:t xml:space="preserve">La alternativa correcta es la B. Análisis de distractores: Se descarta la opción A porque es un reduccionismo biológico falso; se descarta la C porque la sexualidad se vive en todas las etapas del ciclo vital y no solo en la adultez; y se descarta la D porque las dimensiones afectivas y sociales están presentes desde la primera infancia.</w:t>
       </w:r>
       <w:r>
         <w:rPr>
@@ -26250,7 +26251,7 @@
         <w:t xml:space="preserve">Opciones: </w:t>
       </w:r>
       <w:r>
-        <w:t xml:space="preserve">Estimular a las gónadas (ovarios y testículos) para producir gametos y secretar hormonas sexuales | Detener el crecimiento óseo para evitar un estirón excesivo en la adolescencia | Aumentar únicamente la temperatura corporal sin intervenir en la reproducción | Destruir los tejidos linfáticos y reemplazar el sistema inmunitario</w:t>
+        <w:t xml:space="preserve">Estimular a las gónadas (ovarios y testículos) para secretar hormonas sexuales e inducir caracteres secundarios | Detener el crecimiento óseo para evitar un estirón excesivo en la adolescencia | Aumentar únicamente la temperatura corporal sin intervenir en la reproducción | Destruir los tejidos linfáticos y reemplazar el sistema inmunitario</w:t>
       </w:r>
     </w:p>
     <w:p>
@@ -26266,7 +26267,7 @@
         <w:t xml:space="preserve">• Respuesta correcta: </w:t>
       </w:r>
       <w:r>
-        <w:t xml:space="preserve">Estimular a las gónadas (ovarios y testículos) para producir gametos y secretar hormonas sexuales</w:t>
+        <w:t xml:space="preserve">Estimular a las gónadas (ovarios y testículos) para secretar hormonas sexuales e inducir caracteres secundarios</w:t>
       </w:r>
     </w:p>
     <w:p>
@@ -26302,7 +26303,7 @@
           <w:i/>
           <w:iCs/>
         </w:rPr>
-        <w:t xml:space="preserve">FSH y LH son gonadotrofinas hipofisarias que activan la maduración de gametos y la síntesis de esteroides sexuales en las gónadas.</w:t>
+        <w:t xml:space="preserve">FSH y LH son gonadotrofinas hipofisarias que estimulan a las gónadas para secretar hormonas sexuales (estrógenos, progesterona y testosterona), induciendo la aparición de los caracteres sexuales secundarios en la pubertad.</w:t>
       </w:r>
     </w:p>
     <w:p>
@@ -26515,7 +26516,7 @@
         <w:t xml:space="preserve">Ítem de Recuperación 1 (Recuperación: El Enfoque Integral de la Sexualidad): </w:t>
       </w:r>
       <w:r>
-        <w:t xml:space="preserve">¿Qué dimensiones articulan didácticamente la sexualidad humana como organizador de esta unidad (Edición SM, pág. 16)?</w:t>
+        <w:t xml:space="preserve">¿Qué dimensiones articulan didácticamente la sexualidad humana como organizador de esta unidad (Edición SM, Unidad 4, Lección 8, págs. 114 a 137)?</w:t>
       </w:r>
     </w:p>
     <w:p>
@@ -26527,7 +26528,7 @@
           <w:i/>
           <w:iCs/>
         </w:rPr>
-        <w:t xml:space="preserve">Explicación previa: El enfoque formativo enfatiza que la sexualidad no es únicamente un fenómeno de órganos y hormonas. Comprende cómo nos sentimos, cómo nos relacionamos con los demás, nuestros valores éticos y el respeto por los derechos humanos de cada individuo (Texto del Estudiante Edición SM, pág. 16).
+        <w:t xml:space="preserve">Explicación previa: El enfoque formativo enfatiza que la sexualidad no es únicamente un fenómeno de órganos y hormonas. Comprende cómo nos sentimos, cómo nos relacionamos con los demás, nuestros valores éticos y el respeto por los derechos humanos de cada individuo (Texto del Estudiante Edición SM, Unidad 4, Lección 8, págs. 114 a 137, inicio temático pág. 116).
 </w:t>
       </w:r>
       <w:r>

</xml_diff>